<commit_message>
Partie 2 (Scraping) validee : 8 sources, schemas et exemple de filtrage
- Corrige le comptage des sources de scraping (8 sources d'origine,
  CGA/FTUSA alimentant chacune 2 circuits, plutot que 10 flux distincts)
- Ajoute 2 schemas generes (docs/diagrams/) : architecture generale du
  scraping (methodes par source + chaine commune de traitement) et un
  exemple concret de filtrage (cas CMF)
- Integre les schemas dans la fiche Markdown et regenere le Word
  correspondant avec les images incluses
- Met a jour le plan de progression (Scraping : Explique)

Co-Authored-By: Claude Sonnet 5 <noreply@anthropic.com>
</commit_message>
<xml_diff>
--- a/docs/Fiche_Technique_Barometre_Assurance.docx
+++ b/docs/Fiche_Technique_Barometre_Assurance.docx
@@ -444,7 +444,7 @@
           <w:b/>
           <w:bCs/>
         </w:rPr>
-        <w:t xml:space="preserve">6 sources de collecte "documents", pas 5</w:t>
+        <w:t xml:space="preserve">8 sources d'origine, pas 5</w:t>
       </w:r>
       <w:r>
         <w:t xml:space="preserve"> : CMF, FTUSA, CGA, BVMT, INS, </w:t>
@@ -454,39 +454,10 @@
           <w:b/>
           <w:bCs/>
         </w:rPr>
-        <w:t xml:space="preserve">+ ENQUETE</w:t>
-      </w:r>
-      <w:r>
-        <w:t xml:space="preserve"> (données d'enquête Excel, </w:t>
-      </w:r>
-      <w:r>
-        <w:rPr>
-          <w:rFonts w:ascii="Consolas" w:cs="Consolas" w:eastAsia="Consolas" w:hAnsi="Consolas"/>
-          <w:sz w:val="20"/>
-          <w:szCs w:val="20"/>
-        </w:rPr>
-        <w:t xml:space="preserve">get_or_create_source(conn, "ENQUETE", ...)</w:t>
-      </w:r>
-      <w:r>
-        <w:t xml:space="preserve">).</w:t>
-      </w:r>
-    </w:p>
-    <w:p>
-      <w:pPr>
-        <w:spacing w:after="140"/>
-      </w:pPr>
-      <w:r>
-        <w:t xml:space="preserve">5. </w:t>
-      </w:r>
-      <w:r>
-        <w:rPr>
-          <w:b/>
-          <w:bCs/>
-        </w:rPr>
-        <w:t xml:space="preserve">+ 4 flux de "veille"</w:t>
-      </w:r>
-      <w:r>
-        <w:t xml:space="preserve"> distincts, dans un mécanisme séparé (pas dans </w:t>
+        <w:t xml:space="preserve">Atlas Magazine, IlBoursa, ENQUETE</w:t>
+      </w:r>
+      <w:r>
+        <w:t xml:space="preserve">. CGA et FTUSA alimentent chacune deux circuits différents (rapports KPI dans </w:t>
       </w:r>
       <w:r>
         <w:rPr>
@@ -508,7 +479,17 @@
         <w:t xml:space="preserve">kpi_values</w:t>
       </w:r>
       <w:r>
-        <w:t xml:space="preserve"> mais dans </w:t>
+        <w:t xml:space="preserve"> </w:t>
+      </w:r>
+      <w:r>
+        <w:rPr>
+          <w:b/>
+          <w:bCs/>
+        </w:rPr>
+        <w:t xml:space="preserve">et</w:t>
+      </w:r>
+      <w:r>
+        <w:t xml:space="preserve"> textes réglementaires dans </w:t>
       </w:r>
       <w:r>
         <w:rPr>
@@ -530,57 +511,18 @@
         <w:t xml:space="preserve">reglementation_vues</w:t>
       </w:r>
       <w:r>
-        <w:t xml:space="preserve">) : </w:t>
-      </w:r>
-      <w:r>
-        <w:rPr>
-          <w:b/>
-          <w:bCs/>
-        </w:rPr>
-        <w:t xml:space="preserve">IlBoursa</w:t>
-      </w:r>
-      <w:r>
-        <w:t xml:space="preserve">, </w:t>
-      </w:r>
-      <w:r>
-        <w:rPr>
-          <w:b/>
-          <w:bCs/>
-        </w:rPr>
-        <w:t xml:space="preserve">Atlas Magazine</w:t>
-      </w:r>
-      <w:r>
-        <w:t xml:space="preserve"> (actualités), </w:t>
-      </w:r>
-      <w:r>
-        <w:rPr>
-          <w:b/>
-          <w:bCs/>
-        </w:rPr>
-        <w:t xml:space="preserve">CGA</w:t>
-      </w:r>
-      <w:r>
-        <w:t xml:space="preserve"> et </w:t>
-      </w:r>
-      <w:r>
-        <w:rPr>
-          <w:b/>
-          <w:bCs/>
-        </w:rPr>
-        <w:t xml:space="preserve">FTUSA</w:t>
-      </w:r>
-      <w:r>
-        <w:t xml:space="preserve"> en version "textes réglementaires" (lois/décrets/circulaires — distinct de leurs rapports KPI). Ces 4 flux ne vivent </w:t>
-      </w:r>
-      <w:r>
-        <w:rPr>
-          <w:b/>
-          <w:bCs/>
-        </w:rPr>
-        <w:t xml:space="preserve">pas</w:t>
-      </w:r>
-      <w:r>
-        <w:t xml:space="preserve"> dans </w:t>
+        <w:t xml:space="preserve">, ce second circuit vivant dans </w:t>
+      </w:r>
+      <w:r>
+        <w:rPr>
+          <w:rFonts w:ascii="Consolas" w:cs="Consolas" w:eastAsia="Consolas" w:hAnsi="Consolas"/>
+          <w:sz w:val="20"/>
+          <w:szCs w:val="20"/>
+        </w:rPr>
+        <w:t xml:space="preserve">api/routes/veille.py</w:t>
+      </w:r>
+      <w:r>
+        <w:t xml:space="preserve">, pas dans </w:t>
       </w:r>
       <w:r>
         <w:rPr>
@@ -591,18 +533,7 @@
         <w:t xml:space="preserve">scraping/</w:t>
       </w:r>
       <w:r>
-        <w:t xml:space="preserve"> mais dans </w:t>
-      </w:r>
-      <w:r>
-        <w:rPr>
-          <w:rFonts w:ascii="Consolas" w:cs="Consolas" w:eastAsia="Consolas" w:hAnsi="Consolas"/>
-          <w:sz w:val="20"/>
-          <w:szCs w:val="20"/>
-        </w:rPr>
-        <w:t xml:space="preserve">api/routes/veille.py</w:t>
-      </w:r>
-      <w:r>
-        <w:t xml:space="preserve">.</w:t>
+        <w:t xml:space="preserve">) — mais restent une seule source d'origine chacune.</w:t>
       </w:r>
     </w:p>
     <w:p>
@@ -1372,10 +1303,10 @@
         </w:tblBorders>
       </w:tblPr>
       <w:tblGrid>
-        <w:gridCol w:w="960"/>
-        <w:gridCol w:w="2785"/>
-        <w:gridCol w:w="1680"/>
-        <w:gridCol w:w="4321"/>
+        <w:gridCol w:w="847"/>
+        <w:gridCol w:w="3602"/>
+        <w:gridCol w:w="1483"/>
+        <w:gridCol w:w="3814"/>
       </w:tblGrid>
       <w:tr>
         <w:trPr>
@@ -1383,7 +1314,7 @@
         </w:trPr>
         <w:tc>
           <w:tcPr>
-            <w:tcW w:type="dxa" w:w="960"/>
+            <w:tcW w:type="dxa" w:w="847"/>
             <w:shd w:fill="2E2E38" w:color="auto" w:val="clear"/>
             <w:tcMar>
               <w:top w:type="dxa" w:w="60"/>
@@ -1407,7 +1338,7 @@
         </w:tc>
         <w:tc>
           <w:tcPr>
-            <w:tcW w:type="dxa" w:w="2785"/>
+            <w:tcW w:type="dxa" w:w="3602"/>
             <w:shd w:fill="2E2E38" w:color="auto" w:val="clear"/>
             <w:tcMar>
               <w:top w:type="dxa" w:w="60"/>
@@ -1431,7 +1362,7 @@
         </w:tc>
         <w:tc>
           <w:tcPr>
-            <w:tcW w:type="dxa" w:w="1680"/>
+            <w:tcW w:type="dxa" w:w="1483"/>
             <w:shd w:fill="2E2E38" w:color="auto" w:val="clear"/>
             <w:tcMar>
               <w:top w:type="dxa" w:w="60"/>
@@ -1455,7 +1386,7 @@
         </w:tc>
         <w:tc>
           <w:tcPr>
-            <w:tcW w:type="dxa" w:w="4321"/>
+            <w:tcW w:type="dxa" w:w="3814"/>
             <w:shd w:fill="2E2E38" w:color="auto" w:val="clear"/>
             <w:tcMar>
               <w:top w:type="dxa" w:w="60"/>
@@ -1481,7 +1412,7 @@
       <w:tr>
         <w:tc>
           <w:tcPr>
-            <w:tcW w:type="dxa" w:w="960"/>
+            <w:tcW w:type="dxa" w:w="847"/>
             <w:tcMar>
               <w:top w:type="dxa" w:w="50"/>
               <w:left w:type="dxa" w:w="100"/>
@@ -1501,7 +1432,7 @@
         </w:tc>
         <w:tc>
           <w:tcPr>
-            <w:tcW w:type="dxa" w:w="2785"/>
+            <w:tcW w:type="dxa" w:w="3602"/>
             <w:tcMar>
               <w:top w:type="dxa" w:w="50"/>
               <w:left w:type="dxa" w:w="100"/>
@@ -1521,7 +1452,7 @@
         </w:tc>
         <w:tc>
           <w:tcPr>
-            <w:tcW w:type="dxa" w:w="1680"/>
+            <w:tcW w:type="dxa" w:w="1483"/>
             <w:tcMar>
               <w:top w:type="dxa" w:w="50"/>
               <w:left w:type="dxa" w:w="100"/>
@@ -1542,7 +1473,7 @@
         </w:tc>
         <w:tc>
           <w:tcPr>
-            <w:tcW w:type="dxa" w:w="4321"/>
+            <w:tcW w:type="dxa" w:w="3814"/>
             <w:tcMar>
               <w:top w:type="dxa" w:w="50"/>
               <w:left w:type="dxa" w:w="100"/>
@@ -1564,7 +1495,7 @@
       <w:tr>
         <w:tc>
           <w:tcPr>
-            <w:tcW w:type="dxa" w:w="960"/>
+            <w:tcW w:type="dxa" w:w="847"/>
             <w:tcMar>
               <w:top w:type="dxa" w:w="50"/>
               <w:left w:type="dxa" w:w="100"/>
@@ -1584,7 +1515,7 @@
         </w:tc>
         <w:tc>
           <w:tcPr>
-            <w:tcW w:type="dxa" w:w="2785"/>
+            <w:tcW w:type="dxa" w:w="3602"/>
             <w:tcMar>
               <w:top w:type="dxa" w:w="50"/>
               <w:left w:type="dxa" w:w="100"/>
@@ -1604,7 +1535,7 @@
         </w:tc>
         <w:tc>
           <w:tcPr>
-            <w:tcW w:type="dxa" w:w="1680"/>
+            <w:tcW w:type="dxa" w:w="1483"/>
             <w:tcMar>
               <w:top w:type="dxa" w:w="50"/>
               <w:left w:type="dxa" w:w="100"/>
@@ -1625,7 +1556,7 @@
         </w:tc>
         <w:tc>
           <w:tcPr>
-            <w:tcW w:type="dxa" w:w="4321"/>
+            <w:tcW w:type="dxa" w:w="3814"/>
             <w:tcMar>
               <w:top w:type="dxa" w:w="50"/>
               <w:left w:type="dxa" w:w="100"/>
@@ -1678,7 +1609,7 @@
       <w:tr>
         <w:tc>
           <w:tcPr>
-            <w:tcW w:type="dxa" w:w="960"/>
+            <w:tcW w:type="dxa" w:w="847"/>
             <w:tcMar>
               <w:top w:type="dxa" w:w="50"/>
               <w:left w:type="dxa" w:w="100"/>
@@ -1698,7 +1629,7 @@
         </w:tc>
         <w:tc>
           <w:tcPr>
-            <w:tcW w:type="dxa" w:w="2785"/>
+            <w:tcW w:type="dxa" w:w="3602"/>
             <w:tcMar>
               <w:top w:type="dxa" w:w="50"/>
               <w:left w:type="dxa" w:w="100"/>
@@ -1726,7 +1657,7 @@
         </w:tc>
         <w:tc>
           <w:tcPr>
-            <w:tcW w:type="dxa" w:w="1680"/>
+            <w:tcW w:type="dxa" w:w="1483"/>
             <w:tcMar>
               <w:top w:type="dxa" w:w="50"/>
               <w:left w:type="dxa" w:w="100"/>
@@ -1746,7 +1677,7 @@
         </w:tc>
         <w:tc>
           <w:tcPr>
-            <w:tcW w:type="dxa" w:w="4321"/>
+            <w:tcW w:type="dxa" w:w="3814"/>
             <w:tcMar>
               <w:top w:type="dxa" w:w="50"/>
               <w:left w:type="dxa" w:w="100"/>
@@ -1798,7 +1729,7 @@
       <w:tr>
         <w:tc>
           <w:tcPr>
-            <w:tcW w:type="dxa" w:w="960"/>
+            <w:tcW w:type="dxa" w:w="847"/>
             <w:tcMar>
               <w:top w:type="dxa" w:w="50"/>
               <w:left w:type="dxa" w:w="100"/>
@@ -1818,7 +1749,7 @@
         </w:tc>
         <w:tc>
           <w:tcPr>
-            <w:tcW w:type="dxa" w:w="2785"/>
+            <w:tcW w:type="dxa" w:w="3602"/>
             <w:tcMar>
               <w:top w:type="dxa" w:w="50"/>
               <w:left w:type="dxa" w:w="100"/>
@@ -1855,13 +1786,13 @@
                 <w:sz w:val="19"/>
                 <w:szCs w:val="19"/>
               </w:rPr>
-              <w:t xml:space="preserve"> + regex (FTUSA/CGA/BVMT/INS)</w:t>
-            </w:r>
-          </w:p>
-        </w:tc>
-        <w:tc>
-          <w:tcPr>
-            <w:tcW w:type="dxa" w:w="1680"/>
+              <w:t xml:space="preserve">+regex (FTUSA, CGA, BVMT, INS, Atlas Magazine, IlBoursa)</w:t>
+            </w:r>
+          </w:p>
+        </w:tc>
+        <w:tc>
+          <w:tcPr>
+            <w:tcW w:type="dxa" w:w="1483"/>
             <w:tcMar>
               <w:top w:type="dxa" w:w="50"/>
               <w:left w:type="dxa" w:w="100"/>
@@ -1881,7 +1812,7 @@
         </w:tc>
         <w:tc>
           <w:tcPr>
-            <w:tcW w:type="dxa" w:w="4321"/>
+            <w:tcW w:type="dxa" w:w="3814"/>
             <w:tcMar>
               <w:top w:type="dxa" w:w="50"/>
               <w:left w:type="dxa" w:w="100"/>
@@ -1926,7 +1857,7 @@
                 <w:sz w:val="19"/>
                 <w:szCs w:val="19"/>
               </w:rPr>
-              <w:t xml:space="preserve"> partout ailleurs, plus rapide et plus simple à maintenir</w:t>
+              <w:t xml:space="preserve"> partout ailleurs, plus rapide et plus simple à maintenir (détail Partie 3)</w:t>
             </w:r>
           </w:p>
         </w:tc>
@@ -1934,7 +1865,7 @@
       <w:tr>
         <w:tc>
           <w:tcPr>
-            <w:tcW w:type="dxa" w:w="960"/>
+            <w:tcW w:type="dxa" w:w="847"/>
             <w:tcMar>
               <w:top w:type="dxa" w:w="50"/>
               <w:left w:type="dxa" w:w="100"/>
@@ -1954,7 +1885,7 @@
         </w:tc>
         <w:tc>
           <w:tcPr>
-            <w:tcW w:type="dxa" w:w="2785"/>
+            <w:tcW w:type="dxa" w:w="3602"/>
             <w:tcMar>
               <w:top w:type="dxa" w:w="50"/>
               <w:left w:type="dxa" w:w="100"/>
@@ -1975,7 +1906,7 @@
         </w:tc>
         <w:tc>
           <w:tcPr>
-            <w:tcW w:type="dxa" w:w="1680"/>
+            <w:tcW w:type="dxa" w:w="1483"/>
             <w:tcMar>
               <w:top w:type="dxa" w:w="50"/>
               <w:left w:type="dxa" w:w="100"/>
@@ -1995,7 +1926,7 @@
         </w:tc>
         <w:tc>
           <w:tcPr>
-            <w:tcW w:type="dxa" w:w="4321"/>
+            <w:tcW w:type="dxa" w:w="3814"/>
             <w:tcMar>
               <w:top w:type="dxa" w:w="50"/>
               <w:left w:type="dxa" w:w="100"/>
@@ -2063,7 +1994,7 @@
       <w:tr>
         <w:tc>
           <w:tcPr>
-            <w:tcW w:type="dxa" w:w="960"/>
+            <w:tcW w:type="dxa" w:w="847"/>
             <w:tcMar>
               <w:top w:type="dxa" w:w="50"/>
               <w:left w:type="dxa" w:w="100"/>
@@ -2083,7 +2014,7 @@
         </w:tc>
         <w:tc>
           <w:tcPr>
-            <w:tcW w:type="dxa" w:w="2785"/>
+            <w:tcW w:type="dxa" w:w="3602"/>
             <w:tcMar>
               <w:top w:type="dxa" w:w="50"/>
               <w:left w:type="dxa" w:w="100"/>
@@ -2118,7 +2049,7 @@
         </w:tc>
         <w:tc>
           <w:tcPr>
-            <w:tcW w:type="dxa" w:w="1680"/>
+            <w:tcW w:type="dxa" w:w="1483"/>
             <w:tcMar>
               <w:top w:type="dxa" w:w="50"/>
               <w:left w:type="dxa" w:w="100"/>
@@ -2176,7 +2107,7 @@
         </w:tc>
         <w:tc>
           <w:tcPr>
-            <w:tcW w:type="dxa" w:w="4321"/>
+            <w:tcW w:type="dxa" w:w="3814"/>
             <w:tcMar>
               <w:top w:type="dxa" w:w="50"/>
               <w:left w:type="dxa" w:w="100"/>
@@ -2214,7 +2145,7 @@
       <w:tr>
         <w:tc>
           <w:tcPr>
-            <w:tcW w:type="dxa" w:w="960"/>
+            <w:tcW w:type="dxa" w:w="847"/>
             <w:tcMar>
               <w:top w:type="dxa" w:w="50"/>
               <w:left w:type="dxa" w:w="100"/>
@@ -2234,7 +2165,7 @@
         </w:tc>
         <w:tc>
           <w:tcPr>
-            <w:tcW w:type="dxa" w:w="2785"/>
+            <w:tcW w:type="dxa" w:w="3602"/>
             <w:tcMar>
               <w:top w:type="dxa" w:w="50"/>
               <w:left w:type="dxa" w:w="100"/>
@@ -2255,7 +2186,7 @@
         </w:tc>
         <w:tc>
           <w:tcPr>
-            <w:tcW w:type="dxa" w:w="1680"/>
+            <w:tcW w:type="dxa" w:w="1483"/>
             <w:tcMar>
               <w:top w:type="dxa" w:w="50"/>
               <w:left w:type="dxa" w:w="100"/>
@@ -2275,7 +2206,7 @@
         </w:tc>
         <w:tc>
           <w:tcPr>
-            <w:tcW w:type="dxa" w:w="4321"/>
+            <w:tcW w:type="dxa" w:w="3814"/>
             <w:tcMar>
               <w:top w:type="dxa" w:w="50"/>
               <w:left w:type="dxa" w:w="100"/>
@@ -2312,7 +2243,7 @@
       <w:tr>
         <w:tc>
           <w:tcPr>
-            <w:tcW w:type="dxa" w:w="960"/>
+            <w:tcW w:type="dxa" w:w="847"/>
             <w:tcMar>
               <w:top w:type="dxa" w:w="50"/>
               <w:left w:type="dxa" w:w="100"/>
@@ -2332,7 +2263,7 @@
         </w:tc>
         <w:tc>
           <w:tcPr>
-            <w:tcW w:type="dxa" w:w="2785"/>
+            <w:tcW w:type="dxa" w:w="3602"/>
             <w:tcMar>
               <w:top w:type="dxa" w:w="50"/>
               <w:left w:type="dxa" w:w="100"/>
@@ -2375,7 +2306,7 @@
         </w:tc>
         <w:tc>
           <w:tcPr>
-            <w:tcW w:type="dxa" w:w="1680"/>
+            <w:tcW w:type="dxa" w:w="1483"/>
             <w:tcMar>
               <w:top w:type="dxa" w:w="50"/>
               <w:left w:type="dxa" w:w="100"/>
@@ -2395,7 +2326,7 @@
         </w:tc>
         <w:tc>
           <w:tcPr>
-            <w:tcW w:type="dxa" w:w="4321"/>
+            <w:tcW w:type="dxa" w:w="3814"/>
             <w:tcMar>
               <w:top w:type="dxa" w:w="50"/>
               <w:left w:type="dxa" w:w="100"/>
@@ -2417,7 +2348,7 @@
       <w:tr>
         <w:tc>
           <w:tcPr>
-            <w:tcW w:type="dxa" w:w="960"/>
+            <w:tcW w:type="dxa" w:w="847"/>
             <w:tcMar>
               <w:top w:type="dxa" w:w="50"/>
               <w:left w:type="dxa" w:w="100"/>
@@ -2437,7 +2368,7 @@
         </w:tc>
         <w:tc>
           <w:tcPr>
-            <w:tcW w:type="dxa" w:w="2785"/>
+            <w:tcW w:type="dxa" w:w="3602"/>
             <w:tcMar>
               <w:top w:type="dxa" w:w="50"/>
               <w:left w:type="dxa" w:w="100"/>
@@ -2457,7 +2388,7 @@
         </w:tc>
         <w:tc>
           <w:tcPr>
-            <w:tcW w:type="dxa" w:w="1680"/>
+            <w:tcW w:type="dxa" w:w="1483"/>
             <w:tcMar>
               <w:top w:type="dxa" w:w="50"/>
               <w:left w:type="dxa" w:w="100"/>
@@ -2478,7 +2409,7 @@
         </w:tc>
         <w:tc>
           <w:tcPr>
-            <w:tcW w:type="dxa" w:w="4321"/>
+            <w:tcW w:type="dxa" w:w="3814"/>
             <w:tcMar>
               <w:top w:type="dxa" w:w="50"/>
               <w:left w:type="dxa" w:w="100"/>
@@ -2515,7 +2446,7 @@
       <w:tr>
         <w:tc>
           <w:tcPr>
-            <w:tcW w:type="dxa" w:w="960"/>
+            <w:tcW w:type="dxa" w:w="847"/>
             <w:tcMar>
               <w:top w:type="dxa" w:w="50"/>
               <w:left w:type="dxa" w:w="100"/>
@@ -2535,7 +2466,7 @@
         </w:tc>
         <w:tc>
           <w:tcPr>
-            <w:tcW w:type="dxa" w:w="2785"/>
+            <w:tcW w:type="dxa" w:w="3602"/>
             <w:tcMar>
               <w:top w:type="dxa" w:w="50"/>
               <w:left w:type="dxa" w:w="100"/>
@@ -2563,7 +2494,7 @@
         </w:tc>
         <w:tc>
           <w:tcPr>
-            <w:tcW w:type="dxa" w:w="1680"/>
+            <w:tcW w:type="dxa" w:w="1483"/>
             <w:tcMar>
               <w:top w:type="dxa" w:w="50"/>
               <w:left w:type="dxa" w:w="100"/>
@@ -2583,7 +2514,7 @@
         </w:tc>
         <w:tc>
           <w:tcPr>
-            <w:tcW w:type="dxa" w:w="4321"/>
+            <w:tcW w:type="dxa" w:w="3814"/>
             <w:tcMar>
               <w:top w:type="dxa" w:w="50"/>
               <w:left w:type="dxa" w:w="100"/>
@@ -2605,7 +2536,7 @@
       <w:tr>
         <w:tc>
           <w:tcPr>
-            <w:tcW w:type="dxa" w:w="960"/>
+            <w:tcW w:type="dxa" w:w="847"/>
             <w:tcMar>
               <w:top w:type="dxa" w:w="50"/>
               <w:left w:type="dxa" w:w="100"/>
@@ -2625,7 +2556,7 @@
         </w:tc>
         <w:tc>
           <w:tcPr>
-            <w:tcW w:type="dxa" w:w="2785"/>
+            <w:tcW w:type="dxa" w:w="3602"/>
             <w:tcMar>
               <w:top w:type="dxa" w:w="50"/>
               <w:left w:type="dxa" w:w="100"/>
@@ -2646,7 +2577,7 @@
         </w:tc>
         <w:tc>
           <w:tcPr>
-            <w:tcW w:type="dxa" w:w="1680"/>
+            <w:tcW w:type="dxa" w:w="1483"/>
             <w:tcMar>
               <w:top w:type="dxa" w:w="50"/>
               <w:left w:type="dxa" w:w="100"/>
@@ -2666,7 +2597,7 @@
         </w:tc>
         <w:tc>
           <w:tcPr>
-            <w:tcW w:type="dxa" w:w="4321"/>
+            <w:tcW w:type="dxa" w:w="3814"/>
             <w:tcMar>
               <w:top w:type="dxa" w:w="50"/>
               <w:left w:type="dxa" w:w="100"/>
@@ -2688,7 +2619,7 @@
       <w:tr>
         <w:tc>
           <w:tcPr>
-            <w:tcW w:type="dxa" w:w="960"/>
+            <w:tcW w:type="dxa" w:w="847"/>
             <w:tcMar>
               <w:top w:type="dxa" w:w="50"/>
               <w:left w:type="dxa" w:w="100"/>
@@ -2708,7 +2639,7 @@
         </w:tc>
         <w:tc>
           <w:tcPr>
-            <w:tcW w:type="dxa" w:w="2785"/>
+            <w:tcW w:type="dxa" w:w="3602"/>
             <w:tcMar>
               <w:top w:type="dxa" w:w="50"/>
               <w:left w:type="dxa" w:w="100"/>
@@ -2728,7 +2659,7 @@
         </w:tc>
         <w:tc>
           <w:tcPr>
-            <w:tcW w:type="dxa" w:w="1680"/>
+            <w:tcW w:type="dxa" w:w="1483"/>
             <w:tcMar>
               <w:top w:type="dxa" w:w="50"/>
               <w:left w:type="dxa" w:w="100"/>
@@ -2771,7 +2702,7 @@
         </w:tc>
         <w:tc>
           <w:tcPr>
-            <w:tcW w:type="dxa" w:w="4321"/>
+            <w:tcW w:type="dxa" w:w="3814"/>
             <w:tcMar>
               <w:top w:type="dxa" w:w="50"/>
               <w:left w:type="dxa" w:w="100"/>
@@ -2793,7 +2724,7 @@
       <w:tr>
         <w:tc>
           <w:tcPr>
-            <w:tcW w:type="dxa" w:w="960"/>
+            <w:tcW w:type="dxa" w:w="847"/>
             <w:tcMar>
               <w:top w:type="dxa" w:w="50"/>
               <w:left w:type="dxa" w:w="100"/>
@@ -2813,7 +2744,7 @@
         </w:tc>
         <w:tc>
           <w:tcPr>
-            <w:tcW w:type="dxa" w:w="2785"/>
+            <w:tcW w:type="dxa" w:w="3602"/>
             <w:tcMar>
               <w:top w:type="dxa" w:w="50"/>
               <w:left w:type="dxa" w:w="100"/>
@@ -2833,7 +2764,7 @@
         </w:tc>
         <w:tc>
           <w:tcPr>
-            <w:tcW w:type="dxa" w:w="1680"/>
+            <w:tcW w:type="dxa" w:w="1483"/>
             <w:tcMar>
               <w:top w:type="dxa" w:w="50"/>
               <w:left w:type="dxa" w:w="100"/>
@@ -2854,7 +2785,7 @@
         </w:tc>
         <w:tc>
           <w:tcPr>
-            <w:tcW w:type="dxa" w:w="4321"/>
+            <w:tcW w:type="dxa" w:w="3814"/>
             <w:tcMar>
               <w:top w:type="dxa" w:w="50"/>
               <w:left w:type="dxa" w:w="100"/>
@@ -2876,7 +2807,7 @@
       <w:tr>
         <w:tc>
           <w:tcPr>
-            <w:tcW w:type="dxa" w:w="960"/>
+            <w:tcW w:type="dxa" w:w="847"/>
             <w:tcMar>
               <w:top w:type="dxa" w:w="50"/>
               <w:left w:type="dxa" w:w="100"/>
@@ -2896,7 +2827,7 @@
         </w:tc>
         <w:tc>
           <w:tcPr>
-            <w:tcW w:type="dxa" w:w="2785"/>
+            <w:tcW w:type="dxa" w:w="3602"/>
             <w:tcMar>
               <w:top w:type="dxa" w:w="50"/>
               <w:left w:type="dxa" w:w="100"/>
@@ -2931,7 +2862,7 @@
         </w:tc>
         <w:tc>
           <w:tcPr>
-            <w:tcW w:type="dxa" w:w="1680"/>
+            <w:tcW w:type="dxa" w:w="1483"/>
             <w:tcMar>
               <w:top w:type="dxa" w:w="50"/>
               <w:left w:type="dxa" w:w="100"/>
@@ -2952,7 +2883,7 @@
         </w:tc>
         <w:tc>
           <w:tcPr>
-            <w:tcW w:type="dxa" w:w="4321"/>
+            <w:tcW w:type="dxa" w:w="3814"/>
             <w:tcMar>
               <w:top w:type="dxa" w:w="50"/>
               <w:left w:type="dxa" w:w="100"/>
@@ -2974,7 +2905,7 @@
       <w:tr>
         <w:tc>
           <w:tcPr>
-            <w:tcW w:type="dxa" w:w="960"/>
+            <w:tcW w:type="dxa" w:w="847"/>
             <w:tcMar>
               <w:top w:type="dxa" w:w="50"/>
               <w:left w:type="dxa" w:w="100"/>
@@ -2994,7 +2925,7 @@
         </w:tc>
         <w:tc>
           <w:tcPr>
-            <w:tcW w:type="dxa" w:w="2785"/>
+            <w:tcW w:type="dxa" w:w="3602"/>
             <w:tcMar>
               <w:top w:type="dxa" w:w="50"/>
               <w:left w:type="dxa" w:w="100"/>
@@ -3014,7 +2945,7 @@
         </w:tc>
         <w:tc>
           <w:tcPr>
-            <w:tcW w:type="dxa" w:w="1680"/>
+            <w:tcW w:type="dxa" w:w="1483"/>
             <w:tcMar>
               <w:top w:type="dxa" w:w="50"/>
               <w:left w:type="dxa" w:w="100"/>
@@ -3035,7 +2966,7 @@
         </w:tc>
         <w:tc>
           <w:tcPr>
-            <w:tcW w:type="dxa" w:w="4321"/>
+            <w:tcW w:type="dxa" w:w="3814"/>
             <w:tcMar>
               <w:top w:type="dxa" w:w="50"/>
               <w:left w:type="dxa" w:w="100"/>
@@ -3130,100 +3061,80 @@
           <w:b/>
           <w:bCs/>
         </w:rPr>
-        <w:t xml:space="preserve">10 flux de collecte distincts au total</w:t>
-      </w:r>
-      <w:r>
-        <w:t xml:space="preserve">, répartis en 2 mécanismes différents :</w:t>
-      </w:r>
-    </w:p>
-    <w:p>
-      <w:pPr>
-        <w:pStyle w:val="Heading2"/>
-        <w:spacing w:after="140" w:before="280"/>
-      </w:pPr>
-      <w:r>
-        <w:rPr>
-          <w:b/>
-          <w:bCs/>
-          <w:color w:val="555555"/>
-        </w:rPr>
-        <w:t xml:space="preserve">3.1 Les 6 sources "documents" (alimentent </w:t>
-      </w:r>
-      <w:r>
-        <w:rPr>
-          <w:rFonts w:ascii="Consolas" w:cs="Consolas" w:eastAsia="Consolas" w:hAnsi="Consolas"/>
-          <w:b/>
-          <w:bCs/>
-          <w:color w:val="555555"/>
-          <w:sz w:val="20"/>
-          <w:szCs w:val="20"/>
-        </w:rPr>
-        <w:t xml:space="preserve">documents</w:t>
-      </w:r>
-      <w:r>
-        <w:rPr>
-          <w:b/>
-          <w:bCs/>
-          <w:color w:val="555555"/>
-        </w:rPr>
-        <w:t xml:space="preserve">/</w:t>
-      </w:r>
-      <w:r>
-        <w:rPr>
-          <w:rFonts w:ascii="Consolas" w:cs="Consolas" w:eastAsia="Consolas" w:hAnsi="Consolas"/>
-          <w:b/>
-          <w:bCs/>
-          <w:color w:val="555555"/>
-          <w:sz w:val="20"/>
-          <w:szCs w:val="20"/>
-        </w:rPr>
-        <w:t xml:space="preserve">kpi_values</w:t>
-      </w:r>
-      <w:r>
-        <w:rPr>
-          <w:b/>
-          <w:bCs/>
-          <w:color w:val="555555"/>
-        </w:rPr>
-        <w:t xml:space="preserve">, </w:t>
-      </w:r>
-      <w:r>
-        <w:rPr>
-          <w:rFonts w:ascii="Consolas" w:cs="Consolas" w:eastAsia="Consolas" w:hAnsi="Consolas"/>
-          <w:b/>
-          <w:bCs/>
-          <w:color w:val="555555"/>
-          <w:sz w:val="20"/>
-          <w:szCs w:val="20"/>
-        </w:rPr>
-        <w:t xml:space="preserve">scraping/</w:t>
-      </w:r>
-      <w:r>
-        <w:rPr>
-          <w:b/>
-          <w:bCs/>
-          <w:color w:val="555555"/>
-        </w:rPr>
-        <w:t xml:space="preserve"> + </w:t>
-      </w:r>
-      <w:r>
-        <w:rPr>
-          <w:rFonts w:ascii="Consolas" w:cs="Consolas" w:eastAsia="Consolas" w:hAnsi="Consolas"/>
-          <w:b/>
-          <w:bCs/>
-          <w:color w:val="555555"/>
-          <w:sz w:val="20"/>
-          <w:szCs w:val="20"/>
-        </w:rPr>
-        <w:t xml:space="preserve">scripts/seed_enquete_marche.py</w:t>
-      </w:r>
-      <w:r>
-        <w:rPr>
-          <w:b/>
-          <w:bCs/>
-          <w:color w:val="555555"/>
-        </w:rPr>
-        <w:t xml:space="preserve">)</w:t>
+        <w:t xml:space="preserve">8 sources d'origine.</w:t>
+      </w:r>
+      <w:r>
+        <w:t xml:space="preserve"> Deux d'entre elles (CGA et FTUSA) alimentent chacune deux circuits différents dans l'application — des rapports chiffrés (KPI) *et* des textes réglementaires — mais restent une seule source d'origine chacune.</w:t>
+      </w:r>
+    </w:p>
+    <w:p>
+      <w:pPr>
+        <w:spacing w:after="100" w:before="100"/>
+        <w:jc w:val="center"/>
+      </w:pPr>
+      <w:r>
+        <w:drawing>
+          <wp:inline distT="0" distB="0" distL="0" distR="0">
+            <wp:extent cx="6191250" cy="4552950"/>
+            <wp:effectExtent t="0" r="0" b="0" l="0"/>
+            <wp:docPr id="1" name="" descr="" title=""/>
+            <wp:cNvGraphicFramePr>
+              <a:graphicFrameLocks xmlns:a="http://schemas.openxmlformats.org/drawingml/2006/main" noChangeAspect="1"/>
+            </wp:cNvGraphicFramePr>
+            <a:graphic xmlns:a="http://schemas.openxmlformats.org/drawingml/2006/main">
+              <a:graphicData uri="http://schemas.openxmlformats.org/drawingml/2006/picture">
+                <pic:pic xmlns:pic="http://schemas.openxmlformats.org/drawingml/2006/picture">
+                  <pic:nvPicPr>
+                    <pic:cNvPr id="0" name="" descr=""/>
+                    <pic:cNvPicPr>
+                      <a:picLocks noChangeAspect="1" noChangeArrowheads="1"/>
+                    </pic:cNvPicPr>
+                  </pic:nvPicPr>
+                  <pic:blipFill>
+                    <a:blip r:embed="rId7" cstate="none"/>
+                    <a:srcRect/>
+                    <a:stretch>
+                      <a:fillRect/>
+                    </a:stretch>
+                  </pic:blipFill>
+                  <pic:spPr bwMode="auto">
+                    <a:xfrm>
+                      <a:off x="0" y="0"/>
+                      <a:ext cx="6191250" cy="4552950"/>
+                    </a:xfrm>
+                    <a:prstGeom prst="rect">
+                      <a:avLst/>
+                    </a:prstGeom>
+                  </pic:spPr>
+                </pic:pic>
+              </a:graphicData>
+            </a:graphic>
+          </wp:inline>
+        </w:drawing>
+      </w:r>
+    </w:p>
+    <w:p>
+      <w:pPr>
+        <w:spacing w:after="160"/>
+        <w:jc w:val="center"/>
+      </w:pPr>
+      <w:r>
+        <w:rPr>
+          <w:i/>
+          <w:iCs/>
+          <w:color w:val="777777"/>
+          <w:sz w:val="17"/>
+          <w:szCs w:val="17"/>
+        </w:rPr>
+        <w:t xml:space="preserve">Schéma de la couche de scraping</w:t>
+      </w:r>
+    </w:p>
+    <w:p>
+      <w:pPr>
+        <w:spacing w:after="140"/>
+      </w:pPr>
+      <w:r>
+        <w:t xml:space="preserve">Trois méthodes techniques différentes selon la nature du site, et une chaîne commune de 4 étapes une fois la donnée récupérée :</w:t>
       </w:r>
     </w:p>
     <w:tbl>
@@ -3239,11 +3150,9 @@
         </w:tblBorders>
       </w:tblPr>
       <w:tblGrid>
-        <w:gridCol w:w="432"/>
-        <w:gridCol w:w="2672"/>
-        <w:gridCol w:w="1651"/>
-        <w:gridCol w:w="1454"/>
-        <w:gridCol w:w="3537"/>
+        <w:gridCol w:w="2410"/>
+        <w:gridCol w:w="2517"/>
+        <w:gridCol w:w="4819"/>
       </w:tblGrid>
       <w:tr>
         <w:trPr>
@@ -3251,7 +3160,7 @@
         </w:trPr>
         <w:tc>
           <w:tcPr>
-            <w:tcW w:type="dxa" w:w="432"/>
+            <w:tcW w:type="dxa" w:w="2410"/>
             <w:shd w:fill="2E2E38" w:color="auto" w:val="clear"/>
             <w:tcMar>
               <w:top w:type="dxa" w:w="60"/>
@@ -3269,13 +3178,13 @@
                 <w:sz w:val="19"/>
                 <w:szCs w:val="19"/>
               </w:rPr>
-              <w:t xml:space="preserve">Source</w:t>
-            </w:r>
-          </w:p>
-        </w:tc>
-        <w:tc>
-          <w:tcPr>
-            <w:tcW w:type="dxa" w:w="2672"/>
+              <w:t xml:space="preserve">Méthode</w:t>
+            </w:r>
+          </w:p>
+        </w:tc>
+        <w:tc>
+          <w:tcPr>
+            <w:tcW w:type="dxa" w:w="2517"/>
             <w:shd w:fill="2E2E38" w:color="auto" w:val="clear"/>
             <w:tcMar>
               <w:top w:type="dxa" w:w="60"/>
@@ -3293,13 +3202,13 @@
                 <w:sz w:val="19"/>
                 <w:szCs w:val="19"/>
               </w:rPr>
-              <w:t xml:space="preserve">Fichier</w:t>
-            </w:r>
-          </w:p>
-        </w:tc>
-        <w:tc>
-          <w:tcPr>
-            <w:tcW w:type="dxa" w:w="1651"/>
+              <w:t xml:space="preserve">Sources concernées</w:t>
+            </w:r>
+          </w:p>
+        </w:tc>
+        <w:tc>
+          <w:tcPr>
+            <w:tcW w:type="dxa" w:w="4819"/>
             <w:shd w:fill="2E2E38" w:color="auto" w:val="clear"/>
             <w:tcMar>
               <w:top w:type="dxa" w:w="60"/>
@@ -3317,18 +3226,19 @@
                 <w:sz w:val="19"/>
                 <w:szCs w:val="19"/>
               </w:rPr>
-              <w:t xml:space="preserve">Cible</w:t>
-            </w:r>
-          </w:p>
-        </w:tc>
-        <w:tc>
-          <w:tcPr>
-            <w:tcW w:type="dxa" w:w="1454"/>
-            <w:shd w:fill="2E2E38" w:color="auto" w:val="clear"/>
-            <w:tcMar>
-              <w:top w:type="dxa" w:w="60"/>
-              <w:left w:type="dxa" w:w="100"/>
-              <w:bottom w:type="dxa" w:w="60"/>
+              <w:t xml:space="preserve">Pourquoi ce choix</w:t>
+            </w:r>
+          </w:p>
+        </w:tc>
+      </w:tr>
+      <w:tr>
+        <w:tc>
+          <w:tcPr>
+            <w:tcW w:type="dxa" w:w="2410"/>
+            <w:tcMar>
+              <w:top w:type="dxa" w:w="50"/>
+              <w:left w:type="dxa" w:w="100"/>
+              <w:bottom w:type="dxa" w:w="50"/>
               <w:right w:type="dxa" w:w="100"/>
             </w:tcMar>
           </w:tcPr>
@@ -3337,22 +3247,84 @@
               <w:rPr>
                 <w:b/>
                 <w:bCs/>
-                <w:color w:val="FFFFFF"/>
-                <w:sz w:val="19"/>
-                <w:szCs w:val="19"/>
-              </w:rPr>
-              <w:t xml:space="preserve">Méthode</w:t>
-            </w:r>
-          </w:p>
-        </w:tc>
-        <w:tc>
-          <w:tcPr>
-            <w:tcW w:type="dxa" w:w="3537"/>
-            <w:shd w:fill="2E2E38" w:color="auto" w:val="clear"/>
-            <w:tcMar>
-              <w:top w:type="dxa" w:w="60"/>
-              <w:left w:type="dxa" w:w="100"/>
-              <w:bottom w:type="dxa" w:w="60"/>
+                <w:sz w:val="19"/>
+                <w:szCs w:val="19"/>
+              </w:rPr>
+              <w:t xml:space="preserve">Selenium</w:t>
+            </w:r>
+            <w:r>
+              <w:rPr>
+                <w:sz w:val="19"/>
+                <w:szCs w:val="19"/>
+              </w:rPr>
+              <w:t xml:space="preserve"> (navigateur piloté, invisible)</w:t>
+            </w:r>
+          </w:p>
+        </w:tc>
+        <w:tc>
+          <w:tcPr>
+            <w:tcW w:type="dxa" w:w="2517"/>
+            <w:tcMar>
+              <w:top w:type="dxa" w:w="50"/>
+              <w:left w:type="dxa" w:w="100"/>
+              <w:bottom w:type="dxa" w:w="50"/>
+              <w:right w:type="dxa" w:w="100"/>
+            </w:tcMar>
+          </w:tcPr>
+          <w:p>
+            <w:r>
+              <w:rPr>
+                <w:sz w:val="19"/>
+                <w:szCs w:val="19"/>
+              </w:rPr>
+              <w:t xml:space="preserve">CMF uniquement</w:t>
+            </w:r>
+          </w:p>
+        </w:tc>
+        <w:tc>
+          <w:tcPr>
+            <w:tcW w:type="dxa" w:w="4819"/>
+            <w:tcMar>
+              <w:top w:type="dxa" w:w="50"/>
+              <w:left w:type="dxa" w:w="100"/>
+              <w:bottom w:type="dxa" w:w="50"/>
+              <w:right w:type="dxa" w:w="100"/>
+            </w:tcMar>
+          </w:tcPr>
+          <w:p>
+            <w:r>
+              <w:rPr>
+                <w:sz w:val="19"/>
+                <w:szCs w:val="19"/>
+              </w:rPr>
+              <w:t xml:space="preserve">Le sélecteur de société sur ce portail est un widget JavaScript dynamique (plugin "Chosen" Drupal) — une simple requête HTTP ne peut pas interagir avec un composant rendu côté client. Repli sur le </w:t>
+            </w:r>
+            <w:r>
+              <w:rPr>
+                <w:rFonts w:ascii="Consolas" w:cs="Consolas" w:eastAsia="Consolas" w:hAnsi="Consolas"/>
+                <w:sz w:val="19"/>
+                <w:szCs w:val="19"/>
+              </w:rPr>
+              <w:t xml:space="preserve">&lt;select&gt;</w:t>
+            </w:r>
+            <w:r>
+              <w:rPr>
+                <w:sz w:val="19"/>
+                <w:szCs w:val="19"/>
+              </w:rPr>
+              <w:t xml:space="preserve"> HTML natif si le widget n'a pas chargé.</w:t>
+            </w:r>
+          </w:p>
+        </w:tc>
+      </w:tr>
+      <w:tr>
+        <w:tc>
+          <w:tcPr>
+            <w:tcW w:type="dxa" w:w="2410"/>
+            <w:tcMar>
+              <w:top w:type="dxa" w:w="50"/>
+              <w:left w:type="dxa" w:w="100"/>
+              <w:bottom w:type="dxa" w:w="50"/>
               <w:right w:type="dxa" w:w="100"/>
             </w:tcMar>
           </w:tcPr>
@@ -3361,11 +3333,57 @@
               <w:rPr>
                 <w:b/>
                 <w:bCs/>
-                <w:color w:val="FFFFFF"/>
-                <w:sz w:val="19"/>
-                <w:szCs w:val="19"/>
-              </w:rPr>
-              <w:t xml:space="preserve">Ce qui est collecté</w:t>
+                <w:sz w:val="19"/>
+                <w:szCs w:val="19"/>
+              </w:rPr>
+              <w:t xml:space="preserve">`requests` + regex</w:t>
+            </w:r>
+            <w:r>
+              <w:rPr>
+                <w:sz w:val="19"/>
+                <w:szCs w:val="19"/>
+              </w:rPr>
+              <w:t xml:space="preserve"> (requête HTTP directe)</w:t>
+            </w:r>
+          </w:p>
+        </w:tc>
+        <w:tc>
+          <w:tcPr>
+            <w:tcW w:type="dxa" w:w="2517"/>
+            <w:tcMar>
+              <w:top w:type="dxa" w:w="50"/>
+              <w:left w:type="dxa" w:w="100"/>
+              <w:bottom w:type="dxa" w:w="50"/>
+              <w:right w:type="dxa" w:w="100"/>
+            </w:tcMar>
+          </w:tcPr>
+          <w:p>
+            <w:r>
+              <w:rPr>
+                <w:sz w:val="19"/>
+                <w:szCs w:val="19"/>
+              </w:rPr>
+              <w:t xml:space="preserve">FTUSA, CGA, BVMT, INS, Atlas Magazine, IlBoursa</w:t>
+            </w:r>
+          </w:p>
+        </w:tc>
+        <w:tc>
+          <w:tcPr>
+            <w:tcW w:type="dxa" w:w="4819"/>
+            <w:tcMar>
+              <w:top w:type="dxa" w:w="50"/>
+              <w:left w:type="dxa" w:w="100"/>
+              <w:bottom w:type="dxa" w:w="50"/>
+              <w:right w:type="dxa" w:w="100"/>
+            </w:tcMar>
+          </w:tcPr>
+          <w:p>
+            <w:r>
+              <w:rPr>
+                <w:sz w:val="19"/>
+                <w:szCs w:val="19"/>
+              </w:rPr>
+              <w:t xml:space="preserve">Pages HTML majoritairement statiques — plus simple, plus rapide et plus robuste que d'ouvrir un navigateur complet pour une page qui ne le nécessite pas.</w:t>
             </w:r>
           </w:p>
         </w:tc>
@@ -3373,7 +3391,7 @@
       <w:tr>
         <w:tc>
           <w:tcPr>
-            <w:tcW w:type="dxa" w:w="432"/>
+            <w:tcW w:type="dxa" w:w="2410"/>
             <w:tcMar>
               <w:top w:type="dxa" w:w="50"/>
               <w:left w:type="dxa" w:w="100"/>
@@ -3389,636 +3407,54 @@
                 <w:sz w:val="19"/>
                 <w:szCs w:val="19"/>
               </w:rPr>
-              <w:t xml:space="preserve">CMF</w:t>
-            </w:r>
-          </w:p>
-        </w:tc>
-        <w:tc>
-          <w:tcPr>
-            <w:tcW w:type="dxa" w:w="2672"/>
-            <w:tcMar>
-              <w:top w:type="dxa" w:w="50"/>
-              <w:left w:type="dxa" w:w="100"/>
-              <w:bottom w:type="dxa" w:w="50"/>
-              <w:right w:type="dxa" w:w="100"/>
-            </w:tcMar>
-          </w:tcPr>
-          <w:p>
+              <w:t xml:space="preserve">Lecture de fichier local</w:t>
+            </w:r>
+          </w:p>
+        </w:tc>
+        <w:tc>
+          <w:tcPr>
+            <w:tcW w:type="dxa" w:w="2517"/>
+            <w:tcMar>
+              <w:top w:type="dxa" w:w="50"/>
+              <w:left w:type="dxa" w:w="100"/>
+              <w:bottom w:type="dxa" w:w="50"/>
+              <w:right w:type="dxa" w:w="100"/>
+            </w:tcMar>
+          </w:tcPr>
+          <w:p>
+            <w:r>
+              <w:rPr>
+                <w:sz w:val="19"/>
+                <w:szCs w:val="19"/>
+              </w:rPr>
+              <w:t xml:space="preserve">ENQUETE</w:t>
+            </w:r>
+          </w:p>
+        </w:tc>
+        <w:tc>
+          <w:tcPr>
+            <w:tcW w:type="dxa" w:w="4819"/>
+            <w:tcMar>
+              <w:top w:type="dxa" w:w="50"/>
+              <w:left w:type="dxa" w:w="100"/>
+              <w:bottom w:type="dxa" w:w="50"/>
+              <w:right w:type="dxa" w:w="100"/>
+            </w:tcMar>
+          </w:tcPr>
+          <w:p>
+            <w:r>
+              <w:rPr>
+                <w:sz w:val="19"/>
+                <w:szCs w:val="19"/>
+              </w:rPr>
+              <w:t xml:space="preserve">Ce n'est pas un site web : les données viennent d'un fichier Excel (</w:t>
+            </w:r>
             <w:r>
               <w:rPr>
                 <w:rFonts w:ascii="Consolas" w:cs="Consolas" w:eastAsia="Consolas" w:hAnsi="Consolas"/>
                 <w:sz w:val="19"/>
                 <w:szCs w:val="19"/>
               </w:rPr>
-              <w:t xml:space="preserve">scraping/cmf_portal_scraper.py</w:t>
-            </w:r>
-          </w:p>
-        </w:tc>
-        <w:tc>
-          <w:tcPr>
-            <w:tcW w:type="dxa" w:w="1651"/>
-            <w:tcMar>
-              <w:top w:type="dxa" w:w="50"/>
-              <w:left w:type="dxa" w:w="100"/>
-              <w:bottom w:type="dxa" w:w="50"/>
-              <w:right w:type="dxa" w:w="100"/>
-            </w:tcMar>
-          </w:tcPr>
-          <w:p>
-            <w:r>
-              <w:rPr>
-                <w:sz w:val="19"/>
-                <w:szCs w:val="19"/>
-              </w:rPr>
-              <w:t xml:space="preserve">Portail CMF (Conseil du Marché Financier)</w:t>
-            </w:r>
-          </w:p>
-        </w:tc>
-        <w:tc>
-          <w:tcPr>
-            <w:tcW w:type="dxa" w:w="1454"/>
-            <w:tcMar>
-              <w:top w:type="dxa" w:w="50"/>
-              <w:left w:type="dxa" w:w="100"/>
-              <w:bottom w:type="dxa" w:w="50"/>
-              <w:right w:type="dxa" w:w="100"/>
-            </w:tcMar>
-          </w:tcPr>
-          <w:p>
-            <w:r>
-              <w:rPr>
-                <w:b/>
-                <w:bCs/>
-                <w:sz w:val="19"/>
-                <w:szCs w:val="19"/>
-              </w:rPr>
-              <w:t xml:space="preserve">Selenium</w:t>
-            </w:r>
-            <w:r>
-              <w:rPr>
-                <w:sz w:val="19"/>
-                <w:szCs w:val="19"/>
-              </w:rPr>
-              <w:t xml:space="preserve"> (Chrome headless)</w:t>
-            </w:r>
-          </w:p>
-        </w:tc>
-        <w:tc>
-          <w:tcPr>
-            <w:tcW w:type="dxa" w:w="3537"/>
-            <w:tcMar>
-              <w:top w:type="dxa" w:w="50"/>
-              <w:left w:type="dxa" w:w="100"/>
-              <w:bottom w:type="dxa" w:w="50"/>
-              <w:right w:type="dxa" w:w="100"/>
-            </w:tcMar>
-          </w:tcPr>
-          <w:p>
-            <w:r>
-              <w:rPr>
-                <w:sz w:val="19"/>
-                <w:szCs w:val="19"/>
-              </w:rPr>
-              <w:t xml:space="preserve">États financiers annuels au 31/12 des 24 compagnies, sur ~10-11 ans glissants</w:t>
-            </w:r>
-          </w:p>
-        </w:tc>
-      </w:tr>
-      <w:tr>
-        <w:tc>
-          <w:tcPr>
-            <w:tcW w:type="dxa" w:w="432"/>
-            <w:tcMar>
-              <w:top w:type="dxa" w:w="50"/>
-              <w:left w:type="dxa" w:w="100"/>
-              <w:bottom w:type="dxa" w:w="50"/>
-              <w:right w:type="dxa" w:w="100"/>
-            </w:tcMar>
-          </w:tcPr>
-          <w:p>
-            <w:r>
-              <w:rPr>
-                <w:b/>
-                <w:bCs/>
-                <w:sz w:val="19"/>
-                <w:szCs w:val="19"/>
-              </w:rPr>
-              <w:t xml:space="preserve">FTUSA</w:t>
-            </w:r>
-          </w:p>
-        </w:tc>
-        <w:tc>
-          <w:tcPr>
-            <w:tcW w:type="dxa" w:w="2672"/>
-            <w:tcMar>
-              <w:top w:type="dxa" w:w="50"/>
-              <w:left w:type="dxa" w:w="100"/>
-              <w:bottom w:type="dxa" w:w="50"/>
-              <w:right w:type="dxa" w:w="100"/>
-            </w:tcMar>
-          </w:tcPr>
-          <w:p>
-            <w:r>
-              <w:rPr>
-                <w:rFonts w:ascii="Consolas" w:cs="Consolas" w:eastAsia="Consolas" w:hAnsi="Consolas"/>
-                <w:sz w:val="19"/>
-                <w:szCs w:val="19"/>
-              </w:rPr>
-              <w:t xml:space="preserve">scraping/ftusa_scraper.py</w:t>
-            </w:r>
-          </w:p>
-        </w:tc>
-        <w:tc>
-          <w:tcPr>
-            <w:tcW w:type="dxa" w:w="1651"/>
-            <w:tcMar>
-              <w:top w:type="dxa" w:w="50"/>
-              <w:left w:type="dxa" w:w="100"/>
-              <w:bottom w:type="dxa" w:w="50"/>
-              <w:right w:type="dxa" w:w="100"/>
-            </w:tcMar>
-          </w:tcPr>
-          <w:p>
-            <w:r>
-              <w:rPr>
-                <w:sz w:val="19"/>
-                <w:szCs w:val="19"/>
-              </w:rPr>
-              <w:t xml:space="preserve">ftusanet.org</w:t>
-            </w:r>
-          </w:p>
-        </w:tc>
-        <w:tc>
-          <w:tcPr>
-            <w:tcW w:type="dxa" w:w="1454"/>
-            <w:tcMar>
-              <w:top w:type="dxa" w:w="50"/>
-              <w:left w:type="dxa" w:w="100"/>
-              <w:bottom w:type="dxa" w:w="50"/>
-              <w:right w:type="dxa" w:w="100"/>
-            </w:tcMar>
-          </w:tcPr>
-          <w:p>
-            <w:r>
-              <w:rPr>
-                <w:rFonts w:ascii="Consolas" w:cs="Consolas" w:eastAsia="Consolas" w:hAnsi="Consolas"/>
-                <w:sz w:val="19"/>
-                <w:szCs w:val="19"/>
-              </w:rPr>
-              <w:t xml:space="preserve">requests</w:t>
-            </w:r>
-            <w:r>
-              <w:rPr>
-                <w:sz w:val="19"/>
-                <w:szCs w:val="19"/>
-              </w:rPr>
-              <w:t xml:space="preserve"> + </w:t>
-            </w:r>
-            <w:r>
-              <w:rPr>
-                <w:rFonts w:ascii="Consolas" w:cs="Consolas" w:eastAsia="Consolas" w:hAnsi="Consolas"/>
-                <w:sz w:val="19"/>
-                <w:szCs w:val="19"/>
-              </w:rPr>
-              <w:t xml:space="preserve">pdfplumber</w:t>
-            </w:r>
-          </w:p>
-        </w:tc>
-        <w:tc>
-          <w:tcPr>
-            <w:tcW w:type="dxa" w:w="3537"/>
-            <w:tcMar>
-              <w:top w:type="dxa" w:w="50"/>
-              <w:left w:type="dxa" w:w="100"/>
-              <w:bottom w:type="dxa" w:w="50"/>
-              <w:right w:type="dxa" w:w="100"/>
-            </w:tcMar>
-          </w:tcPr>
-          <w:p>
-            <w:r>
-              <w:rPr>
-                <w:sz w:val="19"/>
-                <w:szCs w:val="19"/>
-              </w:rPr>
-              <w:t xml:space="preserve">Rapports annuels sectoriels (Fédération Tunisienne des Sociétés d'Assurances)</w:t>
-            </w:r>
-          </w:p>
-        </w:tc>
-      </w:tr>
-      <w:tr>
-        <w:tc>
-          <w:tcPr>
-            <w:tcW w:type="dxa" w:w="432"/>
-            <w:tcMar>
-              <w:top w:type="dxa" w:w="50"/>
-              <w:left w:type="dxa" w:w="100"/>
-              <w:bottom w:type="dxa" w:w="50"/>
-              <w:right w:type="dxa" w:w="100"/>
-            </w:tcMar>
-          </w:tcPr>
-          <w:p>
-            <w:r>
-              <w:rPr>
-                <w:b/>
-                <w:bCs/>
-                <w:sz w:val="19"/>
-                <w:szCs w:val="19"/>
-              </w:rPr>
-              <w:t xml:space="preserve">CGA</w:t>
-            </w:r>
-          </w:p>
-        </w:tc>
-        <w:tc>
-          <w:tcPr>
-            <w:tcW w:type="dxa" w:w="2672"/>
-            <w:tcMar>
-              <w:top w:type="dxa" w:w="50"/>
-              <w:left w:type="dxa" w:w="100"/>
-              <w:bottom w:type="dxa" w:w="50"/>
-              <w:right w:type="dxa" w:w="100"/>
-            </w:tcMar>
-          </w:tcPr>
-          <w:p>
-            <w:r>
-              <w:rPr>
-                <w:rFonts w:ascii="Consolas" w:cs="Consolas" w:eastAsia="Consolas" w:hAnsi="Consolas"/>
-                <w:sz w:val="19"/>
-                <w:szCs w:val="19"/>
-              </w:rPr>
-              <w:t xml:space="preserve">scraping/cga_scraper.py</w:t>
-            </w:r>
-          </w:p>
-        </w:tc>
-        <w:tc>
-          <w:tcPr>
-            <w:tcW w:type="dxa" w:w="1651"/>
-            <w:tcMar>
-              <w:top w:type="dxa" w:w="50"/>
-              <w:left w:type="dxa" w:w="100"/>
-              <w:bottom w:type="dxa" w:w="50"/>
-              <w:right w:type="dxa" w:w="100"/>
-            </w:tcMar>
-          </w:tcPr>
-          <w:p>
-            <w:r>
-              <w:rPr>
-                <w:sz w:val="19"/>
-                <w:szCs w:val="19"/>
-              </w:rPr>
-              <w:t xml:space="preserve">cga.gov.tn</w:t>
-            </w:r>
-          </w:p>
-        </w:tc>
-        <w:tc>
-          <w:tcPr>
-            <w:tcW w:type="dxa" w:w="1454"/>
-            <w:tcMar>
-              <w:top w:type="dxa" w:w="50"/>
-              <w:left w:type="dxa" w:w="100"/>
-              <w:bottom w:type="dxa" w:w="50"/>
-              <w:right w:type="dxa" w:w="100"/>
-            </w:tcMar>
-          </w:tcPr>
-          <w:p>
-            <w:r>
-              <w:rPr>
-                <w:rFonts w:ascii="Consolas" w:cs="Consolas" w:eastAsia="Consolas" w:hAnsi="Consolas"/>
-                <w:sz w:val="19"/>
-                <w:szCs w:val="19"/>
-              </w:rPr>
-              <w:t xml:space="preserve">requests</w:t>
-            </w:r>
-            <w:r>
-              <w:rPr>
-                <w:sz w:val="19"/>
-                <w:szCs w:val="19"/>
-              </w:rPr>
-              <w:t xml:space="preserve"> + regex</w:t>
-            </w:r>
-          </w:p>
-        </w:tc>
-        <w:tc>
-          <w:tcPr>
-            <w:tcW w:type="dxa" w:w="3537"/>
-            <w:tcMar>
-              <w:top w:type="dxa" w:w="50"/>
-              <w:left w:type="dxa" w:w="100"/>
-              <w:bottom w:type="dxa" w:w="50"/>
-              <w:right w:type="dxa" w:w="100"/>
-            </w:tcMar>
-          </w:tcPr>
-          <w:p>
-            <w:r>
-              <w:rPr>
-                <w:sz w:val="19"/>
-                <w:szCs w:val="19"/>
-              </w:rPr>
-              <w:t xml:space="preserve">Rapports annuels du régulateur (Comité Général des Assurances) — réseau d'agences, primes par branche</w:t>
-            </w:r>
-          </w:p>
-        </w:tc>
-      </w:tr>
-      <w:tr>
-        <w:tc>
-          <w:tcPr>
-            <w:tcW w:type="dxa" w:w="432"/>
-            <w:tcMar>
-              <w:top w:type="dxa" w:w="50"/>
-              <w:left w:type="dxa" w:w="100"/>
-              <w:bottom w:type="dxa" w:w="50"/>
-              <w:right w:type="dxa" w:w="100"/>
-            </w:tcMar>
-          </w:tcPr>
-          <w:p>
-            <w:r>
-              <w:rPr>
-                <w:b/>
-                <w:bCs/>
-                <w:sz w:val="19"/>
-                <w:szCs w:val="19"/>
-              </w:rPr>
-              <w:t xml:space="preserve">BVMT</w:t>
-            </w:r>
-          </w:p>
-        </w:tc>
-        <w:tc>
-          <w:tcPr>
-            <w:tcW w:type="dxa" w:w="2672"/>
-            <w:tcMar>
-              <w:top w:type="dxa" w:w="50"/>
-              <w:left w:type="dxa" w:w="100"/>
-              <w:bottom w:type="dxa" w:w="50"/>
-              <w:right w:type="dxa" w:w="100"/>
-            </w:tcMar>
-          </w:tcPr>
-          <w:p>
-            <w:r>
-              <w:rPr>
-                <w:rFonts w:ascii="Consolas" w:cs="Consolas" w:eastAsia="Consolas" w:hAnsi="Consolas"/>
-                <w:sz w:val="19"/>
-                <w:szCs w:val="19"/>
-              </w:rPr>
-              <w:t xml:space="preserve">scraping/bvmt_scraper.py</w:t>
-            </w:r>
-          </w:p>
-        </w:tc>
-        <w:tc>
-          <w:tcPr>
-            <w:tcW w:type="dxa" w:w="1651"/>
-            <w:tcMar>
-              <w:top w:type="dxa" w:w="50"/>
-              <w:left w:type="dxa" w:w="100"/>
-              <w:bottom w:type="dxa" w:w="50"/>
-              <w:right w:type="dxa" w:w="100"/>
-            </w:tcMar>
-          </w:tcPr>
-          <w:p>
-            <w:r>
-              <w:rPr>
-                <w:sz w:val="19"/>
-                <w:szCs w:val="19"/>
-              </w:rPr>
-              <w:t xml:space="preserve">tunis-stockexchange.com</w:t>
-            </w:r>
-          </w:p>
-        </w:tc>
-        <w:tc>
-          <w:tcPr>
-            <w:tcW w:type="dxa" w:w="1454"/>
-            <w:tcMar>
-              <w:top w:type="dxa" w:w="50"/>
-              <w:left w:type="dxa" w:w="100"/>
-              <w:bottom w:type="dxa" w:w="50"/>
-              <w:right w:type="dxa" w:w="100"/>
-            </w:tcMar>
-          </w:tcPr>
-          <w:p>
-            <w:r>
-              <w:rPr>
-                <w:rFonts w:ascii="Consolas" w:cs="Consolas" w:eastAsia="Consolas" w:hAnsi="Consolas"/>
-                <w:sz w:val="19"/>
-                <w:szCs w:val="19"/>
-              </w:rPr>
-              <w:t xml:space="preserve">requests</w:t>
-            </w:r>
-            <w:r>
-              <w:rPr>
-                <w:sz w:val="19"/>
-                <w:szCs w:val="19"/>
-              </w:rPr>
-              <w:t xml:space="preserve"> + regex</w:t>
-            </w:r>
-          </w:p>
-        </w:tc>
-        <w:tc>
-          <w:tcPr>
-            <w:tcW w:type="dxa" w:w="3537"/>
-            <w:tcMar>
-              <w:top w:type="dxa" w:w="50"/>
-              <w:left w:type="dxa" w:w="100"/>
-              <w:bottom w:type="dxa" w:w="50"/>
-              <w:right w:type="dxa" w:w="100"/>
-            </w:tcMar>
-          </w:tcPr>
-          <w:p>
-            <w:r>
-              <w:rPr>
-                <w:sz w:val="19"/>
-                <w:szCs w:val="19"/>
-              </w:rPr>
-              <w:t xml:space="preserve">Statut de cotation, rapports ESG, données de marché (cours, ISIN), bulletin boursier officiel</w:t>
-            </w:r>
-          </w:p>
-        </w:tc>
-      </w:tr>
-      <w:tr>
-        <w:tc>
-          <w:tcPr>
-            <w:tcW w:type="dxa" w:w="432"/>
-            <w:tcMar>
-              <w:top w:type="dxa" w:w="50"/>
-              <w:left w:type="dxa" w:w="100"/>
-              <w:bottom w:type="dxa" w:w="50"/>
-              <w:right w:type="dxa" w:w="100"/>
-            </w:tcMar>
-          </w:tcPr>
-          <w:p>
-            <w:r>
-              <w:rPr>
-                <w:b/>
-                <w:bCs/>
-                <w:sz w:val="19"/>
-                <w:szCs w:val="19"/>
-              </w:rPr>
-              <w:t xml:space="preserve">INS</w:t>
-            </w:r>
-          </w:p>
-        </w:tc>
-        <w:tc>
-          <w:tcPr>
-            <w:tcW w:type="dxa" w:w="2672"/>
-            <w:tcMar>
-              <w:top w:type="dxa" w:w="50"/>
-              <w:left w:type="dxa" w:w="100"/>
-              <w:bottom w:type="dxa" w:w="50"/>
-              <w:right w:type="dxa" w:w="100"/>
-            </w:tcMar>
-          </w:tcPr>
-          <w:p>
-            <w:r>
-              <w:rPr>
-                <w:rFonts w:ascii="Consolas" w:cs="Consolas" w:eastAsia="Consolas" w:hAnsi="Consolas"/>
-                <w:sz w:val="19"/>
-                <w:szCs w:val="19"/>
-              </w:rPr>
-              <w:t xml:space="preserve">scraping/ins_scraper.py</w:t>
-            </w:r>
-          </w:p>
-        </w:tc>
-        <w:tc>
-          <w:tcPr>
-            <w:tcW w:type="dxa" w:w="1651"/>
-            <w:tcMar>
-              <w:top w:type="dxa" w:w="50"/>
-              <w:left w:type="dxa" w:w="100"/>
-              <w:bottom w:type="dxa" w:w="50"/>
-              <w:right w:type="dxa" w:w="100"/>
-            </w:tcMar>
-          </w:tcPr>
-          <w:p>
-            <w:r>
-              <w:rPr>
-                <w:sz w:val="19"/>
-                <w:szCs w:val="19"/>
-              </w:rPr>
-              <w:t xml:space="preserve">dataportal.ins.tn + ins.tn</w:t>
-            </w:r>
-          </w:p>
-        </w:tc>
-        <w:tc>
-          <w:tcPr>
-            <w:tcW w:type="dxa" w:w="1454"/>
-            <w:tcMar>
-              <w:top w:type="dxa" w:w="50"/>
-              <w:left w:type="dxa" w:w="100"/>
-              <w:bottom w:type="dxa" w:w="50"/>
-              <w:right w:type="dxa" w:w="100"/>
-            </w:tcMar>
-          </w:tcPr>
-          <w:p>
-            <w:r>
-              <w:rPr>
-                <w:sz w:val="19"/>
-                <w:szCs w:val="19"/>
-              </w:rPr>
-              <w:t xml:space="preserve">API POST XML + repli HTML</w:t>
-            </w:r>
-          </w:p>
-        </w:tc>
-        <w:tc>
-          <w:tcPr>
-            <w:tcW w:type="dxa" w:w="3537"/>
-            <w:tcMar>
-              <w:top w:type="dxa" w:w="50"/>
-              <w:left w:type="dxa" w:w="100"/>
-              <w:bottom w:type="dxa" w:w="50"/>
-              <w:right w:type="dxa" w:w="100"/>
-            </w:tcMar>
-          </w:tcPr>
-          <w:p>
-            <w:r>
-              <w:rPr>
-                <w:sz w:val="19"/>
-                <w:szCs w:val="19"/>
-              </w:rPr>
-              <w:t xml:space="preserve">Population totale, PIB (Institut National de la Statistique)</w:t>
-            </w:r>
-          </w:p>
-        </w:tc>
-      </w:tr>
-      <w:tr>
-        <w:tc>
-          <w:tcPr>
-            <w:tcW w:type="dxa" w:w="432"/>
-            <w:tcMar>
-              <w:top w:type="dxa" w:w="50"/>
-              <w:left w:type="dxa" w:w="100"/>
-              <w:bottom w:type="dxa" w:w="50"/>
-              <w:right w:type="dxa" w:w="100"/>
-            </w:tcMar>
-          </w:tcPr>
-          <w:p>
-            <w:r>
-              <w:rPr>
-                <w:b/>
-                <w:bCs/>
-                <w:sz w:val="19"/>
-                <w:szCs w:val="19"/>
-              </w:rPr>
-              <w:t xml:space="preserve">ENQUETE</w:t>
-            </w:r>
-          </w:p>
-        </w:tc>
-        <w:tc>
-          <w:tcPr>
-            <w:tcW w:type="dxa" w:w="2672"/>
-            <w:tcMar>
-              <w:top w:type="dxa" w:w="50"/>
-              <w:left w:type="dxa" w:w="100"/>
-              <w:bottom w:type="dxa" w:w="50"/>
-              <w:right w:type="dxa" w:w="100"/>
-            </w:tcMar>
-          </w:tcPr>
-          <w:p>
-            <w:r>
-              <w:rPr>
-                <w:rFonts w:ascii="Consolas" w:cs="Consolas" w:eastAsia="Consolas" w:hAnsi="Consolas"/>
-                <w:sz w:val="19"/>
-                <w:szCs w:val="19"/>
-              </w:rPr>
-              <w:t xml:space="preserve">scripts/seed_enquete_marche.py</w:t>
-            </w:r>
-            <w:r>
-              <w:rPr>
-                <w:sz w:val="19"/>
-                <w:szCs w:val="19"/>
-              </w:rPr>
-              <w:t xml:space="preserve"> + </w:t>
-            </w:r>
-            <w:r>
-              <w:rPr>
-                <w:rFonts w:ascii="Consolas" w:cs="Consolas" w:eastAsia="Consolas" w:hAnsi="Consolas"/>
-                <w:sz w:val="19"/>
-                <w:szCs w:val="19"/>
-              </w:rPr>
-              <w:t xml:space="preserve">extraction/enquete_extractor.py</w:t>
-            </w:r>
-          </w:p>
-        </w:tc>
-        <w:tc>
-          <w:tcPr>
-            <w:tcW w:type="dxa" w:w="1651"/>
-            <w:tcMar>
-              <w:top w:type="dxa" w:w="50"/>
-              <w:left w:type="dxa" w:w="100"/>
-              <w:bottom w:type="dxa" w:w="50"/>
-              <w:right w:type="dxa" w:w="100"/>
-            </w:tcMar>
-          </w:tcPr>
-          <w:p>
-            <w:r>
-              <w:rPr>
-                <w:sz w:val="19"/>
-                <w:szCs w:val="19"/>
-              </w:rPr>
-              <w:t xml:space="preserve">Fichier Excel fourni (</w:t>
-            </w:r>
-            <w:r>
-              <w:rPr>
-                <w:rFonts w:ascii="Consolas" w:cs="Consolas" w:eastAsia="Consolas" w:hAnsi="Consolas"/>
-                <w:sz w:val="19"/>
-                <w:szCs w:val="19"/>
-              </w:rPr>
               <w:t xml:space="preserve">Survey CX_...xlsx</w:t>
             </w:r>
             <w:r>
@@ -4026,47 +3462,7 @@
                 <w:sz w:val="19"/>
                 <w:szCs w:val="19"/>
               </w:rPr>
-              <w:t xml:space="preserve">)</w:t>
-            </w:r>
-          </w:p>
-        </w:tc>
-        <w:tc>
-          <w:tcPr>
-            <w:tcW w:type="dxa" w:w="1454"/>
-            <w:tcMar>
-              <w:top w:type="dxa" w:w="50"/>
-              <w:left w:type="dxa" w:w="100"/>
-              <w:bottom w:type="dxa" w:w="50"/>
-              <w:right w:type="dxa" w:w="100"/>
-            </w:tcMar>
-          </w:tcPr>
-          <w:p>
-            <w:r>
-              <w:rPr>
-                <w:sz w:val="19"/>
-                <w:szCs w:val="19"/>
-              </w:rPr>
-              <w:t xml:space="preserve">Lecture directe (pas de scraping web)</w:t>
-            </w:r>
-          </w:p>
-        </w:tc>
-        <w:tc>
-          <w:tcPr>
-            <w:tcW w:type="dxa" w:w="3537"/>
-            <w:tcMar>
-              <w:top w:type="dxa" w:w="50"/>
-              <w:left w:type="dxa" w:w="100"/>
-              <w:bottom w:type="dxa" w:w="50"/>
-              <w:right w:type="dxa" w:w="100"/>
-            </w:tcMar>
-          </w:tcPr>
-          <w:p>
-            <w:r>
-              <w:rPr>
-                <w:sz w:val="19"/>
-                <w:szCs w:val="19"/>
-              </w:rPr>
-              <w:t xml:space="preserve">Enquête de satisfaction/perception client (segments, régions, canaux)</w:t>
+              <w:t xml:space="preserve">) fourni directement — pas de scraping à proprement parler.</w:t>
             </w:r>
           </w:p>
         </w:tc>
@@ -4086,7 +3482,160 @@
           <w:b/>
           <w:bCs/>
         </w:rPr>
-        <w:t xml:space="preserve">Justification technique par scraper</w:t>
+        <w:t xml:space="preserve">Le déroulé concret pour CMF</w:t>
+      </w:r>
+      <w:r>
+        <w:t xml:space="preserve"> (le scraper le plus complexe, donc le plus représentatif) : ouverture d'un Chrome invisible → sélection de la société dans le menu déroulant → lancement de la recherche → </w:t>
+      </w:r>
+      <w:r>
+        <w:rPr>
+          <w:b/>
+          <w:bCs/>
+        </w:rPr>
+        <w:t xml:space="preserve">filtrage</w:t>
+      </w:r>
+      <w:r>
+        <w:t xml:space="preserve"> (voir ci-dessous) → vérification que le lien du PDF répond → </w:t>
+      </w:r>
+      <w:r>
+        <w:rPr>
+          <w:b/>
+          <w:bCs/>
+        </w:rPr>
+        <w:t xml:space="preserve">déduplication</w:t>
+      </w:r>
+      <w:r>
+        <w:t xml:space="preserve"> (voir ci-dessous) → enregistrement en base des métadonnées seulement (jamais le PDF lui-même, il sera re-téléchargé à la demande). En cas d'échec en cours de route, le programme relance tout depuis le début (jusqu'à 3 fois) plutôt que de reprendre au milieu — un plantage en cours de route laisse le navigateur dans un état difficile à récupérer proprement.</w:t>
+      </w:r>
+    </w:p>
+    <w:p>
+      <w:pPr>
+        <w:spacing w:after="140"/>
+      </w:pPr>
+      <w:r>
+        <w:rPr>
+          <w:b/>
+          <w:bCs/>
+        </w:rPr>
+        <w:t xml:space="preserve">Filtrage</w:t>
+      </w:r>
+      <w:r>
+        <w:t xml:space="preserve"> : parmi tous les documents qu'une source propose, ne garder que ceux qui sont réellement pertinents. Le critère exact dépend de la source — exemple concret pour CMF ci-dessous.</w:t>
+      </w:r>
+    </w:p>
+    <w:p>
+      <w:pPr>
+        <w:spacing w:after="100" w:before="100"/>
+        <w:jc w:val="center"/>
+      </w:pPr>
+      <w:r>
+        <w:drawing>
+          <wp:inline distT="0" distB="0" distL="0" distR="0">
+            <wp:extent cx="6191250" cy="3819525"/>
+            <wp:effectExtent t="0" r="0" b="0" l="0"/>
+            <wp:docPr id="1" name="" descr="" title=""/>
+            <wp:cNvGraphicFramePr>
+              <a:graphicFrameLocks xmlns:a="http://schemas.openxmlformats.org/drawingml/2006/main" noChangeAspect="1"/>
+            </wp:cNvGraphicFramePr>
+            <a:graphic xmlns:a="http://schemas.openxmlformats.org/drawingml/2006/main">
+              <a:graphicData uri="http://schemas.openxmlformats.org/drawingml/2006/picture">
+                <pic:pic xmlns:pic="http://schemas.openxmlformats.org/drawingml/2006/picture">
+                  <pic:nvPicPr>
+                    <pic:cNvPr id="0" name="" descr=""/>
+                    <pic:cNvPicPr>
+                      <a:picLocks noChangeAspect="1" noChangeArrowheads="1"/>
+                    </pic:cNvPicPr>
+                  </pic:nvPicPr>
+                  <pic:blipFill>
+                    <a:blip r:embed="rId8" cstate="none"/>
+                    <a:srcRect/>
+                    <a:stretch>
+                      <a:fillRect/>
+                    </a:stretch>
+                  </pic:blipFill>
+                  <pic:spPr bwMode="auto">
+                    <a:xfrm>
+                      <a:off x="0" y="0"/>
+                      <a:ext cx="6191250" cy="3819525"/>
+                    </a:xfrm>
+                    <a:prstGeom prst="rect">
+                      <a:avLst/>
+                    </a:prstGeom>
+                  </pic:spPr>
+                </pic:pic>
+              </a:graphicData>
+            </a:graphic>
+          </wp:inline>
+        </w:drawing>
+      </w:r>
+    </w:p>
+    <w:p>
+      <w:pPr>
+        <w:spacing w:after="160"/>
+        <w:jc w:val="center"/>
+      </w:pPr>
+      <w:r>
+        <w:rPr>
+          <w:i/>
+          <w:iCs/>
+          <w:color w:val="777777"/>
+          <w:sz w:val="17"/>
+          <w:szCs w:val="17"/>
+        </w:rPr>
+        <w:t xml:space="preserve">Exemple de filtrage — cas du scraper CMF</w:t>
+      </w:r>
+    </w:p>
+    <w:p>
+      <w:pPr>
+        <w:spacing w:after="140"/>
+      </w:pPr>
+      <w:r>
+        <w:rPr>
+          <w:b/>
+          <w:bCs/>
+        </w:rPr>
+        <w:t xml:space="preserve">Déduplication</w:t>
+      </w:r>
+      <w:r>
+        <w:t xml:space="preserve"> : avant d'enregistrer un document, le programme vérifie dans la base de données si un document identique (même société, même source, même année) existe déjà. Si oui, rien n'est fait ; si non, il est enregistré. Ça évite qu'un même rapport soit dupliqué en base à chaque passage du scraper.</w:t>
+      </w:r>
+    </w:p>
+    <w:p>
+      <w:pPr>
+        <w:spacing w:after="140"/>
+      </w:pPr>
+      <w:r>
+        <w:rPr>
+          <w:b/>
+          <w:bCs/>
+        </w:rPr>
+        <w:t xml:space="preserve">Résilience réseau</w:t>
+      </w:r>
+      <w:r>
+        <w:t xml:space="preserve"> : tous les scrapers </w:t>
+      </w:r>
+      <w:r>
+        <w:rPr>
+          <w:rFonts w:ascii="Consolas" w:cs="Consolas" w:eastAsia="Consolas" w:hAnsi="Consolas"/>
+          <w:sz w:val="20"/>
+          <w:szCs w:val="20"/>
+        </w:rPr>
+        <w:t xml:space="preserve">requests</w:t>
+      </w:r>
+      <w:r>
+        <w:t xml:space="preserve"> partagent un mécanisme de nouvelle tentative (3 essais, pause de 1,5 seconde entre chaque) car les sites cibles répondent parfois par un simple délai d'attente dépassé sans raison particulière.</w:t>
+      </w:r>
+    </w:p>
+    <w:p>
+      <w:pPr>
+        <w:spacing w:after="140"/>
+      </w:pPr>
+      <w:r>
+        <w:rPr>
+          <w:b/>
+          <w:bCs/>
+        </w:rPr>
+        <w:t xml:space="preserve">Détails propres à certaines sources</w:t>
       </w:r>
       <w:r>
         <w:t xml:space="preserve"> :</w:t>
@@ -4106,32 +3655,31 @@
           <w:b/>
           <w:bCs/>
         </w:rPr>
-        <w:t xml:space="preserve">Selenium pour CMF uniquement</w:t>
-      </w:r>
-      <w:r>
-        <w:t xml:space="preserve"> : le sélecteur de société est un widget JavaScript dynamique (plugin "Chosen" Drupal) — un simple </w:t>
-      </w:r>
-      <w:r>
-        <w:rPr>
-          <w:rFonts w:ascii="Consolas" w:cs="Consolas" w:eastAsia="Consolas" w:hAnsi="Consolas"/>
-          <w:sz w:val="20"/>
-          <w:szCs w:val="20"/>
-        </w:rPr>
-        <w:t xml:space="preserve">requests</w:t>
-      </w:r>
-      <w:r>
-        <w:t xml:space="preserve">+regex ne peut pas interagir avec un composant rendu côté client. Repli sur le </w:t>
-      </w:r>
-      <w:r>
-        <w:rPr>
-          <w:rFonts w:ascii="Consolas" w:cs="Consolas" w:eastAsia="Consolas" w:hAnsi="Consolas"/>
-          <w:sz w:val="20"/>
-          <w:szCs w:val="20"/>
-        </w:rPr>
-        <w:t xml:space="preserve">&lt;select&gt;</w:t>
-      </w:r>
-      <w:r>
-        <w:t xml:space="preserve"> HTML natif si le widget n'a pas chargé.</w:t>
+        <w:t xml:space="preserve">FTUSA</w:t>
+      </w:r>
+      <w:r>
+        <w:t xml:space="preserve"> : l'année d'un rapport est détectée en lisant le </w:t>
+      </w:r>
+      <w:r>
+        <w:rPr>
+          <w:b/>
+          <w:bCs/>
+        </w:rPr>
+        <w:t xml:space="preserve">contenu</w:t>
+      </w:r>
+      <w:r>
+        <w:t xml:space="preserve"> du PDF plutôt que son nom de fichier — jugé trop peu fiable sur 25 ans d'archives (ex. fichiers nommés </w:t>
+      </w:r>
+      <w:r>
+        <w:rPr>
+          <w:rFonts w:ascii="Consolas" w:cs="Consolas" w:eastAsia="Consolas" w:hAnsi="Consolas"/>
+          <w:sz w:val="20"/>
+          <w:szCs w:val="20"/>
+        </w:rPr>
+        <w:t xml:space="preserve">Rapport-FTUSA-DEFINITIF.pdf</w:t>
+      </w:r>
+      <w:r>
+        <w:t xml:space="preserve">).</w:t>
       </w:r>
     </w:p>
     <w:p>
@@ -4148,10 +3696,10 @@
           <w:b/>
           <w:bCs/>
         </w:rPr>
-        <w:t xml:space="preserve">`requests`+regex pour FTUSA/CGA/BVMT/INS</w:t>
-      </w:r>
-      <w:r>
-        <w:t xml:space="preserve"> : pages HTML majoritairement statiques, plus simple/rapide/robuste que d'ouvrir un navigateur complet.</w:t>
+        <w:t xml:space="preserve">BVMT</w:t>
+      </w:r>
+      <w:r>
+        <w:t xml:space="preserve"> : la liste des sociétés cotées en bourse est découverte dynamiquement plutôt que codée en dur — évite une maintenance manuelle si une société entre ou sort de la cote.</w:t>
       </w:r>
     </w:p>
     <w:p>
@@ -4168,21 +3716,54 @@
           <w:b/>
           <w:bCs/>
         </w:rPr>
-        <w:t xml:space="preserve">Détection d'année par contenu du PDF (FTUSA)</w:t>
-      </w:r>
-      <w:r>
-        <w:t xml:space="preserve">, pas par nom de fichier — jugé "trop peu fiable sur 25 ans d'archives" (ex. fichiers nommés </w:t>
-      </w:r>
-      <w:r>
-        <w:rPr>
-          <w:rFonts w:ascii="Consolas" w:cs="Consolas" w:eastAsia="Consolas" w:hAnsi="Consolas"/>
-          <w:sz w:val="20"/>
-          <w:szCs w:val="20"/>
-        </w:rPr>
-        <w:t xml:space="preserve">Rapport-FTUSA-DEFINITIF.pdf</w:t>
-      </w:r>
-      <w:r>
-        <w:t xml:space="preserve">).</w:t>
+        <w:t xml:space="preserve">CGA / FTUSA (réglementaire)</w:t>
+      </w:r>
+      <w:r>
+        <w:t xml:space="preserve"> : ce deuxième circuit (lois, décrets, circulaires côté CGA ; codes professionnels côté FTUSA) alimente la page "Veille réglementaire", avec un cache mémoire (1h) et une détection de nouveauté propre (</w:t>
+      </w:r>
+      <w:r>
+        <w:rPr>
+          <w:rFonts w:ascii="Consolas" w:cs="Consolas" w:eastAsia="Consolas" w:hAnsi="Consolas"/>
+          <w:sz w:val="20"/>
+          <w:szCs w:val="20"/>
+        </w:rPr>
+        <w:t xml:space="preserve">actualites_vues</w:t>
+      </w:r>
+      <w:r>
+        <w:t xml:space="preserve">/</w:t>
+      </w:r>
+      <w:r>
+        <w:rPr>
+          <w:rFonts w:ascii="Consolas" w:cs="Consolas" w:eastAsia="Consolas" w:hAnsi="Consolas"/>
+          <w:sz w:val="20"/>
+          <w:szCs w:val="20"/>
+        </w:rPr>
+        <w:t xml:space="preserve">reglementation_vues</w:t>
+      </w:r>
+      <w:r>
+        <w:t xml:space="preserve">), indépendante des tables </w:t>
+      </w:r>
+      <w:r>
+        <w:rPr>
+          <w:rFonts w:ascii="Consolas" w:cs="Consolas" w:eastAsia="Consolas" w:hAnsi="Consolas"/>
+          <w:sz w:val="20"/>
+          <w:szCs w:val="20"/>
+        </w:rPr>
+        <w:t xml:space="preserve">documents</w:t>
+      </w:r>
+      <w:r>
+        <w:t xml:space="preserve">/</w:t>
+      </w:r>
+      <w:r>
+        <w:rPr>
+          <w:rFonts w:ascii="Consolas" w:cs="Consolas" w:eastAsia="Consolas" w:hAnsi="Consolas"/>
+          <w:sz w:val="20"/>
+          <w:szCs w:val="20"/>
+        </w:rPr>
+        <w:t xml:space="preserve">kpi_values</w:t>
+      </w:r>
+      <w:r>
+        <w:t xml:space="preserve"> utilisées par le reste du pipeline.</w:t>
       </w:r>
     </w:p>
     <w:p>
@@ -4199,41 +3780,21 @@
           <w:b/>
           <w:bCs/>
         </w:rPr>
-        <w:t xml:space="preserve">Découverte dynamique des sociétés cotées (BVMT)</w:t>
-      </w:r>
-      <w:r>
-        <w:t xml:space="preserve"> plutôt qu'une liste codée en dur — évite une maintenance manuelle si une société entre/sort de la cote.</w:t>
-      </w:r>
-    </w:p>
-    <w:p>
-      <w:pPr>
-        <w:pStyle w:val="ListParagraph"/>
-        <w:numPr>
-          <w:ilvl w:val="0"/>
-          <w:numId w:val="1"/>
-        </w:numPr>
-        <w:spacing w:after="80"/>
-      </w:pPr>
-      <w:r>
-        <w:rPr>
-          <w:b/>
-          <w:bCs/>
-        </w:rPr>
-        <w:t xml:space="preserve">Résilience réseau générique</w:t>
-      </w:r>
-      <w:r>
-        <w:t xml:space="preserve"> : tous les scrapers </w:t>
-      </w:r>
-      <w:r>
-        <w:rPr>
-          <w:rFonts w:ascii="Consolas" w:cs="Consolas" w:eastAsia="Consolas" w:hAnsi="Consolas"/>
-          <w:sz w:val="20"/>
-          <w:szCs w:val="20"/>
-        </w:rPr>
-        <w:t xml:space="preserve">requests</w:t>
-      </w:r>
-      <w:r>
-        <w:t xml:space="preserve"> partagent un helper de retry (3 tentatives, pause 1.5s) car les sites cibles répondent parfois par un simple timeout.</w:t>
+        <w:t xml:space="preserve">Atlas Magazine / IlBoursa</w:t>
+      </w:r>
+      <w:r>
+        <w:t xml:space="preserve"> : scraping via BeautifulSoup, exécuté en parallèle (</w:t>
+      </w:r>
+      <w:r>
+        <w:rPr>
+          <w:rFonts w:ascii="Consolas" w:cs="Consolas" w:eastAsia="Consolas" w:hAnsi="Consolas"/>
+          <w:sz w:val="20"/>
+          <w:szCs w:val="20"/>
+        </w:rPr>
+        <w:t xml:space="preserve">ThreadPoolExecutor</w:t>
+      </w:r>
+      <w:r>
+        <w:t xml:space="preserve">) pour aller plus vite ; alimentent la page Actualités, pas les KPI.</w:t>
       </w:r>
     </w:p>
     <w:p>
@@ -4247,7 +3808,7 @@
           <w:bCs/>
           <w:color w:val="555555"/>
         </w:rPr>
-        <w:t xml:space="preserve">3.2 Les 4 flux de "veille" (mécanisme séparé, </w:t>
+        <w:t xml:space="preserve">Reconnaissance automatique des sociétés — </w:t>
       </w:r>
       <w:r>
         <w:rPr>
@@ -4258,15 +3819,7 @@
           <w:sz w:val="20"/>
           <w:szCs w:val="20"/>
         </w:rPr>
-        <w:t xml:space="preserve">api/routes/veille.py</w:t>
-      </w:r>
-      <w:r>
-        <w:rPr>
-          <w:b/>
-          <w:bCs/>
-          <w:color w:val="555555"/>
-        </w:rPr>
-        <w:t xml:space="preserve">)</w:t>
+        <w:t xml:space="preserve">config/company_registry.py</w:t>
       </w:r>
     </w:p>
     <w:p>
@@ -4274,449 +3827,77 @@
         <w:spacing w:after="140"/>
       </w:pPr>
       <w:r>
-        <w:t xml:space="preserve">Ces flux </w:t>
-      </w:r>
-      <w:r>
-        <w:rPr>
-          <w:b/>
-          <w:bCs/>
-        </w:rPr>
-        <w:t xml:space="preserve">ne produisent pas de KPI</w:t>
-      </w:r>
-      <w:r>
-        <w:t xml:space="preserve"> — ils alimentent les pages Actualités et Veille réglementaire, avec un cache mémoire (TTL 1h) et une détection de nouveauté propre (</w:t>
-      </w:r>
-      <w:r>
-        <w:rPr>
-          <w:rFonts w:ascii="Consolas" w:cs="Consolas" w:eastAsia="Consolas" w:hAnsi="Consolas"/>
-          <w:sz w:val="20"/>
-          <w:szCs w:val="20"/>
-        </w:rPr>
-        <w:t xml:space="preserve">actualites_vues</w:t>
-      </w:r>
-      <w:r>
-        <w:t xml:space="preserve">/</w:t>
-      </w:r>
-      <w:r>
-        <w:rPr>
-          <w:rFonts w:ascii="Consolas" w:cs="Consolas" w:eastAsia="Consolas" w:hAnsi="Consolas"/>
-          <w:sz w:val="20"/>
-          <w:szCs w:val="20"/>
-        </w:rPr>
-        <w:t xml:space="preserve">reglementation_vues</w:t>
-      </w:r>
-      <w:r>
-        <w:t xml:space="preserve">), indépendante du pipeline KPI.</w:t>
-      </w:r>
-    </w:p>
-    <w:tbl>
-      <w:tblPr>
-        <w:tblW w:type="dxa" w:w="9746"/>
-        <w:tblBorders>
-          <w:top w:val="single" w:color="auto" w:sz="4"/>
-          <w:left w:val="single" w:color="auto" w:sz="4"/>
-          <w:bottom w:val="single" w:color="auto" w:sz="4"/>
-          <w:right w:val="single" w:color="auto" w:sz="4"/>
-          <w:insideH w:val="single" w:color="auto" w:sz="4"/>
-          <w:insideV w:val="single" w:color="auto" w:sz="4"/>
-        </w:tblBorders>
-      </w:tblPr>
-      <w:tblGrid>
-        <w:gridCol w:w="1523"/>
-        <w:gridCol w:w="2802"/>
-        <w:gridCol w:w="5421"/>
-      </w:tblGrid>
-      <w:tr>
-        <w:trPr>
-          <w:tblHeader/>
-        </w:trPr>
-        <w:tc>
-          <w:tcPr>
-            <w:tcW w:type="dxa" w:w="1523"/>
-            <w:shd w:fill="2E2E38" w:color="auto" w:val="clear"/>
-            <w:tcMar>
-              <w:top w:type="dxa" w:w="60"/>
-              <w:left w:type="dxa" w:w="100"/>
-              <w:bottom w:type="dxa" w:w="60"/>
-              <w:right w:type="dxa" w:w="100"/>
-            </w:tcMar>
-          </w:tcPr>
-          <w:p>
-            <w:r>
-              <w:rPr>
-                <w:b/>
-                <w:bCs/>
-                <w:color w:val="FFFFFF"/>
-                <w:sz w:val="19"/>
-                <w:szCs w:val="19"/>
-              </w:rPr>
-              <w:t xml:space="preserve">Flux</w:t>
-            </w:r>
-          </w:p>
-        </w:tc>
-        <w:tc>
-          <w:tcPr>
-            <w:tcW w:type="dxa" w:w="2802"/>
-            <w:shd w:fill="2E2E38" w:color="auto" w:val="clear"/>
-            <w:tcMar>
-              <w:top w:type="dxa" w:w="60"/>
-              <w:left w:type="dxa" w:w="100"/>
-              <w:bottom w:type="dxa" w:w="60"/>
-              <w:right w:type="dxa" w:w="100"/>
-            </w:tcMar>
-          </w:tcPr>
-          <w:p>
-            <w:r>
-              <w:rPr>
-                <w:b/>
-                <w:bCs/>
-                <w:color w:val="FFFFFF"/>
-                <w:sz w:val="19"/>
-                <w:szCs w:val="19"/>
-              </w:rPr>
-              <w:t xml:space="preserve">Cible</w:t>
-            </w:r>
-          </w:p>
-        </w:tc>
-        <w:tc>
-          <w:tcPr>
-            <w:tcW w:type="dxa" w:w="5421"/>
-            <w:shd w:fill="2E2E38" w:color="auto" w:val="clear"/>
-            <w:tcMar>
-              <w:top w:type="dxa" w:w="60"/>
-              <w:left w:type="dxa" w:w="100"/>
-              <w:bottom w:type="dxa" w:w="60"/>
-              <w:right w:type="dxa" w:w="100"/>
-            </w:tcMar>
-          </w:tcPr>
-          <w:p>
-            <w:r>
-              <w:rPr>
-                <w:b/>
-                <w:bCs/>
-                <w:color w:val="FFFFFF"/>
-                <w:sz w:val="19"/>
-                <w:szCs w:val="19"/>
-              </w:rPr>
-              <w:t xml:space="preserve">Nature</w:t>
-            </w:r>
-          </w:p>
-        </w:tc>
-      </w:tr>
-      <w:tr>
-        <w:tc>
-          <w:tcPr>
-            <w:tcW w:type="dxa" w:w="1523"/>
-            <w:tcMar>
-              <w:top w:type="dxa" w:w="50"/>
-              <w:left w:type="dxa" w:w="100"/>
-              <w:bottom w:type="dxa" w:w="50"/>
-              <w:right w:type="dxa" w:w="100"/>
-            </w:tcMar>
-          </w:tcPr>
-          <w:p>
-            <w:r>
-              <w:rPr>
-                <w:b/>
-                <w:bCs/>
-                <w:sz w:val="19"/>
-                <w:szCs w:val="19"/>
-              </w:rPr>
-              <w:t xml:space="preserve">IlBoursa</w:t>
-            </w:r>
-          </w:p>
-        </w:tc>
-        <w:tc>
-          <w:tcPr>
-            <w:tcW w:type="dxa" w:w="2802"/>
-            <w:tcMar>
-              <w:top w:type="dxa" w:w="50"/>
-              <w:left w:type="dxa" w:w="100"/>
-              <w:bottom w:type="dxa" w:w="50"/>
-              <w:right w:type="dxa" w:w="100"/>
-            </w:tcMar>
-          </w:tcPr>
-          <w:p>
-            <w:r>
-              <w:rPr>
-                <w:sz w:val="19"/>
-                <w:szCs w:val="19"/>
-              </w:rPr>
-              <w:t xml:space="preserve">ilboursa.com, 7 tickers boursiers codés en dur</w:t>
-            </w:r>
-          </w:p>
-        </w:tc>
-        <w:tc>
-          <w:tcPr>
-            <w:tcW w:type="dxa" w:w="5421"/>
-            <w:tcMar>
-              <w:top w:type="dxa" w:w="50"/>
-              <w:left w:type="dxa" w:w="100"/>
-              <w:bottom w:type="dxa" w:w="50"/>
-              <w:right w:type="dxa" w:w="100"/>
-            </w:tcMar>
-          </w:tcPr>
-          <w:p>
-            <w:r>
-              <w:rPr>
-                <w:sz w:val="19"/>
-                <w:szCs w:val="19"/>
-              </w:rPr>
-              <w:t xml:space="preserve">Actualités/cotations des compagnies cotées en bourse</w:t>
-            </w:r>
-          </w:p>
-        </w:tc>
-      </w:tr>
-      <w:tr>
-        <w:tc>
-          <w:tcPr>
-            <w:tcW w:type="dxa" w:w="1523"/>
-            <w:tcMar>
-              <w:top w:type="dxa" w:w="50"/>
-              <w:left w:type="dxa" w:w="100"/>
-              <w:bottom w:type="dxa" w:w="50"/>
-              <w:right w:type="dxa" w:w="100"/>
-            </w:tcMar>
-          </w:tcPr>
-          <w:p>
-            <w:r>
-              <w:rPr>
-                <w:b/>
-                <w:bCs/>
-                <w:sz w:val="19"/>
-                <w:szCs w:val="19"/>
-              </w:rPr>
-              <w:t xml:space="preserve">Atlas Magazine</w:t>
-            </w:r>
-          </w:p>
-        </w:tc>
-        <w:tc>
-          <w:tcPr>
-            <w:tcW w:type="dxa" w:w="2802"/>
-            <w:tcMar>
-              <w:top w:type="dxa" w:w="50"/>
-              <w:left w:type="dxa" w:w="100"/>
-              <w:bottom w:type="dxa" w:w="50"/>
-              <w:right w:type="dxa" w:w="100"/>
-            </w:tcMar>
-          </w:tcPr>
-          <w:p>
-            <w:r>
-              <w:rPr>
-                <w:sz w:val="19"/>
-                <w:szCs w:val="19"/>
-              </w:rPr>
-              <w:t xml:space="preserve">atlas-mag.net/fr/news/tunisia</w:t>
-            </w:r>
-          </w:p>
-        </w:tc>
-        <w:tc>
-          <w:tcPr>
-            <w:tcW w:type="dxa" w:w="5421"/>
-            <w:tcMar>
-              <w:top w:type="dxa" w:w="50"/>
-              <w:left w:type="dxa" w:w="100"/>
-              <w:bottom w:type="dxa" w:w="50"/>
-              <w:right w:type="dxa" w:w="100"/>
-            </w:tcMar>
-          </w:tcPr>
-          <w:p>
-            <w:r>
-              <w:rPr>
-                <w:sz w:val="19"/>
-                <w:szCs w:val="19"/>
-              </w:rPr>
-              <w:t xml:space="preserve">Actualités sectorielles assurance Tunisie/Afrique</w:t>
-            </w:r>
-          </w:p>
-        </w:tc>
-      </w:tr>
-      <w:tr>
-        <w:tc>
-          <w:tcPr>
-            <w:tcW w:type="dxa" w:w="1523"/>
-            <w:tcMar>
-              <w:top w:type="dxa" w:w="50"/>
-              <w:left w:type="dxa" w:w="100"/>
-              <w:bottom w:type="dxa" w:w="50"/>
-              <w:right w:type="dxa" w:w="100"/>
-            </w:tcMar>
-          </w:tcPr>
-          <w:p>
-            <w:r>
-              <w:rPr>
-                <w:b/>
-                <w:bCs/>
-                <w:sz w:val="19"/>
-                <w:szCs w:val="19"/>
-              </w:rPr>
-              <w:t xml:space="preserve">CGA (réglementaire)</w:t>
-            </w:r>
-          </w:p>
-        </w:tc>
-        <w:tc>
-          <w:tcPr>
-            <w:tcW w:type="dxa" w:w="2802"/>
-            <w:tcMar>
-              <w:top w:type="dxa" w:w="50"/>
-              <w:left w:type="dxa" w:w="100"/>
-              <w:bottom w:type="dxa" w:w="50"/>
-              <w:right w:type="dxa" w:w="100"/>
-            </w:tcMar>
-          </w:tcPr>
-          <w:p>
-            <w:r>
-              <w:rPr>
-                <w:sz w:val="19"/>
-                <w:szCs w:val="19"/>
-              </w:rPr>
-              <w:t xml:space="preserve">cga.gov.tn</w:t>
-            </w:r>
-          </w:p>
-        </w:tc>
-        <w:tc>
-          <w:tcPr>
-            <w:tcW w:type="dxa" w:w="5421"/>
-            <w:tcMar>
-              <w:top w:type="dxa" w:w="50"/>
-              <w:left w:type="dxa" w:w="100"/>
-              <w:bottom w:type="dxa" w:w="50"/>
-              <w:right w:type="dxa" w:w="100"/>
-            </w:tcMar>
-          </w:tcPr>
-          <w:p>
-            <w:r>
-              <w:rPr>
-                <w:sz w:val="19"/>
-                <w:szCs w:val="19"/>
-              </w:rPr>
-              <w:t xml:space="preserve">Textes légaux (lois, décrets, circulaires) — distinct des rapports KPI du même régulateur</w:t>
-            </w:r>
-          </w:p>
-        </w:tc>
-      </w:tr>
-      <w:tr>
-        <w:tc>
-          <w:tcPr>
-            <w:tcW w:type="dxa" w:w="1523"/>
-            <w:tcMar>
-              <w:top w:type="dxa" w:w="50"/>
-              <w:left w:type="dxa" w:w="100"/>
-              <w:bottom w:type="dxa" w:w="50"/>
-              <w:right w:type="dxa" w:w="100"/>
-            </w:tcMar>
-          </w:tcPr>
-          <w:p>
-            <w:r>
-              <w:rPr>
-                <w:b/>
-                <w:bCs/>
-                <w:sz w:val="19"/>
-                <w:szCs w:val="19"/>
-              </w:rPr>
-              <w:t xml:space="preserve">FTUSA (réglementaire)</w:t>
-            </w:r>
-          </w:p>
-        </w:tc>
-        <w:tc>
-          <w:tcPr>
-            <w:tcW w:type="dxa" w:w="2802"/>
-            <w:tcMar>
-              <w:top w:type="dxa" w:w="50"/>
-              <w:left w:type="dxa" w:w="100"/>
-              <w:bottom w:type="dxa" w:w="50"/>
-              <w:right w:type="dxa" w:w="100"/>
-            </w:tcMar>
-          </w:tcPr>
-          <w:p>
-            <w:r>
-              <w:rPr>
-                <w:sz w:val="19"/>
-                <w:szCs w:val="19"/>
-              </w:rPr>
-              <w:t xml:space="preserve">ftusanet.org</w:t>
-            </w:r>
-          </w:p>
-        </w:tc>
-        <w:tc>
-          <w:tcPr>
-            <w:tcW w:type="dxa" w:w="5421"/>
-            <w:tcMar>
-              <w:top w:type="dxa" w:w="50"/>
-              <w:left w:type="dxa" w:w="100"/>
-              <w:bottom w:type="dxa" w:w="50"/>
-              <w:right w:type="dxa" w:w="100"/>
-            </w:tcMar>
-          </w:tcPr>
-          <w:p>
-            <w:r>
-              <w:rPr>
-                <w:sz w:val="19"/>
-                <w:szCs w:val="19"/>
-              </w:rPr>
-              <w:t xml:space="preserve">Codes et textes professionnels</w:t>
-            </w:r>
-          </w:p>
-        </w:tc>
-      </w:tr>
-    </w:tbl>
-    <w:p>
-      <w:pPr>
-        <w:spacing w:after="160"/>
-      </w:pPr>
+        <w:t xml:space="preserve">Problème concret : quand un scraper lit un nom sur un site (ex. "Assurances Maghrebia Vie"), comment reconnaître automatiquement qu'il s'agit du code interne </w:t>
+      </w:r>
+      <w:r>
+        <w:rPr>
+          <w:rFonts w:ascii="Consolas" w:cs="Consolas" w:eastAsia="Consolas" w:hAnsi="Consolas"/>
+          <w:sz w:val="20"/>
+          <w:szCs w:val="20"/>
+        </w:rPr>
+        <w:t xml:space="preserve">MAGHREBIA_VIE</w:t>
+      </w:r>
+      <w:r>
+        <w:t xml:space="preserve"> et pas de </w:t>
+      </w:r>
+      <w:r>
+        <w:rPr>
+          <w:rFonts w:ascii="Consolas" w:cs="Consolas" w:eastAsia="Consolas" w:hAnsi="Consolas"/>
+          <w:sz w:val="20"/>
+          <w:szCs w:val="20"/>
+        </w:rPr>
+        <w:t xml:space="preserve">MAGHREBIA</w:t>
+      </w:r>
+      <w:r>
+        <w:t xml:space="preserve"> (la maison-mère) ?</w:t>
+      </w:r>
     </w:p>
     <w:p>
       <w:pPr>
         <w:spacing w:after="140"/>
       </w:pPr>
       <w:r>
-        <w:t xml:space="preserve">Scraping via </w:t>
-      </w:r>
-      <w:r>
-        <w:rPr>
-          <w:b/>
-          <w:bCs/>
-        </w:rPr>
-        <w:t xml:space="preserve">BeautifulSoup</w:t>
-      </w:r>
-      <w:r>
-        <w:t xml:space="preserve"> + </w:t>
-      </w:r>
-      <w:r>
-        <w:rPr>
-          <w:rFonts w:ascii="Consolas" w:cs="Consolas" w:eastAsia="Consolas" w:hAnsi="Consolas"/>
-          <w:sz w:val="20"/>
-          <w:szCs w:val="20"/>
-        </w:rPr>
-        <w:t xml:space="preserve">ThreadPoolExecutor(max_workers=8)</w:t>
-      </w:r>
-      <w:r>
-        <w:t xml:space="preserve"> (paralléliser la récupération d'image/résumé par article).</w:t>
-      </w:r>
-    </w:p>
-    <w:p>
-      <w:pPr>
-        <w:pStyle w:val="Heading2"/>
-        <w:spacing w:after="140" w:before="280"/>
-      </w:pPr>
-      <w:r>
-        <w:rPr>
-          <w:b/>
-          <w:bCs/>
-          <w:color w:val="555555"/>
-        </w:rPr>
-        <w:t xml:space="preserve">3.3 Reconnaissance des sociétés — </w:t>
-      </w:r>
-      <w:r>
-        <w:rPr>
-          <w:rFonts w:ascii="Consolas" w:cs="Consolas" w:eastAsia="Consolas" w:hAnsi="Consolas"/>
-          <w:b/>
-          <w:bCs/>
-          <w:color w:val="555555"/>
-          <w:sz w:val="20"/>
-          <w:szCs w:val="20"/>
-        </w:rPr>
-        <w:t xml:space="preserve">config/company_registry.py</w:t>
+        <w:rPr>
+          <w:rFonts w:ascii="Consolas" w:cs="Consolas" w:eastAsia="Consolas" w:hAnsi="Consolas"/>
+          <w:sz w:val="20"/>
+          <w:szCs w:val="20"/>
+        </w:rPr>
+        <w:t xml:space="preserve">COMPANY_REGISTRY</w:t>
+      </w:r>
+      <w:r>
+        <w:t xml:space="preserve"> (24 sociétés, </w:t>
+      </w:r>
+      <w:r>
+        <w:rPr>
+          <w:rFonts w:ascii="Consolas" w:cs="Consolas" w:eastAsia="Consolas" w:hAnsi="Consolas"/>
+          <w:sz w:val="20"/>
+          <w:szCs w:val="20"/>
+        </w:rPr>
+        <w:t xml:space="preserve">{cmf_name, aliases}</w:t>
+      </w:r>
+      <w:r>
+        <w:t xml:space="preserve">) + </w:t>
+      </w:r>
+      <w:r>
+        <w:rPr>
+          <w:rFonts w:ascii="Consolas" w:cs="Consolas" w:eastAsia="Consolas" w:hAnsi="Consolas"/>
+          <w:sz w:val="20"/>
+          <w:szCs w:val="20"/>
+        </w:rPr>
+        <w:t xml:space="preserve">find_code_by_name()</w:t>
+      </w:r>
+      <w:r>
+        <w:t xml:space="preserve"> : rapprochement par </w:t>
+      </w:r>
+      <w:r>
+        <w:rPr>
+          <w:b/>
+          <w:bCs/>
+        </w:rPr>
+        <w:t xml:space="preserve">similarité de Jaccard pondérée</w:t>
+      </w:r>
+      <w:r>
+        <w:t xml:space="preserve"> — chaque mot d'un alias est pondéré par l'inverse du nombre de sociétés qui le partagent. Un mot générique comme "ASSURANCES" (présent dans presque tous les noms) compte très peu ; un mot rare et distinctif comme "VIE" ou "MAGHREBIA" compte beaucoup plus. Sans cette pondération, deux sociétés au nom proche obtiendraient un score de correspondance quasi identique face à un même texte source.</w:t>
       </w:r>
     </w:p>
     <w:p>
@@ -4724,47 +3905,7 @@
         <w:spacing w:after="140"/>
       </w:pPr>
       <w:r>
-        <w:rPr>
-          <w:rFonts w:ascii="Consolas" w:cs="Consolas" w:eastAsia="Consolas" w:hAnsi="Consolas"/>
-          <w:sz w:val="20"/>
-          <w:szCs w:val="20"/>
-        </w:rPr>
-        <w:t xml:space="preserve">COMPANY_REGISTRY</w:t>
-      </w:r>
-      <w:r>
-        <w:t xml:space="preserve"> (24 sociétés, </w:t>
-      </w:r>
-      <w:r>
-        <w:rPr>
-          <w:rFonts w:ascii="Consolas" w:cs="Consolas" w:eastAsia="Consolas" w:hAnsi="Consolas"/>
-          <w:sz w:val="20"/>
-          <w:szCs w:val="20"/>
-        </w:rPr>
-        <w:t xml:space="preserve">{cmf_name, aliases}</w:t>
-      </w:r>
-      <w:r>
-        <w:t xml:space="preserve">) + </w:t>
-      </w:r>
-      <w:r>
-        <w:rPr>
-          <w:rFonts w:ascii="Consolas" w:cs="Consolas" w:eastAsia="Consolas" w:hAnsi="Consolas"/>
-          <w:sz w:val="20"/>
-          <w:szCs w:val="20"/>
-        </w:rPr>
-        <w:t xml:space="preserve">find_code_by_name()</w:t>
-      </w:r>
-      <w:r>
-        <w:t xml:space="preserve"> : rapprochement par </w:t>
-      </w:r>
-      <w:r>
-        <w:rPr>
-          <w:b/>
-          <w:bCs/>
-        </w:rPr>
-        <w:t xml:space="preserve">similarité de Jaccard pondérée</w:t>
-      </w:r>
-      <w:r>
-        <w:t xml:space="preserve"> — chaque mot d'un alias est pondéré par l'inverse du nombre de sociétés qui le partagent (un mot rare comme "VIE" compte plus qu'un mot générique comme "ASSURANCES"), avec une liste de stopwords français. Corrige un bug réel où "El Amana Takaful" matchait à tort "AMI" (alias "El Ittihad") sur le seul mot commun "EL".</w:t>
+        <w:t xml:space="preserve">Bug réel corrigé grâce à cette pondération : "El Amana Takaful" était mal reconnu et confondu avec la société "AMI" (dont un alias est "El Ittihad") — les deux ne partageaient que le mot "EL", bien trop générique pour être un indice de correspondance fiable.</w:t>
       </w:r>
     </w:p>
     <w:p>

</xml_diff>

<commit_message>
Ajoute des captures de code reel a la Partie 2 (Scraping)
Deux extraits authentiques de scraping/cmf_portal_scraper.py rendus en
style capture d'ecran (mecanisme de nouvelle tentative run(), et
deduplication/enregistrement extract_and_store()), avec numeros de ligne
reels et explication du code juste au-dessus dans la fiche. Etablit le
gabarit a reutiliser pour chaque partie suivante.

Co-Authored-By: Claude Sonnet 5 <noreply@anthropic.com>
</commit_message>
<xml_diff>
--- a/docs/Fiche_Technique_Barometre_Assurance.docx
+++ b/docs/Fiche_Technique_Barometre_Assurance.docx
@@ -3517,10 +3517,10 @@
           <w:b/>
           <w:bCs/>
         </w:rPr>
-        <w:t xml:space="preserve">Filtrage</w:t>
-      </w:r>
-      <w:r>
-        <w:t xml:space="preserve"> : parmi tous les documents qu'une source propose, ne garder que ceux qui sont réellement pertinents. Le critère exact dépend de la source — exemple concret pour CMF ci-dessous.</w:t>
+        <w:t xml:space="preserve">Extrait de code réel — `scraping/cmf_portal_scraper.py`, méthode `run()` (lignes 310-328)</w:t>
+      </w:r>
+      <w:r>
+        <w:t xml:space="preserve"> : c'est exactement ce mécanisme de nouvelle tentative complète, pas juste de l'étape en échec.</w:t>
       </w:r>
     </w:p>
     <w:p>
@@ -3531,7 +3531,7 @@
       <w:r>
         <w:drawing>
           <wp:inline distT="0" distB="0" distL="0" distR="0">
-            <wp:extent cx="6191250" cy="3819525"/>
+            <wp:extent cx="6191250" cy="3324225"/>
             <wp:effectExtent t="0" r="0" b="0" l="0"/>
             <wp:docPr id="1" name="" descr="" title=""/>
             <wp:cNvGraphicFramePr>
@@ -3556,6 +3556,83 @@
                   <pic:spPr bwMode="auto">
                     <a:xfrm>
                       <a:off x="0" y="0"/>
+                      <a:ext cx="6191250" cy="3324225"/>
+                    </a:xfrm>
+                    <a:prstGeom prst="rect">
+                      <a:avLst/>
+                    </a:prstGeom>
+                  </pic:spPr>
+                </pic:pic>
+              </a:graphicData>
+            </a:graphic>
+          </wp:inline>
+        </w:drawing>
+      </w:r>
+    </w:p>
+    <w:p>
+      <w:pPr>
+        <w:spacing w:after="160"/>
+        <w:jc w:val="center"/>
+      </w:pPr>
+      <w:r>
+        <w:rPr>
+          <w:i/>
+          <w:iCs/>
+          <w:color w:val="777777"/>
+          <w:sz w:val="17"/>
+          <w:szCs w:val="17"/>
+        </w:rPr>
+        <w:t xml:space="preserve">Code réel du mécanisme de nouvelle tentative</w:t>
+      </w:r>
+    </w:p>
+    <w:p>
+      <w:pPr>
+        <w:spacing w:after="140"/>
+      </w:pPr>
+      <w:r>
+        <w:rPr>
+          <w:b/>
+          <w:bCs/>
+        </w:rPr>
+        <w:t xml:space="preserve">Filtrage</w:t>
+      </w:r>
+      <w:r>
+        <w:t xml:space="preserve"> : parmi tous les documents qu'une source propose, ne garder que ceux qui sont réellement pertinents. Le critère exact dépend de la source — exemple concret pour CMF ci-dessous.</w:t>
+      </w:r>
+    </w:p>
+    <w:p>
+      <w:pPr>
+        <w:spacing w:after="100" w:before="100"/>
+        <w:jc w:val="center"/>
+      </w:pPr>
+      <w:r>
+        <w:drawing>
+          <wp:inline distT="0" distB="0" distL="0" distR="0">
+            <wp:extent cx="6191250" cy="3819525"/>
+            <wp:effectExtent t="0" r="0" b="0" l="0"/>
+            <wp:docPr id="1" name="" descr="" title=""/>
+            <wp:cNvGraphicFramePr>
+              <a:graphicFrameLocks xmlns:a="http://schemas.openxmlformats.org/drawingml/2006/main" noChangeAspect="1"/>
+            </wp:cNvGraphicFramePr>
+            <a:graphic xmlns:a="http://schemas.openxmlformats.org/drawingml/2006/main">
+              <a:graphicData uri="http://schemas.openxmlformats.org/drawingml/2006/picture">
+                <pic:pic xmlns:pic="http://schemas.openxmlformats.org/drawingml/2006/picture">
+                  <pic:nvPicPr>
+                    <pic:cNvPr id="0" name="" descr=""/>
+                    <pic:cNvPicPr>
+                      <a:picLocks noChangeAspect="1" noChangeArrowheads="1"/>
+                    </pic:cNvPicPr>
+                  </pic:nvPicPr>
+                  <pic:blipFill>
+                    <a:blip r:embed="rId9" cstate="none"/>
+                    <a:srcRect/>
+                    <a:stretch>
+                      <a:fillRect/>
+                    </a:stretch>
+                  </pic:blipFill>
+                  <pic:spPr bwMode="auto">
+                    <a:xfrm>
+                      <a:off x="0" y="0"/>
                       <a:ext cx="6191250" cy="3819525"/>
                     </a:xfrm>
                     <a:prstGeom prst="rect">
@@ -3598,6 +3675,105 @@
       </w:r>
       <w:r>
         <w:t xml:space="preserve"> : avant d'enregistrer un document, le programme vérifie dans la base de données si un document identique (même société, même source, même année) existe déjà. Si oui, rien n'est fait ; si non, il est enregistré. Ça évite qu'un même rapport soit dupliqué en base à chaque passage du scraper.</w:t>
+      </w:r>
+    </w:p>
+    <w:p>
+      <w:pPr>
+        <w:spacing w:after="140"/>
+      </w:pPr>
+      <w:r>
+        <w:rPr>
+          <w:b/>
+          <w:bCs/>
+        </w:rPr>
+        <w:t xml:space="preserve">Extrait de code réel — `scraping/cmf_portal_scraper.py`, méthode `extract_and_store()` (lignes 281-298)</w:t>
+      </w:r>
+      <w:r>
+        <w:t xml:space="preserve"> : </w:t>
+      </w:r>
+      <w:r>
+        <w:rPr>
+          <w:rFonts w:ascii="Consolas" w:cs="Consolas" w:eastAsia="Consolas" w:hAnsi="Consolas"/>
+          <w:sz w:val="20"/>
+          <w:szCs w:val="20"/>
+        </w:rPr>
+        <w:t xml:space="preserve">document_exists()</w:t>
+      </w:r>
+      <w:r>
+        <w:t xml:space="preserve"> (ligne 289) est l'appel qui fait exactement cette vérification ; </w:t>
+      </w:r>
+      <w:r>
+        <w:rPr>
+          <w:rFonts w:ascii="Consolas" w:cs="Consolas" w:eastAsia="Consolas" w:hAnsi="Consolas"/>
+          <w:sz w:val="20"/>
+          <w:szCs w:val="20"/>
+        </w:rPr>
+        <w:t xml:space="preserve">save_document()</w:t>
+      </w:r>
+      <w:r>
+        <w:t xml:space="preserve"> (ligne 296) n'enregistre que le nom, l'année et le lien — jamais le fichier PDF.</w:t>
+      </w:r>
+    </w:p>
+    <w:p>
+      <w:pPr>
+        <w:spacing w:after="100" w:before="100"/>
+        <w:jc w:val="center"/>
+      </w:pPr>
+      <w:r>
+        <w:drawing>
+          <wp:inline distT="0" distB="0" distL="0" distR="0">
+            <wp:extent cx="6191250" cy="3228975"/>
+            <wp:effectExtent t="0" r="0" b="0" l="0"/>
+            <wp:docPr id="1" name="" descr="" title=""/>
+            <wp:cNvGraphicFramePr>
+              <a:graphicFrameLocks xmlns:a="http://schemas.openxmlformats.org/drawingml/2006/main" noChangeAspect="1"/>
+            </wp:cNvGraphicFramePr>
+            <a:graphic xmlns:a="http://schemas.openxmlformats.org/drawingml/2006/main">
+              <a:graphicData uri="http://schemas.openxmlformats.org/drawingml/2006/picture">
+                <pic:pic xmlns:pic="http://schemas.openxmlformats.org/drawingml/2006/picture">
+                  <pic:nvPicPr>
+                    <pic:cNvPr id="0" name="" descr=""/>
+                    <pic:cNvPicPr>
+                      <a:picLocks noChangeAspect="1" noChangeArrowheads="1"/>
+                    </pic:cNvPicPr>
+                  </pic:nvPicPr>
+                  <pic:blipFill>
+                    <a:blip r:embed="rId10" cstate="none"/>
+                    <a:srcRect/>
+                    <a:stretch>
+                      <a:fillRect/>
+                    </a:stretch>
+                  </pic:blipFill>
+                  <pic:spPr bwMode="auto">
+                    <a:xfrm>
+                      <a:off x="0" y="0"/>
+                      <a:ext cx="6191250" cy="3228975"/>
+                    </a:xfrm>
+                    <a:prstGeom prst="rect">
+                      <a:avLst/>
+                    </a:prstGeom>
+                  </pic:spPr>
+                </pic:pic>
+              </a:graphicData>
+            </a:graphic>
+          </wp:inline>
+        </w:drawing>
+      </w:r>
+    </w:p>
+    <w:p>
+      <w:pPr>
+        <w:spacing w:after="160"/>
+        <w:jc w:val="center"/>
+      </w:pPr>
+      <w:r>
+        <w:rPr>
+          <w:i/>
+          <w:iCs/>
+          <w:color w:val="777777"/>
+          <w:sz w:val="17"/>
+          <w:szCs w:val="17"/>
+        </w:rPr>
+        <w:t xml:space="preserve">Code réel de la déduplication et de l'enregistrement</w:t>
       </w:r>
     </w:p>
     <w:p>

</xml_diff>

<commit_message>
Fusionne le plan et la fiche technique en un seul document Word
Le plan (10 parties + sous-parties + statut) ouvre desormais le meme
fichier que le contenu detaille, separes par un saut de page, au lieu
de deux fichiers distincts a maintenir en parallele.

Co-Authored-By: Claude Sonnet 5 <noreply@anthropic.com>
</commit_message>
<xml_diff>
--- a/docs/Fiche_Technique_Barometre_Assurance.docx
+++ b/docs/Fiche_Technique_Barometre_Assurance.docx
@@ -2,6 +2,2066 @@
 <file path=word/document.xml><?xml version="1.0" encoding="utf-8"?>
 <w:document xmlns:wpc="http://schemas.microsoft.com/office/word/2010/wordprocessingCanvas" xmlns:mc="http://schemas.openxmlformats.org/markup-compatibility/2006" xmlns:o="urn:schemas-microsoft-com:office:office" xmlns:r="http://schemas.openxmlformats.org/officeDocument/2006/relationships" xmlns:m="http://schemas.openxmlformats.org/officeDocument/2006/math" xmlns:v="urn:schemas-microsoft-com:vml" xmlns:wp14="http://schemas.microsoft.com/office/word/2010/wordprocessingDrawing" xmlns:wp="http://schemas.openxmlformats.org/drawingml/2006/wordprocessingDrawing" xmlns:w10="urn:schemas-microsoft-com:office:word" xmlns:w="http://schemas.openxmlformats.org/wordprocessingml/2006/main" xmlns:w14="http://schemas.microsoft.com/office/word/2010/wordml" xmlns:w15="http://schemas.microsoft.com/office/word/2012/wordml" xmlns:wpg="http://schemas.microsoft.com/office/word/2010/wordprocessingGroup" xmlns:wpi="http://schemas.microsoft.com/office/word/2010/wordprocessingInk" xmlns:wne="http://schemas.microsoft.com/office/word/2006/wordml" xmlns:wps="http://schemas.microsoft.com/office/word/2010/wordprocessingShape" xmlns:cx="http://schemas.microsoft.com/office/drawing/2014/chartex" xmlns:cx1="http://schemas.microsoft.com/office/drawing/2015/9/8/chartex" xmlns:cx2="http://schemas.microsoft.com/office/drawing/2015/10/21/chartex" xmlns:cx3="http://schemas.microsoft.com/office/drawing/2016/5/9/chartex" xmlns:cx4="http://schemas.microsoft.com/office/drawing/2016/5/10/chartex" xmlns:cx5="http://schemas.microsoft.com/office/drawing/2016/5/11/chartex" xmlns:cx6="http://schemas.microsoft.com/office/drawing/2016/5/12/chartex" xmlns:cx7="http://schemas.microsoft.com/office/drawing/2016/5/13/chartex" xmlns:cx8="http://schemas.microsoft.com/office/drawing/2016/5/14/chartex" xmlns:aink="http://schemas.microsoft.com/office/drawing/2016/ink" xmlns:am3d="http://schemas.microsoft.com/office/drawing/2017/model3d" xmlns:w16cex="http://schemas.microsoft.com/office/word/2018/wordml/cex" xmlns:w16cid="http://schemas.microsoft.com/office/word/2016/wordml/cid" xmlns:w16="http://schemas.microsoft.com/office/word/2018/wordml" xmlns:w16sdtdh="http://schemas.microsoft.com/office/word/2020/wordml/sdtdatahash" xmlns:w16se="http://schemas.microsoft.com/office/word/2015/wordml/symex" mc:Ignorable="w14 w15 wp14">
   <w:body>
+    <w:p>
+      <w:pPr>
+        <w:spacing w:after="40"/>
+        <w:jc w:val="center"/>
+      </w:pPr>
+      <w:r>
+        <w:rPr>
+          <w:rFonts w:ascii="Calibri" w:cs="Calibri" w:eastAsia="Calibri" w:hAnsi="Calibri"/>
+          <w:b/>
+          <w:bCs/>
+          <w:color w:val="2E2E38"/>
+          <w:sz w:val="40"/>
+          <w:szCs w:val="40"/>
+        </w:rPr>
+        <w:t xml:space="preserve">PLAN DE LA FICHE TECHNIQUE</w:t>
+      </w:r>
+    </w:p>
+    <w:p>
+      <w:pPr>
+        <w:pBdr>
+          <w:bottom w:val="single" w:color="FFE600" w:sz="24" w:space="8"/>
+        </w:pBdr>
+        <w:spacing w:after="40"/>
+        <w:jc w:val="center"/>
+      </w:pPr>
+      <w:r>
+        <w:rPr>
+          <w:rFonts w:ascii="Calibri" w:cs="Calibri" w:eastAsia="Calibri" w:hAnsi="Calibri"/>
+          <w:b/>
+          <w:bCs/>
+          <w:color w:val="747480"/>
+          <w:sz w:val="24"/>
+          <w:szCs w:val="24"/>
+        </w:rPr>
+        <w:t xml:space="preserve">Baromètre Assurance TN  ·  FS Market Intelligence</w:t>
+      </w:r>
+    </w:p>
+    <w:p>
+      <w:pPr>
+        <w:spacing w:after="320"/>
+      </w:pPr>
+    </w:p>
+    <w:p>
+      <w:pPr>
+        <w:pBdr>
+          <w:left w:val="single" w:color="FFE600" w:sz="18" w:space="10"/>
+        </w:pBdr>
+        <w:spacing w:after="260"/>
+      </w:pPr>
+      <w:r>
+        <w:rPr>
+          <w:rFonts w:ascii="Calibri" w:cs="Calibri" w:eastAsia="Calibri" w:hAnsi="Calibri"/>
+          <w:i/>
+          <w:iCs/>
+          <w:color w:val="747480"/>
+          <w:sz w:val="20"/>
+          <w:szCs w:val="20"/>
+        </w:rPr>
+        <w:t xml:space="preserve">Ce plan liste les 10 parties techniques construites au fil des sessions. Le statut à droite de chaque titre indique où on en est ; le contenu complet de chaque partie suit après ce plan.</w:t>
+      </w:r>
+    </w:p>
+    <w:tbl>
+      <w:tblPr>
+        <w:tblW w:type="dxa" w:w="9746"/>
+        <w:tblBorders>
+          <w:top w:val="none"/>
+          <w:left w:val="none"/>
+          <w:bottom w:val="none"/>
+          <w:right w:val="none"/>
+          <w:insideH w:val="none"/>
+          <w:insideV w:val="none"/>
+        </w:tblBorders>
+      </w:tblPr>
+      <w:tblGrid>
+        <w:gridCol w:w="8146"/>
+        <w:gridCol w:w="1600"/>
+      </w:tblGrid>
+      <w:tr>
+        <w:tc>
+          <w:tcPr>
+            <w:tcW w:type="dxa" w:w="8146"/>
+            <w:shd w:fill="2E2E38" w:val="clear"/>
+            <w:tcMar>
+              <w:top w:type="dxa" w:w="140"/>
+              <w:left w:type="dxa" w:w="220"/>
+              <w:bottom w:type="dxa" w:w="140"/>
+              <w:right w:type="dxa" w:w="160"/>
+            </w:tcMar>
+            <w:vAlign w:val="center"/>
+          </w:tcPr>
+          <w:p>
+            <w:r>
+              <w:rPr>
+                <w:rFonts w:ascii="Calibri" w:cs="Calibri" w:eastAsia="Calibri" w:hAnsi="Calibri"/>
+                <w:b/>
+                <w:bCs/>
+                <w:color w:val="FFE600"/>
+                <w:sz w:val="26"/>
+                <w:szCs w:val="26"/>
+              </w:rPr>
+              <w:t xml:space="preserve">01  </w:t>
+            </w:r>
+            <w:r>
+              <w:rPr>
+                <w:rFonts w:ascii="Calibri" w:cs="Calibri" w:eastAsia="Calibri" w:hAnsi="Calibri"/>
+                <w:b/>
+                <w:bCs/>
+                <w:color w:val="FFFFFF"/>
+                <w:sz w:val="26"/>
+                <w:szCs w:val="26"/>
+              </w:rPr>
+              <w:t xml:space="preserve">ARCHITECTURE GÉNÉRALE ET STACK TECHNIQUE</w:t>
+            </w:r>
+          </w:p>
+        </w:tc>
+        <w:tc>
+          <w:tcPr>
+            <w:tcW w:type="dxa" w:w="1600"/>
+            <w:shd w:fill="2E2E38" w:val="clear"/>
+            <w:tcMar>
+              <w:top w:type="dxa" w:w="140"/>
+              <w:left w:type="dxa" w:w="100"/>
+              <w:bottom w:type="dxa" w:w="140"/>
+              <w:right w:type="dxa" w:w="160"/>
+            </w:tcMar>
+            <w:vAlign w:val="center"/>
+          </w:tcPr>
+          <w:p>
+            <w:pPr>
+              <w:jc w:val="right"/>
+            </w:pPr>
+            <w:r>
+              <w:rPr>
+                <w:rFonts w:ascii="Calibri" w:cs="Calibri" w:eastAsia="Calibri" w:hAnsi="Calibri"/>
+                <w:b/>
+                <w:bCs/>
+                <w:color w:val="2DB87C"/>
+                <w:sz w:val="15"/>
+                <w:szCs w:val="15"/>
+              </w:rPr>
+              <w:t xml:space="preserve">✓ EXPLIQUÉ</w:t>
+            </w:r>
+          </w:p>
+        </w:tc>
+      </w:tr>
+    </w:tbl>
+    <w:p>
+      <w:pPr>
+        <w:spacing w:after="120"/>
+      </w:pPr>
+    </w:p>
+    <w:p>
+      <w:pPr>
+        <w:spacing w:after="90" w:before="20"/>
+        <w:ind w:left="300"/>
+      </w:pPr>
+      <w:r>
+        <w:rPr>
+          <w:b/>
+          <w:bCs/>
+          <w:color w:val="FFE600"/>
+          <w:sz w:val="20"/>
+          <w:szCs w:val="20"/>
+        </w:rPr>
+        <w:t xml:space="preserve">▸  </w:t>
+      </w:r>
+      <w:r>
+        <w:rPr>
+          <w:rFonts w:ascii="Calibri" w:cs="Calibri" w:eastAsia="Calibri" w:hAnsi="Calibri"/>
+          <w:color w:val="2E2E38"/>
+          <w:sz w:val="21"/>
+          <w:szCs w:val="21"/>
+        </w:rPr>
+        <w:t xml:space="preserve">Structure des dossiers du projet</w:t>
+      </w:r>
+    </w:p>
+    <w:p>
+      <w:pPr>
+        <w:spacing w:after="90" w:before="20"/>
+        <w:ind w:left="300"/>
+      </w:pPr>
+      <w:r>
+        <w:rPr>
+          <w:b/>
+          <w:bCs/>
+          <w:color w:val="FFE600"/>
+          <w:sz w:val="20"/>
+          <w:szCs w:val="20"/>
+        </w:rPr>
+        <w:t xml:space="preserve">▸  </w:t>
+      </w:r>
+      <w:r>
+        <w:rPr>
+          <w:rFonts w:ascii="Calibri" w:cs="Calibri" w:eastAsia="Calibri" w:hAnsi="Calibri"/>
+          <w:color w:val="2E2E38"/>
+          <w:sz w:val="21"/>
+          <w:szCs w:val="21"/>
+        </w:rPr>
+        <w:t xml:space="preserve">Flux global de la donnée (schéma bout-en-bout)</w:t>
+      </w:r>
+    </w:p>
+    <w:p>
+      <w:pPr>
+        <w:spacing w:after="90" w:before="20"/>
+        <w:ind w:left="300"/>
+      </w:pPr>
+      <w:r>
+        <w:rPr>
+          <w:b/>
+          <w:bCs/>
+          <w:color w:val="FFE600"/>
+          <w:sz w:val="20"/>
+          <w:szCs w:val="20"/>
+        </w:rPr>
+        <w:t xml:space="preserve">▸  </w:t>
+      </w:r>
+      <w:r>
+        <w:rPr>
+          <w:rFonts w:ascii="Calibri" w:cs="Calibri" w:eastAsia="Calibri" w:hAnsi="Calibri"/>
+          <w:color w:val="2E2E38"/>
+          <w:sz w:val="21"/>
+          <w:szCs w:val="21"/>
+        </w:rPr>
+        <w:t xml:space="preserve">Stack technique complet et justification de chaque choix</w:t>
+      </w:r>
+    </w:p>
+    <w:p>
+      <w:pPr>
+        <w:spacing w:after="260"/>
+      </w:pPr>
+    </w:p>
+    <w:tbl>
+      <w:tblPr>
+        <w:tblW w:type="dxa" w:w="9746"/>
+        <w:tblBorders>
+          <w:top w:val="none"/>
+          <w:left w:val="none"/>
+          <w:bottom w:val="none"/>
+          <w:right w:val="none"/>
+          <w:insideH w:val="none"/>
+          <w:insideV w:val="none"/>
+        </w:tblBorders>
+      </w:tblPr>
+      <w:tblGrid>
+        <w:gridCol w:w="8146"/>
+        <w:gridCol w:w="1600"/>
+      </w:tblGrid>
+      <w:tr>
+        <w:tc>
+          <w:tcPr>
+            <w:tcW w:type="dxa" w:w="8146"/>
+            <w:shd w:fill="2E2E38" w:val="clear"/>
+            <w:tcMar>
+              <w:top w:type="dxa" w:w="140"/>
+              <w:left w:type="dxa" w:w="220"/>
+              <w:bottom w:type="dxa" w:w="140"/>
+              <w:right w:type="dxa" w:w="160"/>
+            </w:tcMar>
+            <w:vAlign w:val="center"/>
+          </w:tcPr>
+          <w:p>
+            <w:r>
+              <w:rPr>
+                <w:rFonts w:ascii="Calibri" w:cs="Calibri" w:eastAsia="Calibri" w:hAnsi="Calibri"/>
+                <w:b/>
+                <w:bCs/>
+                <w:color w:val="FFE600"/>
+                <w:sz w:val="26"/>
+                <w:szCs w:val="26"/>
+              </w:rPr>
+              <w:t xml:space="preserve">02  </w:t>
+            </w:r>
+            <w:r>
+              <w:rPr>
+                <w:rFonts w:ascii="Calibri" w:cs="Calibri" w:eastAsia="Calibri" w:hAnsi="Calibri"/>
+                <w:b/>
+                <w:bCs/>
+                <w:color w:val="FFFFFF"/>
+                <w:sz w:val="26"/>
+                <w:szCs w:val="26"/>
+              </w:rPr>
+              <w:t xml:space="preserve">SCRAPING — LA COLLECTE DES DONNÉES</w:t>
+            </w:r>
+          </w:p>
+        </w:tc>
+        <w:tc>
+          <w:tcPr>
+            <w:tcW w:type="dxa" w:w="1600"/>
+            <w:shd w:fill="2E2E38" w:val="clear"/>
+            <w:tcMar>
+              <w:top w:type="dxa" w:w="140"/>
+              <w:left w:type="dxa" w:w="100"/>
+              <w:bottom w:type="dxa" w:w="140"/>
+              <w:right w:type="dxa" w:w="160"/>
+            </w:tcMar>
+            <w:vAlign w:val="center"/>
+          </w:tcPr>
+          <w:p>
+            <w:pPr>
+              <w:jc w:val="right"/>
+            </w:pPr>
+            <w:r>
+              <w:rPr>
+                <w:rFonts w:ascii="Calibri" w:cs="Calibri" w:eastAsia="Calibri" w:hAnsi="Calibri"/>
+                <w:b/>
+                <w:bCs/>
+                <w:color w:val="2DB87C"/>
+                <w:sz w:val="15"/>
+                <w:szCs w:val="15"/>
+              </w:rPr>
+              <w:t xml:space="preserve">✓ EXPLIQUÉ</w:t>
+            </w:r>
+          </w:p>
+        </w:tc>
+      </w:tr>
+    </w:tbl>
+    <w:p>
+      <w:pPr>
+        <w:spacing w:after="120"/>
+      </w:pPr>
+    </w:p>
+    <w:p>
+      <w:pPr>
+        <w:spacing w:after="90" w:before="20"/>
+        <w:ind w:left="300"/>
+      </w:pPr>
+      <w:r>
+        <w:rPr>
+          <w:b/>
+          <w:bCs/>
+          <w:color w:val="FFE600"/>
+          <w:sz w:val="20"/>
+          <w:szCs w:val="20"/>
+        </w:rPr>
+        <w:t xml:space="preserve">▸  </w:t>
+      </w:r>
+      <w:r>
+        <w:rPr>
+          <w:rFonts w:ascii="Calibri" w:cs="Calibri" w:eastAsia="Calibri" w:hAnsi="Calibri"/>
+          <w:color w:val="2E2E38"/>
+          <w:sz w:val="21"/>
+          <w:szCs w:val="21"/>
+        </w:rPr>
+        <w:t xml:space="preserve">Vue d'ensemble des 8 sources d'origine</w:t>
+      </w:r>
+    </w:p>
+    <w:p>
+      <w:pPr>
+        <w:spacing w:after="90" w:before="20"/>
+        <w:ind w:left="300"/>
+      </w:pPr>
+      <w:r>
+        <w:rPr>
+          <w:b/>
+          <w:bCs/>
+          <w:color w:val="FFE600"/>
+          <w:sz w:val="20"/>
+          <w:szCs w:val="20"/>
+        </w:rPr>
+        <w:t xml:space="preserve">▸  </w:t>
+      </w:r>
+      <w:r>
+        <w:rPr>
+          <w:rFonts w:ascii="Calibri" w:cs="Calibri" w:eastAsia="Calibri" w:hAnsi="Calibri"/>
+          <w:color w:val="2E2E38"/>
+          <w:sz w:val="21"/>
+          <w:szCs w:val="21"/>
+        </w:rPr>
+        <w:t xml:space="preserve">Pourquoi Selenium uniquement pour le portail CMF</w:t>
+      </w:r>
+    </w:p>
+    <w:p>
+      <w:pPr>
+        <w:spacing w:after="90" w:before="20"/>
+        <w:ind w:left="300"/>
+      </w:pPr>
+      <w:r>
+        <w:rPr>
+          <w:b/>
+          <w:bCs/>
+          <w:color w:val="FFE600"/>
+          <w:sz w:val="20"/>
+          <w:szCs w:val="20"/>
+        </w:rPr>
+        <w:t xml:space="preserve">▸  </w:t>
+      </w:r>
+      <w:r>
+        <w:rPr>
+          <w:rFonts w:ascii="Calibri" w:cs="Calibri" w:eastAsia="Calibri" w:hAnsi="Calibri"/>
+          <w:color w:val="2E2E38"/>
+          <w:sz w:val="21"/>
+          <w:szCs w:val="21"/>
+        </w:rPr>
+        <w:t xml:space="preserve">Le cas particulier CGA / FTUSA (double usage)</w:t>
+      </w:r>
+    </w:p>
+    <w:p>
+      <w:pPr>
+        <w:spacing w:after="90" w:before="20"/>
+        <w:ind w:left="300"/>
+      </w:pPr>
+      <w:r>
+        <w:rPr>
+          <w:b/>
+          <w:bCs/>
+          <w:color w:val="FFE600"/>
+          <w:sz w:val="20"/>
+          <w:szCs w:val="20"/>
+        </w:rPr>
+        <w:t xml:space="preserve">▸  </w:t>
+      </w:r>
+      <w:r>
+        <w:rPr>
+          <w:rFonts w:ascii="Calibri" w:cs="Calibri" w:eastAsia="Calibri" w:hAnsi="Calibri"/>
+          <w:color w:val="2E2E38"/>
+          <w:sz w:val="21"/>
+          <w:szCs w:val="21"/>
+        </w:rPr>
+        <w:t xml:space="preserve">Filtrage et déduplication, avec exemples concrets et code réel</w:t>
+      </w:r>
+    </w:p>
+    <w:p>
+      <w:pPr>
+        <w:spacing w:after="90" w:before="20"/>
+        <w:ind w:left="300"/>
+      </w:pPr>
+      <w:r>
+        <w:rPr>
+          <w:b/>
+          <w:bCs/>
+          <w:color w:val="FFE600"/>
+          <w:sz w:val="20"/>
+          <w:szCs w:val="20"/>
+        </w:rPr>
+        <w:t xml:space="preserve">▸  </w:t>
+      </w:r>
+      <w:r>
+        <w:rPr>
+          <w:rFonts w:ascii="Calibri" w:cs="Calibri" w:eastAsia="Calibri" w:hAnsi="Calibri"/>
+          <w:color w:val="2E2E38"/>
+          <w:sz w:val="21"/>
+          <w:szCs w:val="21"/>
+        </w:rPr>
+        <w:t xml:space="preserve">Reconnaissance automatique des sociétés (correspondance floue)</w:t>
+      </w:r>
+    </w:p>
+    <w:p>
+      <w:pPr>
+        <w:spacing w:after="260"/>
+      </w:pPr>
+    </w:p>
+    <w:tbl>
+      <w:tblPr>
+        <w:tblW w:type="dxa" w:w="9746"/>
+        <w:tblBorders>
+          <w:top w:val="none"/>
+          <w:left w:val="none"/>
+          <w:bottom w:val="none"/>
+          <w:right w:val="none"/>
+          <w:insideH w:val="none"/>
+          <w:insideV w:val="none"/>
+        </w:tblBorders>
+      </w:tblPr>
+      <w:tblGrid>
+        <w:gridCol w:w="8146"/>
+        <w:gridCol w:w="1600"/>
+      </w:tblGrid>
+      <w:tr>
+        <w:tc>
+          <w:tcPr>
+            <w:tcW w:type="dxa" w:w="8146"/>
+            <w:shd w:fill="2E2E38" w:val="clear"/>
+            <w:tcMar>
+              <w:top w:type="dxa" w:w="140"/>
+              <w:left w:type="dxa" w:w="220"/>
+              <w:bottom w:type="dxa" w:w="140"/>
+              <w:right w:type="dxa" w:w="160"/>
+            </w:tcMar>
+            <w:vAlign w:val="center"/>
+          </w:tcPr>
+          <w:p>
+            <w:r>
+              <w:rPr>
+                <w:rFonts w:ascii="Calibri" w:cs="Calibri" w:eastAsia="Calibri" w:hAnsi="Calibri"/>
+                <w:b/>
+                <w:bCs/>
+                <w:color w:val="FFE600"/>
+                <w:sz w:val="26"/>
+                <w:szCs w:val="26"/>
+              </w:rPr>
+              <w:t xml:space="preserve">03  </w:t>
+            </w:r>
+            <w:r>
+              <w:rPr>
+                <w:rFonts w:ascii="Calibri" w:cs="Calibri" w:eastAsia="Calibri" w:hAnsi="Calibri"/>
+                <w:b/>
+                <w:bCs/>
+                <w:color w:val="FFFFFF"/>
+                <w:sz w:val="26"/>
+                <w:szCs w:val="26"/>
+              </w:rPr>
+              <w:t xml:space="preserve">BASE DE DONNÉES</w:t>
+            </w:r>
+          </w:p>
+        </w:tc>
+        <w:tc>
+          <w:tcPr>
+            <w:tcW w:type="dxa" w:w="1600"/>
+            <w:shd w:fill="2E2E38" w:val="clear"/>
+            <w:tcMar>
+              <w:top w:type="dxa" w:w="140"/>
+              <w:left w:type="dxa" w:w="100"/>
+              <w:bottom w:type="dxa" w:w="140"/>
+              <w:right w:type="dxa" w:w="160"/>
+            </w:tcMar>
+            <w:vAlign w:val="center"/>
+          </w:tcPr>
+          <w:p>
+            <w:pPr>
+              <w:jc w:val="right"/>
+            </w:pPr>
+            <w:r>
+              <w:rPr>
+                <w:rFonts w:ascii="Calibri" w:cs="Calibri" w:eastAsia="Calibri" w:hAnsi="Calibri"/>
+                <w:b/>
+                <w:bCs/>
+                <w:color w:val="B7B7C0"/>
+                <w:sz w:val="15"/>
+                <w:szCs w:val="15"/>
+              </w:rPr>
+              <w:t xml:space="preserve">○ À VENIR</w:t>
+            </w:r>
+          </w:p>
+        </w:tc>
+      </w:tr>
+    </w:tbl>
+    <w:p>
+      <w:pPr>
+        <w:spacing w:after="120"/>
+      </w:pPr>
+    </w:p>
+    <w:p>
+      <w:pPr>
+        <w:spacing w:after="90" w:before="20"/>
+        <w:ind w:left="300"/>
+      </w:pPr>
+      <w:r>
+        <w:rPr>
+          <w:b/>
+          <w:bCs/>
+          <w:color w:val="FFE600"/>
+          <w:sz w:val="20"/>
+          <w:szCs w:val="20"/>
+        </w:rPr>
+        <w:t xml:space="preserve">▸  </w:t>
+      </w:r>
+      <w:r>
+        <w:rPr>
+          <w:rFonts w:ascii="Calibri" w:cs="Calibri" w:eastAsia="Calibri" w:hAnsi="Calibri"/>
+          <w:color w:val="2E2E38"/>
+          <w:sz w:val="21"/>
+          <w:szCs w:val="21"/>
+        </w:rPr>
+        <w:t xml:space="preserve">Schéma — les 6 tables et leurs relations</w:t>
+      </w:r>
+    </w:p>
+    <w:p>
+      <w:pPr>
+        <w:spacing w:after="90" w:before="20"/>
+        <w:ind w:left="300"/>
+      </w:pPr>
+      <w:r>
+        <w:rPr>
+          <w:b/>
+          <w:bCs/>
+          <w:color w:val="FFE600"/>
+          <w:sz w:val="20"/>
+          <w:szCs w:val="20"/>
+        </w:rPr>
+        <w:t xml:space="preserve">▸  </w:t>
+      </w:r>
+      <w:r>
+        <w:rPr>
+          <w:rFonts w:ascii="Calibri" w:cs="Calibri" w:eastAsia="Calibri" w:hAnsi="Calibri"/>
+          <w:color w:val="2E2E38"/>
+          <w:sz w:val="21"/>
+          <w:szCs w:val="21"/>
+        </w:rPr>
+        <w:t xml:space="preserve">Pourquoi MySQL plutôt qu'une autre base</w:t>
+      </w:r>
+    </w:p>
+    <w:p>
+      <w:pPr>
+        <w:spacing w:after="90" w:before="20"/>
+        <w:ind w:left="300"/>
+      </w:pPr>
+      <w:r>
+        <w:rPr>
+          <w:b/>
+          <w:bCs/>
+          <w:color w:val="FFE600"/>
+          <w:sz w:val="20"/>
+          <w:szCs w:val="20"/>
+        </w:rPr>
+        <w:t xml:space="preserve">▸  </w:t>
+      </w:r>
+      <w:r>
+        <w:rPr>
+          <w:rFonts w:ascii="Calibri" w:cs="Calibri" w:eastAsia="Calibri" w:hAnsi="Calibri"/>
+          <w:color w:val="2E2E38"/>
+          <w:sz w:val="21"/>
+          <w:szCs w:val="21"/>
+        </w:rPr>
+        <w:t xml:space="preserve">Migrations idempotentes</w:t>
+      </w:r>
+    </w:p>
+    <w:p>
+      <w:pPr>
+        <w:spacing w:after="90" w:before="20"/>
+        <w:ind w:left="300"/>
+      </w:pPr>
+      <w:r>
+        <w:rPr>
+          <w:b/>
+          <w:bCs/>
+          <w:color w:val="FFE600"/>
+          <w:sz w:val="20"/>
+          <w:szCs w:val="20"/>
+        </w:rPr>
+        <w:t xml:space="preserve">▸  </w:t>
+      </w:r>
+      <w:r>
+        <w:rPr>
+          <w:rFonts w:ascii="Calibri" w:cs="Calibri" w:eastAsia="Calibri" w:hAnsi="Calibri"/>
+          <w:color w:val="2E2E38"/>
+          <w:sz w:val="21"/>
+          <w:szCs w:val="21"/>
+        </w:rPr>
+        <w:t xml:space="preserve">Le principe directeur : aucune donnée manquante n'est jamais reconstituée</w:t>
+      </w:r>
+    </w:p>
+    <w:p>
+      <w:pPr>
+        <w:spacing w:after="260"/>
+      </w:pPr>
+    </w:p>
+    <w:tbl>
+      <w:tblPr>
+        <w:tblW w:type="dxa" w:w="9746"/>
+        <w:tblBorders>
+          <w:top w:val="none"/>
+          <w:left w:val="none"/>
+          <w:bottom w:val="none"/>
+          <w:right w:val="none"/>
+          <w:insideH w:val="none"/>
+          <w:insideV w:val="none"/>
+        </w:tblBorders>
+      </w:tblPr>
+      <w:tblGrid>
+        <w:gridCol w:w="8146"/>
+        <w:gridCol w:w="1600"/>
+      </w:tblGrid>
+      <w:tr>
+        <w:tc>
+          <w:tcPr>
+            <w:tcW w:type="dxa" w:w="8146"/>
+            <w:shd w:fill="2E2E38" w:val="clear"/>
+            <w:tcMar>
+              <w:top w:type="dxa" w:w="140"/>
+              <w:left w:type="dxa" w:w="220"/>
+              <w:bottom w:type="dxa" w:w="140"/>
+              <w:right w:type="dxa" w:w="160"/>
+            </w:tcMar>
+            <w:vAlign w:val="center"/>
+          </w:tcPr>
+          <w:p>
+            <w:r>
+              <w:rPr>
+                <w:rFonts w:ascii="Calibri" w:cs="Calibri" w:eastAsia="Calibri" w:hAnsi="Calibri"/>
+                <w:b/>
+                <w:bCs/>
+                <w:color w:val="FFE600"/>
+                <w:sz w:val="26"/>
+                <w:szCs w:val="26"/>
+              </w:rPr>
+              <w:t xml:space="preserve">04  </w:t>
+            </w:r>
+            <w:r>
+              <w:rPr>
+                <w:rFonts w:ascii="Calibri" w:cs="Calibri" w:eastAsia="Calibri" w:hAnsi="Calibri"/>
+                <w:b/>
+                <w:bCs/>
+                <w:color w:val="FFFFFF"/>
+                <w:sz w:val="26"/>
+                <w:szCs w:val="26"/>
+              </w:rPr>
+              <w:t xml:space="preserve">EXTRACTION PDF</w:t>
+            </w:r>
+          </w:p>
+        </w:tc>
+        <w:tc>
+          <w:tcPr>
+            <w:tcW w:type="dxa" w:w="1600"/>
+            <w:shd w:fill="2E2E38" w:val="clear"/>
+            <w:tcMar>
+              <w:top w:type="dxa" w:w="140"/>
+              <w:left w:type="dxa" w:w="100"/>
+              <w:bottom w:type="dxa" w:w="140"/>
+              <w:right w:type="dxa" w:w="160"/>
+            </w:tcMar>
+            <w:vAlign w:val="center"/>
+          </w:tcPr>
+          <w:p>
+            <w:pPr>
+              <w:jc w:val="right"/>
+            </w:pPr>
+            <w:r>
+              <w:rPr>
+                <w:rFonts w:ascii="Calibri" w:cs="Calibri" w:eastAsia="Calibri" w:hAnsi="Calibri"/>
+                <w:b/>
+                <w:bCs/>
+                <w:color w:val="B7B7C0"/>
+                <w:sz w:val="15"/>
+                <w:szCs w:val="15"/>
+              </w:rPr>
+              <w:t xml:space="preserve">○ À VENIR</w:t>
+            </w:r>
+          </w:p>
+        </w:tc>
+      </w:tr>
+    </w:tbl>
+    <w:p>
+      <w:pPr>
+        <w:spacing w:after="120"/>
+      </w:pPr>
+    </w:p>
+    <w:p>
+      <w:pPr>
+        <w:spacing w:after="90" w:before="20"/>
+        <w:ind w:left="300"/>
+      </w:pPr>
+      <w:r>
+        <w:rPr>
+          <w:b/>
+          <w:bCs/>
+          <w:color w:val="FFE600"/>
+          <w:sz w:val="20"/>
+          <w:szCs w:val="20"/>
+        </w:rPr>
+        <w:t xml:space="preserve">▸  </w:t>
+      </w:r>
+      <w:r>
+        <w:rPr>
+          <w:rFonts w:ascii="Calibri" w:cs="Calibri" w:eastAsia="Calibri" w:hAnsi="Calibri"/>
+          <w:color w:val="2E2E38"/>
+          <w:sz w:val="21"/>
+          <w:szCs w:val="21"/>
+        </w:rPr>
+        <w:t xml:space="preserve">Pourquoi ne pas utiliser l'extraction de tableaux automatique</w:t>
+      </w:r>
+    </w:p>
+    <w:p>
+      <w:pPr>
+        <w:spacing w:after="90" w:before="20"/>
+        <w:ind w:left="300"/>
+      </w:pPr>
+      <w:r>
+        <w:rPr>
+          <w:b/>
+          <w:bCs/>
+          <w:color w:val="FFE600"/>
+          <w:sz w:val="20"/>
+          <w:szCs w:val="20"/>
+        </w:rPr>
+        <w:t xml:space="preserve">▸  </w:t>
+      </w:r>
+      <w:r>
+        <w:rPr>
+          <w:rFonts w:ascii="Calibri" w:cs="Calibri" w:eastAsia="Calibri" w:hAnsi="Calibri"/>
+          <w:color w:val="2E2E38"/>
+          <w:sz w:val="21"/>
+          <w:szCs w:val="21"/>
+        </w:rPr>
+        <w:t xml:space="preserve">Bascule texte natif / OCR selon la qualité de la page</w:t>
+      </w:r>
+    </w:p>
+    <w:p>
+      <w:pPr>
+        <w:spacing w:after="90" w:before="20"/>
+        <w:ind w:left="300"/>
+      </w:pPr>
+      <w:r>
+        <w:rPr>
+          <w:b/>
+          <w:bCs/>
+          <w:color w:val="FFE600"/>
+          <w:sz w:val="20"/>
+          <w:szCs w:val="20"/>
+        </w:rPr>
+        <w:t xml:space="preserve">▸  </w:t>
+      </w:r>
+      <w:r>
+        <w:rPr>
+          <w:rFonts w:ascii="Calibri" w:cs="Calibri" w:eastAsia="Calibri" w:hAnsi="Calibri"/>
+          <w:color w:val="2E2E38"/>
+          <w:sz w:val="21"/>
+          <w:szCs w:val="21"/>
+        </w:rPr>
+        <w:t xml:space="preserve">Extracteurs spécialisés par tableau</w:t>
+      </w:r>
+    </w:p>
+    <w:p>
+      <w:pPr>
+        <w:spacing w:after="90" w:before="20"/>
+        <w:ind w:left="300"/>
+      </w:pPr>
+      <w:r>
+        <w:rPr>
+          <w:b/>
+          <w:bCs/>
+          <w:color w:val="FFE600"/>
+          <w:sz w:val="20"/>
+          <w:szCs w:val="20"/>
+        </w:rPr>
+        <w:t xml:space="preserve">▸  </w:t>
+      </w:r>
+      <w:r>
+        <w:rPr>
+          <w:rFonts w:ascii="Calibri" w:cs="Calibri" w:eastAsia="Calibri" w:hAnsi="Calibri"/>
+          <w:color w:val="2E2E38"/>
+          <w:sz w:val="21"/>
+          <w:szCs w:val="21"/>
+        </w:rPr>
+        <w:t xml:space="preserve">Extraction bilingue arabe (cas AL_AMANAH_TAKAFUL)</w:t>
+      </w:r>
+    </w:p>
+    <w:p>
+      <w:pPr>
+        <w:spacing w:after="90" w:before="20"/>
+        <w:ind w:left="300"/>
+      </w:pPr>
+      <w:r>
+        <w:rPr>
+          <w:b/>
+          <w:bCs/>
+          <w:color w:val="FFE600"/>
+          <w:sz w:val="20"/>
+          <w:szCs w:val="20"/>
+        </w:rPr>
+        <w:t xml:space="preserve">▸  </w:t>
+      </w:r>
+      <w:r>
+        <w:rPr>
+          <w:rFonts w:ascii="Calibri" w:cs="Calibri" w:eastAsia="Calibri" w:hAnsi="Calibri"/>
+          <w:color w:val="2E2E38"/>
+          <w:sz w:val="21"/>
+          <w:szCs w:val="21"/>
+        </w:rPr>
+        <w:t xml:space="preserve">Surlignage PDF — localiser précisément une cellule source</w:t>
+      </w:r>
+    </w:p>
+    <w:p>
+      <w:pPr>
+        <w:spacing w:after="90" w:before="20"/>
+        <w:ind w:left="300"/>
+      </w:pPr>
+      <w:r>
+        <w:rPr>
+          <w:b/>
+          <w:bCs/>
+          <w:color w:val="FFE600"/>
+          <w:sz w:val="20"/>
+          <w:szCs w:val="20"/>
+        </w:rPr>
+        <w:t xml:space="preserve">▸  </w:t>
+      </w:r>
+      <w:r>
+        <w:rPr>
+          <w:rFonts w:ascii="Calibri" w:cs="Calibri" w:eastAsia="Calibri" w:hAnsi="Calibri"/>
+          <w:color w:val="2E2E38"/>
+          <w:sz w:val="21"/>
+          <w:szCs w:val="21"/>
+        </w:rPr>
+        <w:t xml:space="preserve">Documentation empirique des cas particuliers rencontrés</w:t>
+      </w:r>
+    </w:p>
+    <w:p>
+      <w:pPr>
+        <w:spacing w:after="260"/>
+      </w:pPr>
+    </w:p>
+    <w:tbl>
+      <w:tblPr>
+        <w:tblW w:type="dxa" w:w="9746"/>
+        <w:tblBorders>
+          <w:top w:val="none"/>
+          <w:left w:val="none"/>
+          <w:bottom w:val="none"/>
+          <w:right w:val="none"/>
+          <w:insideH w:val="none"/>
+          <w:insideV w:val="none"/>
+        </w:tblBorders>
+      </w:tblPr>
+      <w:tblGrid>
+        <w:gridCol w:w="8146"/>
+        <w:gridCol w:w="1600"/>
+      </w:tblGrid>
+      <w:tr>
+        <w:tc>
+          <w:tcPr>
+            <w:tcW w:type="dxa" w:w="8146"/>
+            <w:shd w:fill="2E2E38" w:val="clear"/>
+            <w:tcMar>
+              <w:top w:type="dxa" w:w="140"/>
+              <w:left w:type="dxa" w:w="220"/>
+              <w:bottom w:type="dxa" w:w="140"/>
+              <w:right w:type="dxa" w:w="160"/>
+            </w:tcMar>
+            <w:vAlign w:val="center"/>
+          </w:tcPr>
+          <w:p>
+            <w:r>
+              <w:rPr>
+                <w:rFonts w:ascii="Calibri" w:cs="Calibri" w:eastAsia="Calibri" w:hAnsi="Calibri"/>
+                <w:b/>
+                <w:bCs/>
+                <w:color w:val="FFE600"/>
+                <w:sz w:val="26"/>
+                <w:szCs w:val="26"/>
+              </w:rPr>
+              <w:t xml:space="preserve">05  </w:t>
+            </w:r>
+            <w:r>
+              <w:rPr>
+                <w:rFonts w:ascii="Calibri" w:cs="Calibri" w:eastAsia="Calibri" w:hAnsi="Calibri"/>
+                <w:b/>
+                <w:bCs/>
+                <w:color w:val="FFFFFF"/>
+                <w:sz w:val="26"/>
+                <w:szCs w:val="26"/>
+              </w:rPr>
+              <w:t xml:space="preserve">CALCUL DES KPI ET RATIOS</w:t>
+            </w:r>
+          </w:p>
+        </w:tc>
+        <w:tc>
+          <w:tcPr>
+            <w:tcW w:type="dxa" w:w="1600"/>
+            <w:shd w:fill="2E2E38" w:val="clear"/>
+            <w:tcMar>
+              <w:top w:type="dxa" w:w="140"/>
+              <w:left w:type="dxa" w:w="100"/>
+              <w:bottom w:type="dxa" w:w="140"/>
+              <w:right w:type="dxa" w:w="160"/>
+            </w:tcMar>
+            <w:vAlign w:val="center"/>
+          </w:tcPr>
+          <w:p>
+            <w:pPr>
+              <w:jc w:val="right"/>
+            </w:pPr>
+            <w:r>
+              <w:rPr>
+                <w:rFonts w:ascii="Calibri" w:cs="Calibri" w:eastAsia="Calibri" w:hAnsi="Calibri"/>
+                <w:b/>
+                <w:bCs/>
+                <w:color w:val="B7B7C0"/>
+                <w:sz w:val="15"/>
+                <w:szCs w:val="15"/>
+              </w:rPr>
+              <w:t xml:space="preserve">○ À VENIR</w:t>
+            </w:r>
+          </w:p>
+        </w:tc>
+      </w:tr>
+    </w:tbl>
+    <w:p>
+      <w:pPr>
+        <w:spacing w:after="120"/>
+      </w:pPr>
+    </w:p>
+    <w:p>
+      <w:pPr>
+        <w:spacing w:after="90" w:before="20"/>
+        <w:ind w:left="300"/>
+      </w:pPr>
+      <w:r>
+        <w:rPr>
+          <w:b/>
+          <w:bCs/>
+          <w:color w:val="FFE600"/>
+          <w:sz w:val="20"/>
+          <w:szCs w:val="20"/>
+        </w:rPr>
+        <w:t xml:space="preserve">▸  </w:t>
+      </w:r>
+      <w:r>
+        <w:rPr>
+          <w:rFonts w:ascii="Calibri" w:cs="Calibri" w:eastAsia="Calibri" w:hAnsi="Calibri"/>
+          <w:color w:val="2E2E38"/>
+          <w:sz w:val="21"/>
+          <w:szCs w:val="21"/>
+        </w:rPr>
+        <w:t xml:space="preserve">Les formules principales</w:t>
+      </w:r>
+    </w:p>
+    <w:p>
+      <w:pPr>
+        <w:spacing w:after="90" w:before="20"/>
+        <w:ind w:left="300"/>
+      </w:pPr>
+      <w:r>
+        <w:rPr>
+          <w:b/>
+          <w:bCs/>
+          <w:color w:val="FFE600"/>
+          <w:sz w:val="20"/>
+          <w:szCs w:val="20"/>
+        </w:rPr>
+        <w:t xml:space="preserve">▸  </w:t>
+      </w:r>
+      <w:r>
+        <w:rPr>
+          <w:rFonts w:ascii="Calibri" w:cs="Calibri" w:eastAsia="Calibri" w:hAnsi="Calibri"/>
+          <w:color w:val="2E2E38"/>
+          <w:sz w:val="21"/>
+          <w:szCs w:val="21"/>
+        </w:rPr>
+        <w:t xml:space="preserve">Double niveau de calcul (écriture et lecture)</w:t>
+      </w:r>
+    </w:p>
+    <w:p>
+      <w:pPr>
+        <w:spacing w:after="90" w:before="20"/>
+        <w:ind w:left="300"/>
+      </w:pPr>
+      <w:r>
+        <w:rPr>
+          <w:b/>
+          <w:bCs/>
+          <w:color w:val="FFE600"/>
+          <w:sz w:val="20"/>
+          <w:szCs w:val="20"/>
+        </w:rPr>
+        <w:t xml:space="preserve">▸  </w:t>
+      </w:r>
+      <w:r>
+        <w:rPr>
+          <w:rFonts w:ascii="Calibri" w:cs="Calibri" w:eastAsia="Calibri" w:hAnsi="Calibri"/>
+          <w:color w:val="2E2E38"/>
+          <w:sz w:val="21"/>
+          <w:szCs w:val="21"/>
+        </w:rPr>
+        <w:t xml:space="preserve">Garde-fous de cohérence</w:t>
+      </w:r>
+    </w:p>
+    <w:p>
+      <w:pPr>
+        <w:spacing w:after="260"/>
+      </w:pPr>
+    </w:p>
+    <w:tbl>
+      <w:tblPr>
+        <w:tblW w:type="dxa" w:w="9746"/>
+        <w:tblBorders>
+          <w:top w:val="none"/>
+          <w:left w:val="none"/>
+          <w:bottom w:val="none"/>
+          <w:right w:val="none"/>
+          <w:insideH w:val="none"/>
+          <w:insideV w:val="none"/>
+        </w:tblBorders>
+      </w:tblPr>
+      <w:tblGrid>
+        <w:gridCol w:w="8146"/>
+        <w:gridCol w:w="1600"/>
+      </w:tblGrid>
+      <w:tr>
+        <w:tc>
+          <w:tcPr>
+            <w:tcW w:type="dxa" w:w="8146"/>
+            <w:shd w:fill="2E2E38" w:val="clear"/>
+            <w:tcMar>
+              <w:top w:type="dxa" w:w="140"/>
+              <w:left w:type="dxa" w:w="220"/>
+              <w:bottom w:type="dxa" w:w="140"/>
+              <w:right w:type="dxa" w:w="160"/>
+            </w:tcMar>
+            <w:vAlign w:val="center"/>
+          </w:tcPr>
+          <w:p>
+            <w:r>
+              <w:rPr>
+                <w:rFonts w:ascii="Calibri" w:cs="Calibri" w:eastAsia="Calibri" w:hAnsi="Calibri"/>
+                <w:b/>
+                <w:bCs/>
+                <w:color w:val="FFE600"/>
+                <w:sz w:val="26"/>
+                <w:szCs w:val="26"/>
+              </w:rPr>
+              <w:t xml:space="preserve">06  </w:t>
+            </w:r>
+            <w:r>
+              <w:rPr>
+                <w:rFonts w:ascii="Calibri" w:cs="Calibri" w:eastAsia="Calibri" w:hAnsi="Calibri"/>
+                <w:b/>
+                <w:bCs/>
+                <w:color w:val="FFFFFF"/>
+                <w:sz w:val="26"/>
+                <w:szCs w:val="26"/>
+              </w:rPr>
+              <w:t xml:space="preserve">ORCHESTRATION — LE PIPELINE PLANIFIÉ</w:t>
+            </w:r>
+          </w:p>
+        </w:tc>
+        <w:tc>
+          <w:tcPr>
+            <w:tcW w:type="dxa" w:w="1600"/>
+            <w:shd w:fill="2E2E38" w:val="clear"/>
+            <w:tcMar>
+              <w:top w:type="dxa" w:w="140"/>
+              <w:left w:type="dxa" w:w="100"/>
+              <w:bottom w:type="dxa" w:w="140"/>
+              <w:right w:type="dxa" w:w="160"/>
+            </w:tcMar>
+            <w:vAlign w:val="center"/>
+          </w:tcPr>
+          <w:p>
+            <w:pPr>
+              <w:jc w:val="right"/>
+            </w:pPr>
+            <w:r>
+              <w:rPr>
+                <w:rFonts w:ascii="Calibri" w:cs="Calibri" w:eastAsia="Calibri" w:hAnsi="Calibri"/>
+                <w:b/>
+                <w:bCs/>
+                <w:color w:val="B7B7C0"/>
+                <w:sz w:val="15"/>
+                <w:szCs w:val="15"/>
+              </w:rPr>
+              <w:t xml:space="preserve">○ À VENIR</w:t>
+            </w:r>
+          </w:p>
+        </w:tc>
+      </w:tr>
+    </w:tbl>
+    <w:p>
+      <w:pPr>
+        <w:spacing w:after="120"/>
+      </w:pPr>
+    </w:p>
+    <w:p>
+      <w:pPr>
+        <w:spacing w:after="90" w:before="20"/>
+        <w:ind w:left="300"/>
+      </w:pPr>
+      <w:r>
+        <w:rPr>
+          <w:b/>
+          <w:bCs/>
+          <w:color w:val="FFE600"/>
+          <w:sz w:val="20"/>
+          <w:szCs w:val="20"/>
+        </w:rPr>
+        <w:t xml:space="preserve">▸  </w:t>
+      </w:r>
+      <w:r>
+        <w:rPr>
+          <w:rFonts w:ascii="Calibri" w:cs="Calibri" w:eastAsia="Calibri" w:hAnsi="Calibri"/>
+          <w:color w:val="2E2E38"/>
+          <w:sz w:val="21"/>
+          <w:szCs w:val="21"/>
+        </w:rPr>
+        <w:t xml:space="preserve">Le pipeline hebdomadaire</w:t>
+      </w:r>
+    </w:p>
+    <w:p>
+      <w:pPr>
+        <w:spacing w:after="90" w:before="20"/>
+        <w:ind w:left="300"/>
+      </w:pPr>
+      <w:r>
+        <w:rPr>
+          <w:b/>
+          <w:bCs/>
+          <w:color w:val="FFE600"/>
+          <w:sz w:val="20"/>
+          <w:szCs w:val="20"/>
+        </w:rPr>
+        <w:t xml:space="preserve">▸  </w:t>
+      </w:r>
+      <w:r>
+        <w:rPr>
+          <w:rFonts w:ascii="Calibri" w:cs="Calibri" w:eastAsia="Calibri" w:hAnsi="Calibri"/>
+          <w:color w:val="2E2E38"/>
+          <w:sz w:val="21"/>
+          <w:szCs w:val="21"/>
+        </w:rPr>
+        <w:t xml:space="preserve">Le problème de la tâche planifiée Windows</w:t>
+      </w:r>
+    </w:p>
+    <w:p>
+      <w:pPr>
+        <w:spacing w:after="90" w:before="20"/>
+        <w:ind w:left="300"/>
+      </w:pPr>
+      <w:r>
+        <w:rPr>
+          <w:b/>
+          <w:bCs/>
+          <w:color w:val="FFE600"/>
+          <w:sz w:val="20"/>
+          <w:szCs w:val="20"/>
+        </w:rPr>
+        <w:t xml:space="preserve">▸  </w:t>
+      </w:r>
+      <w:r>
+        <w:rPr>
+          <w:rFonts w:ascii="Calibri" w:cs="Calibri" w:eastAsia="Calibri" w:hAnsi="Calibri"/>
+          <w:color w:val="2E2E38"/>
+          <w:sz w:val="21"/>
+          <w:szCs w:val="21"/>
+        </w:rPr>
+        <w:t xml:space="preserve">La solution retenue : un thread de fond dans le serveur</w:t>
+      </w:r>
+    </w:p>
+    <w:p>
+      <w:pPr>
+        <w:spacing w:after="260"/>
+      </w:pPr>
+    </w:p>
+    <w:tbl>
+      <w:tblPr>
+        <w:tblW w:type="dxa" w:w="9746"/>
+        <w:tblBorders>
+          <w:top w:val="none"/>
+          <w:left w:val="none"/>
+          <w:bottom w:val="none"/>
+          <w:right w:val="none"/>
+          <w:insideH w:val="none"/>
+          <w:insideV w:val="none"/>
+        </w:tblBorders>
+      </w:tblPr>
+      <w:tblGrid>
+        <w:gridCol w:w="8146"/>
+        <w:gridCol w:w="1600"/>
+      </w:tblGrid>
+      <w:tr>
+        <w:tc>
+          <w:tcPr>
+            <w:tcW w:type="dxa" w:w="8146"/>
+            <w:shd w:fill="2E2E38" w:val="clear"/>
+            <w:tcMar>
+              <w:top w:type="dxa" w:w="140"/>
+              <w:left w:type="dxa" w:w="220"/>
+              <w:bottom w:type="dxa" w:w="140"/>
+              <w:right w:type="dxa" w:w="160"/>
+            </w:tcMar>
+            <w:vAlign w:val="center"/>
+          </w:tcPr>
+          <w:p>
+            <w:r>
+              <w:rPr>
+                <w:rFonts w:ascii="Calibri" w:cs="Calibri" w:eastAsia="Calibri" w:hAnsi="Calibri"/>
+                <w:b/>
+                <w:bCs/>
+                <w:color w:val="FFE600"/>
+                <w:sz w:val="26"/>
+                <w:szCs w:val="26"/>
+              </w:rPr>
+              <w:t xml:space="preserve">07  </w:t>
+            </w:r>
+            <w:r>
+              <w:rPr>
+                <w:rFonts w:ascii="Calibri" w:cs="Calibri" w:eastAsia="Calibri" w:hAnsi="Calibri"/>
+                <w:b/>
+                <w:bCs/>
+                <w:color w:val="FFFFFF"/>
+                <w:sz w:val="26"/>
+                <w:szCs w:val="26"/>
+              </w:rPr>
+              <w:t xml:space="preserve">BACKEND API</w:t>
+            </w:r>
+          </w:p>
+        </w:tc>
+        <w:tc>
+          <w:tcPr>
+            <w:tcW w:type="dxa" w:w="1600"/>
+            <w:shd w:fill="2E2E38" w:val="clear"/>
+            <w:tcMar>
+              <w:top w:type="dxa" w:w="140"/>
+              <w:left w:type="dxa" w:w="100"/>
+              <w:bottom w:type="dxa" w:w="140"/>
+              <w:right w:type="dxa" w:w="160"/>
+            </w:tcMar>
+            <w:vAlign w:val="center"/>
+          </w:tcPr>
+          <w:p>
+            <w:pPr>
+              <w:jc w:val="right"/>
+            </w:pPr>
+            <w:r>
+              <w:rPr>
+                <w:rFonts w:ascii="Calibri" w:cs="Calibri" w:eastAsia="Calibri" w:hAnsi="Calibri"/>
+                <w:b/>
+                <w:bCs/>
+                <w:color w:val="B7B7C0"/>
+                <w:sz w:val="15"/>
+                <w:szCs w:val="15"/>
+              </w:rPr>
+              <w:t xml:space="preserve">○ À VENIR</w:t>
+            </w:r>
+          </w:p>
+        </w:tc>
+      </w:tr>
+    </w:tbl>
+    <w:p>
+      <w:pPr>
+        <w:spacing w:after="120"/>
+      </w:pPr>
+    </w:p>
+    <w:p>
+      <w:pPr>
+        <w:spacing w:after="90" w:before="20"/>
+        <w:ind w:left="300"/>
+      </w:pPr>
+      <w:r>
+        <w:rPr>
+          <w:b/>
+          <w:bCs/>
+          <w:color w:val="FFE600"/>
+          <w:sz w:val="20"/>
+          <w:szCs w:val="20"/>
+        </w:rPr>
+        <w:t xml:space="preserve">▸  </w:t>
+      </w:r>
+      <w:r>
+        <w:rPr>
+          <w:rFonts w:ascii="Calibri" w:cs="Calibri" w:eastAsia="Calibri" w:hAnsi="Calibri"/>
+          <w:color w:val="2E2E38"/>
+          <w:sz w:val="21"/>
+          <w:szCs w:val="21"/>
+        </w:rPr>
+        <w:t xml:space="preserve">Point d'entrée et démarrage</w:t>
+      </w:r>
+    </w:p>
+    <w:p>
+      <w:pPr>
+        <w:spacing w:after="90" w:before="20"/>
+        <w:ind w:left="300"/>
+      </w:pPr>
+      <w:r>
+        <w:rPr>
+          <w:b/>
+          <w:bCs/>
+          <w:color w:val="FFE600"/>
+          <w:sz w:val="20"/>
+          <w:szCs w:val="20"/>
+        </w:rPr>
+        <w:t xml:space="preserve">▸  </w:t>
+      </w:r>
+      <w:r>
+        <w:rPr>
+          <w:rFonts w:ascii="Calibri" w:cs="Calibri" w:eastAsia="Calibri" w:hAnsi="Calibri"/>
+          <w:color w:val="2E2E38"/>
+          <w:sz w:val="21"/>
+          <w:szCs w:val="21"/>
+        </w:rPr>
+        <w:t xml:space="preserve">Inventaire des routes</w:t>
+      </w:r>
+    </w:p>
+    <w:p>
+      <w:pPr>
+        <w:spacing w:after="90" w:before="20"/>
+        <w:ind w:left="300"/>
+      </w:pPr>
+      <w:r>
+        <w:rPr>
+          <w:b/>
+          <w:bCs/>
+          <w:color w:val="FFE600"/>
+          <w:sz w:val="20"/>
+          <w:szCs w:val="20"/>
+        </w:rPr>
+        <w:t xml:space="preserve">▸  </w:t>
+      </w:r>
+      <w:r>
+        <w:rPr>
+          <w:rFonts w:ascii="Calibri" w:cs="Calibri" w:eastAsia="Calibri" w:hAnsi="Calibri"/>
+          <w:color w:val="2E2E38"/>
+          <w:sz w:val="21"/>
+          <w:szCs w:val="21"/>
+        </w:rPr>
+        <w:t xml:space="preserve">Les services métier</w:t>
+      </w:r>
+    </w:p>
+    <w:p>
+      <w:pPr>
+        <w:spacing w:after="90" w:before="20"/>
+        <w:ind w:left="300"/>
+      </w:pPr>
+      <w:r>
+        <w:rPr>
+          <w:b/>
+          <w:bCs/>
+          <w:color w:val="FFE600"/>
+          <w:sz w:val="20"/>
+          <w:szCs w:val="20"/>
+        </w:rPr>
+        <w:t xml:space="preserve">▸  </w:t>
+      </w:r>
+      <w:r>
+        <w:rPr>
+          <w:rFonts w:ascii="Calibri" w:cs="Calibri" w:eastAsia="Calibri" w:hAnsi="Calibri"/>
+          <w:color w:val="2E2E38"/>
+          <w:sz w:val="21"/>
+          <w:szCs w:val="21"/>
+        </w:rPr>
+        <w:t xml:space="preserve">Pourquoi aucune authentification</w:t>
+      </w:r>
+    </w:p>
+    <w:p>
+      <w:pPr>
+        <w:spacing w:after="260"/>
+      </w:pPr>
+    </w:p>
+    <w:tbl>
+      <w:tblPr>
+        <w:tblW w:type="dxa" w:w="9746"/>
+        <w:tblBorders>
+          <w:top w:val="none"/>
+          <w:left w:val="none"/>
+          <w:bottom w:val="none"/>
+          <w:right w:val="none"/>
+          <w:insideH w:val="none"/>
+          <w:insideV w:val="none"/>
+        </w:tblBorders>
+      </w:tblPr>
+      <w:tblGrid>
+        <w:gridCol w:w="8146"/>
+        <w:gridCol w:w="1600"/>
+      </w:tblGrid>
+      <w:tr>
+        <w:tc>
+          <w:tcPr>
+            <w:tcW w:type="dxa" w:w="8146"/>
+            <w:shd w:fill="2E2E38" w:val="clear"/>
+            <w:tcMar>
+              <w:top w:type="dxa" w:w="140"/>
+              <w:left w:type="dxa" w:w="220"/>
+              <w:bottom w:type="dxa" w:w="140"/>
+              <w:right w:type="dxa" w:w="160"/>
+            </w:tcMar>
+            <w:vAlign w:val="center"/>
+          </w:tcPr>
+          <w:p>
+            <w:r>
+              <w:rPr>
+                <w:rFonts w:ascii="Calibri" w:cs="Calibri" w:eastAsia="Calibri" w:hAnsi="Calibri"/>
+                <w:b/>
+                <w:bCs/>
+                <w:color w:val="FFE600"/>
+                <w:sz w:val="26"/>
+                <w:szCs w:val="26"/>
+              </w:rPr>
+              <w:t xml:space="preserve">08  </w:t>
+            </w:r>
+            <w:r>
+              <w:rPr>
+                <w:rFonts w:ascii="Calibri" w:cs="Calibri" w:eastAsia="Calibri" w:hAnsi="Calibri"/>
+                <w:b/>
+                <w:bCs/>
+                <w:color w:val="FFFFFF"/>
+                <w:sz w:val="26"/>
+                <w:szCs w:val="26"/>
+              </w:rPr>
+              <w:t xml:space="preserve">FRONTEND</w:t>
+            </w:r>
+          </w:p>
+        </w:tc>
+        <w:tc>
+          <w:tcPr>
+            <w:tcW w:type="dxa" w:w="1600"/>
+            <w:shd w:fill="2E2E38" w:val="clear"/>
+            <w:tcMar>
+              <w:top w:type="dxa" w:w="140"/>
+              <w:left w:type="dxa" w:w="100"/>
+              <w:bottom w:type="dxa" w:w="140"/>
+              <w:right w:type="dxa" w:w="160"/>
+            </w:tcMar>
+            <w:vAlign w:val="center"/>
+          </w:tcPr>
+          <w:p>
+            <w:pPr>
+              <w:jc w:val="right"/>
+            </w:pPr>
+            <w:r>
+              <w:rPr>
+                <w:rFonts w:ascii="Calibri" w:cs="Calibri" w:eastAsia="Calibri" w:hAnsi="Calibri"/>
+                <w:b/>
+                <w:bCs/>
+                <w:color w:val="B7B7C0"/>
+                <w:sz w:val="15"/>
+                <w:szCs w:val="15"/>
+              </w:rPr>
+              <w:t xml:space="preserve">○ À VENIR</w:t>
+            </w:r>
+          </w:p>
+        </w:tc>
+      </w:tr>
+    </w:tbl>
+    <w:p>
+      <w:pPr>
+        <w:spacing w:after="120"/>
+      </w:pPr>
+    </w:p>
+    <w:p>
+      <w:pPr>
+        <w:spacing w:after="90" w:before="20"/>
+        <w:ind w:left="300"/>
+      </w:pPr>
+      <w:r>
+        <w:rPr>
+          <w:b/>
+          <w:bCs/>
+          <w:color w:val="FFE600"/>
+          <w:sz w:val="20"/>
+          <w:szCs w:val="20"/>
+        </w:rPr>
+        <w:t xml:space="preserve">▸  </w:t>
+      </w:r>
+      <w:r>
+        <w:rPr>
+          <w:rFonts w:ascii="Calibri" w:cs="Calibri" w:eastAsia="Calibri" w:hAnsi="Calibri"/>
+          <w:color w:val="2E2E38"/>
+          <w:sz w:val="21"/>
+          <w:szCs w:val="21"/>
+        </w:rPr>
+        <w:t xml:space="preserve">Stack et routage — 13 pages</w:t>
+      </w:r>
+    </w:p>
+    <w:p>
+      <w:pPr>
+        <w:spacing w:after="90" w:before="20"/>
+        <w:ind w:left="300"/>
+      </w:pPr>
+      <w:r>
+        <w:rPr>
+          <w:b/>
+          <w:bCs/>
+          <w:color w:val="FFE600"/>
+          <w:sz w:val="20"/>
+          <w:szCs w:val="20"/>
+        </w:rPr>
+        <w:t xml:space="preserve">▸  </w:t>
+      </w:r>
+      <w:r>
+        <w:rPr>
+          <w:rFonts w:ascii="Calibri" w:cs="Calibri" w:eastAsia="Calibri" w:hAnsi="Calibri"/>
+          <w:color w:val="2E2E38"/>
+          <w:sz w:val="21"/>
+          <w:szCs w:val="21"/>
+        </w:rPr>
+        <w:t xml:space="preserve">Le design system EY</w:t>
+      </w:r>
+    </w:p>
+    <w:p>
+      <w:pPr>
+        <w:spacing w:after="90" w:before="20"/>
+        <w:ind w:left="300"/>
+      </w:pPr>
+      <w:r>
+        <w:rPr>
+          <w:b/>
+          <w:bCs/>
+          <w:color w:val="FFE600"/>
+          <w:sz w:val="20"/>
+          <w:szCs w:val="20"/>
+        </w:rPr>
+        <w:t xml:space="preserve">▸  </w:t>
+      </w:r>
+      <w:r>
+        <w:rPr>
+          <w:rFonts w:ascii="Calibri" w:cs="Calibri" w:eastAsia="Calibri" w:hAnsi="Calibri"/>
+          <w:color w:val="2E2E38"/>
+          <w:sz w:val="21"/>
+          <w:szCs w:val="21"/>
+        </w:rPr>
+        <w:t xml:space="preserve">Le mécanisme de surlignage PDF côté écran</w:t>
+      </w:r>
+    </w:p>
+    <w:p>
+      <w:pPr>
+        <w:spacing w:after="90" w:before="20"/>
+        <w:ind w:left="300"/>
+      </w:pPr>
+      <w:r>
+        <w:rPr>
+          <w:b/>
+          <w:bCs/>
+          <w:color w:val="FFE600"/>
+          <w:sz w:val="20"/>
+          <w:szCs w:val="20"/>
+        </w:rPr>
+        <w:t xml:space="preserve">▸  </w:t>
+      </w:r>
+      <w:r>
+        <w:rPr>
+          <w:rFonts w:ascii="Calibri" w:cs="Calibri" w:eastAsia="Calibri" w:hAnsi="Calibri"/>
+          <w:color w:val="2E2E38"/>
+          <w:sz w:val="21"/>
+          <w:szCs w:val="21"/>
+        </w:rPr>
+        <w:t xml:space="preserve">Composants transverses</w:t>
+      </w:r>
+    </w:p>
+    <w:p>
+      <w:pPr>
+        <w:spacing w:after="90" w:before="20"/>
+        <w:ind w:left="300"/>
+      </w:pPr>
+      <w:r>
+        <w:rPr>
+          <w:b/>
+          <w:bCs/>
+          <w:color w:val="FFE600"/>
+          <w:sz w:val="20"/>
+          <w:szCs w:val="20"/>
+        </w:rPr>
+        <w:t xml:space="preserve">▸  </w:t>
+      </w:r>
+      <w:r>
+        <w:rPr>
+          <w:rFonts w:ascii="Calibri" w:cs="Calibri" w:eastAsia="Calibri" w:hAnsi="Calibri"/>
+          <w:color w:val="2E2E38"/>
+          <w:sz w:val="21"/>
+          <w:szCs w:val="21"/>
+        </w:rPr>
+        <w:t xml:space="preserve">Pages non finalisées à connaître</w:t>
+      </w:r>
+    </w:p>
+    <w:p>
+      <w:pPr>
+        <w:spacing w:after="260"/>
+      </w:pPr>
+    </w:p>
+    <w:tbl>
+      <w:tblPr>
+        <w:tblW w:type="dxa" w:w="9746"/>
+        <w:tblBorders>
+          <w:top w:val="none"/>
+          <w:left w:val="none"/>
+          <w:bottom w:val="none"/>
+          <w:right w:val="none"/>
+          <w:insideH w:val="none"/>
+          <w:insideV w:val="none"/>
+        </w:tblBorders>
+      </w:tblPr>
+      <w:tblGrid>
+        <w:gridCol w:w="8146"/>
+        <w:gridCol w:w="1600"/>
+      </w:tblGrid>
+      <w:tr>
+        <w:tc>
+          <w:tcPr>
+            <w:tcW w:type="dxa" w:w="8146"/>
+            <w:shd w:fill="2E2E38" w:val="clear"/>
+            <w:tcMar>
+              <w:top w:type="dxa" w:w="140"/>
+              <w:left w:type="dxa" w:w="220"/>
+              <w:bottom w:type="dxa" w:w="140"/>
+              <w:right w:type="dxa" w:w="160"/>
+            </w:tcMar>
+            <w:vAlign w:val="center"/>
+          </w:tcPr>
+          <w:p>
+            <w:r>
+              <w:rPr>
+                <w:rFonts w:ascii="Calibri" w:cs="Calibri" w:eastAsia="Calibri" w:hAnsi="Calibri"/>
+                <w:b/>
+                <w:bCs/>
+                <w:color w:val="FFE600"/>
+                <w:sz w:val="26"/>
+                <w:szCs w:val="26"/>
+              </w:rPr>
+              <w:t xml:space="preserve">09  </w:t>
+            </w:r>
+            <w:r>
+              <w:rPr>
+                <w:rFonts w:ascii="Calibri" w:cs="Calibri" w:eastAsia="Calibri" w:hAnsi="Calibri"/>
+                <w:b/>
+                <w:bCs/>
+                <w:color w:val="FFFFFF"/>
+                <w:sz w:val="26"/>
+                <w:szCs w:val="26"/>
+              </w:rPr>
+              <w:t xml:space="preserve">INTELLIGENCE ARTIFICIELLE</w:t>
+            </w:r>
+          </w:p>
+        </w:tc>
+        <w:tc>
+          <w:tcPr>
+            <w:tcW w:type="dxa" w:w="1600"/>
+            <w:shd w:fill="2E2E38" w:val="clear"/>
+            <w:tcMar>
+              <w:top w:type="dxa" w:w="140"/>
+              <w:left w:type="dxa" w:w="100"/>
+              <w:bottom w:type="dxa" w:w="140"/>
+              <w:right w:type="dxa" w:w="160"/>
+            </w:tcMar>
+            <w:vAlign w:val="center"/>
+          </w:tcPr>
+          <w:p>
+            <w:pPr>
+              <w:jc w:val="right"/>
+            </w:pPr>
+            <w:r>
+              <w:rPr>
+                <w:rFonts w:ascii="Calibri" w:cs="Calibri" w:eastAsia="Calibri" w:hAnsi="Calibri"/>
+                <w:b/>
+                <w:bCs/>
+                <w:color w:val="B7B7C0"/>
+                <w:sz w:val="15"/>
+                <w:szCs w:val="15"/>
+              </w:rPr>
+              <w:t xml:space="preserve">○ À VENIR</w:t>
+            </w:r>
+          </w:p>
+        </w:tc>
+      </w:tr>
+    </w:tbl>
+    <w:p>
+      <w:pPr>
+        <w:spacing w:after="120"/>
+      </w:pPr>
+    </w:p>
+    <w:p>
+      <w:pPr>
+        <w:spacing w:after="90" w:before="20"/>
+        <w:ind w:left="300"/>
+      </w:pPr>
+      <w:r>
+        <w:rPr>
+          <w:b/>
+          <w:bCs/>
+          <w:color w:val="FFE600"/>
+          <w:sz w:val="20"/>
+          <w:szCs w:val="20"/>
+        </w:rPr>
+        <w:t xml:space="preserve">▸  </w:t>
+      </w:r>
+      <w:r>
+        <w:rPr>
+          <w:rFonts w:ascii="Calibri" w:cs="Calibri" w:eastAsia="Calibri" w:hAnsi="Calibri"/>
+          <w:color w:val="2E2E38"/>
+          <w:sz w:val="21"/>
+          <w:szCs w:val="21"/>
+        </w:rPr>
+        <w:t xml:space="preserve">IA générative vs IA prédictive</w:t>
+      </w:r>
+    </w:p>
+    <w:p>
+      <w:pPr>
+        <w:spacing w:after="90" w:before="20"/>
+        <w:ind w:left="300"/>
+      </w:pPr>
+      <w:r>
+        <w:rPr>
+          <w:b/>
+          <w:bCs/>
+          <w:color w:val="FFE600"/>
+          <w:sz w:val="20"/>
+          <w:szCs w:val="20"/>
+        </w:rPr>
+        <w:t xml:space="preserve">▸  </w:t>
+      </w:r>
+      <w:r>
+        <w:rPr>
+          <w:rFonts w:ascii="Calibri" w:cs="Calibri" w:eastAsia="Calibri" w:hAnsi="Calibri"/>
+          <w:color w:val="2E2E38"/>
+          <w:sz w:val="21"/>
+          <w:szCs w:val="21"/>
+        </w:rPr>
+        <w:t xml:space="preserve">Le chatbot RAG</w:t>
+      </w:r>
+    </w:p>
+    <w:p>
+      <w:pPr>
+        <w:spacing w:after="90" w:before="20"/>
+        <w:ind w:left="300"/>
+      </w:pPr>
+      <w:r>
+        <w:rPr>
+          <w:b/>
+          <w:bCs/>
+          <w:color w:val="FFE600"/>
+          <w:sz w:val="20"/>
+          <w:szCs w:val="20"/>
+        </w:rPr>
+        <w:t xml:space="preserve">▸  </w:t>
+      </w:r>
+      <w:r>
+        <w:rPr>
+          <w:rFonts w:ascii="Calibri" w:cs="Calibri" w:eastAsia="Calibri" w:hAnsi="Calibri"/>
+          <w:color w:val="2E2E38"/>
+          <w:sz w:val="21"/>
+          <w:szCs w:val="21"/>
+        </w:rPr>
+        <w:t xml:space="preserve">Rapport IA et explication de chiffres</w:t>
+      </w:r>
+    </w:p>
+    <w:p>
+      <w:pPr>
+        <w:spacing w:after="90" w:before="20"/>
+        <w:ind w:left="300"/>
+      </w:pPr>
+      <w:r>
+        <w:rPr>
+          <w:b/>
+          <w:bCs/>
+          <w:color w:val="FFE600"/>
+          <w:sz w:val="20"/>
+          <w:szCs w:val="20"/>
+        </w:rPr>
+        <w:t xml:space="preserve">▸  </w:t>
+      </w:r>
+      <w:r>
+        <w:rPr>
+          <w:rFonts w:ascii="Calibri" w:cs="Calibri" w:eastAsia="Calibri" w:hAnsi="Calibri"/>
+          <w:color w:val="2E2E38"/>
+          <w:sz w:val="21"/>
+          <w:szCs w:val="21"/>
+        </w:rPr>
+        <w:t xml:space="preserve">Le module de prévision (Prophet + XGBoost)</w:t>
+      </w:r>
+    </w:p>
+    <w:p>
+      <w:pPr>
+        <w:spacing w:after="90" w:before="20"/>
+        <w:ind w:left="300"/>
+      </w:pPr>
+      <w:r>
+        <w:rPr>
+          <w:b/>
+          <w:bCs/>
+          <w:color w:val="FFE600"/>
+          <w:sz w:val="20"/>
+          <w:szCs w:val="20"/>
+        </w:rPr>
+        <w:t xml:space="preserve">▸  </w:t>
+      </w:r>
+      <w:r>
+        <w:rPr>
+          <w:rFonts w:ascii="Calibri" w:cs="Calibri" w:eastAsia="Calibri" w:hAnsi="Calibri"/>
+          <w:color w:val="2E2E38"/>
+          <w:sz w:val="21"/>
+          <w:szCs w:val="21"/>
+        </w:rPr>
+        <w:t xml:space="preserve">Sélection automatique et explicabilité</w:t>
+      </w:r>
+    </w:p>
+    <w:p>
+      <w:pPr>
+        <w:spacing w:after="90" w:before="20"/>
+        <w:ind w:left="300"/>
+      </w:pPr>
+      <w:r>
+        <w:rPr>
+          <w:b/>
+          <w:bCs/>
+          <w:color w:val="FFE600"/>
+          <w:sz w:val="20"/>
+          <w:szCs w:val="20"/>
+        </w:rPr>
+        <w:t xml:space="preserve">▸  </w:t>
+      </w:r>
+      <w:r>
+        <w:rPr>
+          <w:rFonts w:ascii="Calibri" w:cs="Calibri" w:eastAsia="Calibri" w:hAnsi="Calibri"/>
+          <w:color w:val="2E2E38"/>
+          <w:sz w:val="21"/>
+          <w:szCs w:val="21"/>
+        </w:rPr>
+        <w:t xml:space="preserve">Synchronisation des données</w:t>
+      </w:r>
+    </w:p>
+    <w:p>
+      <w:pPr>
+        <w:spacing w:after="260"/>
+      </w:pPr>
+    </w:p>
+    <w:tbl>
+      <w:tblPr>
+        <w:tblW w:type="dxa" w:w="9746"/>
+        <w:tblBorders>
+          <w:top w:val="none"/>
+          <w:left w:val="none"/>
+          <w:bottom w:val="none"/>
+          <w:right w:val="none"/>
+          <w:insideH w:val="none"/>
+          <w:insideV w:val="none"/>
+        </w:tblBorders>
+      </w:tblPr>
+      <w:tblGrid>
+        <w:gridCol w:w="8146"/>
+        <w:gridCol w:w="1600"/>
+      </w:tblGrid>
+      <w:tr>
+        <w:tc>
+          <w:tcPr>
+            <w:tcW w:type="dxa" w:w="8146"/>
+            <w:shd w:fill="2E2E38" w:val="clear"/>
+            <w:tcMar>
+              <w:top w:type="dxa" w:w="140"/>
+              <w:left w:type="dxa" w:w="220"/>
+              <w:bottom w:type="dxa" w:w="140"/>
+              <w:right w:type="dxa" w:w="160"/>
+            </w:tcMar>
+            <w:vAlign w:val="center"/>
+          </w:tcPr>
+          <w:p>
+            <w:r>
+              <w:rPr>
+                <w:rFonts w:ascii="Calibri" w:cs="Calibri" w:eastAsia="Calibri" w:hAnsi="Calibri"/>
+                <w:b/>
+                <w:bCs/>
+                <w:color w:val="FFE600"/>
+                <w:sz w:val="26"/>
+                <w:szCs w:val="26"/>
+              </w:rPr>
+              <w:t xml:space="preserve">10  </w:t>
+            </w:r>
+            <w:r>
+              <w:rPr>
+                <w:rFonts w:ascii="Calibri" w:cs="Calibri" w:eastAsia="Calibri" w:hAnsi="Calibri"/>
+                <w:b/>
+                <w:bCs/>
+                <w:color w:val="FFFFFF"/>
+                <w:sz w:val="26"/>
+                <w:szCs w:val="26"/>
+              </w:rPr>
+              <w:t xml:space="preserve">DÉPLOIEMENT</w:t>
+            </w:r>
+          </w:p>
+        </w:tc>
+        <w:tc>
+          <w:tcPr>
+            <w:tcW w:type="dxa" w:w="1600"/>
+            <w:shd w:fill="2E2E38" w:val="clear"/>
+            <w:tcMar>
+              <w:top w:type="dxa" w:w="140"/>
+              <w:left w:type="dxa" w:w="100"/>
+              <w:bottom w:type="dxa" w:w="140"/>
+              <w:right w:type="dxa" w:w="160"/>
+            </w:tcMar>
+            <w:vAlign w:val="center"/>
+          </w:tcPr>
+          <w:p>
+            <w:pPr>
+              <w:jc w:val="right"/>
+            </w:pPr>
+            <w:r>
+              <w:rPr>
+                <w:rFonts w:ascii="Calibri" w:cs="Calibri" w:eastAsia="Calibri" w:hAnsi="Calibri"/>
+                <w:b/>
+                <w:bCs/>
+                <w:color w:val="B7B7C0"/>
+                <w:sz w:val="15"/>
+                <w:szCs w:val="15"/>
+              </w:rPr>
+              <w:t xml:space="preserve">○ À VENIR</w:t>
+            </w:r>
+          </w:p>
+        </w:tc>
+      </w:tr>
+    </w:tbl>
+    <w:p>
+      <w:pPr>
+        <w:spacing w:after="120"/>
+      </w:pPr>
+    </w:p>
+    <w:p>
+      <w:pPr>
+        <w:spacing w:after="90" w:before="20"/>
+        <w:ind w:left="300"/>
+      </w:pPr>
+      <w:r>
+        <w:rPr>
+          <w:b/>
+          <w:bCs/>
+          <w:color w:val="FFE600"/>
+          <w:sz w:val="20"/>
+          <w:szCs w:val="20"/>
+        </w:rPr>
+        <w:t xml:space="preserve">▸  </w:t>
+      </w:r>
+      <w:r>
+        <w:rPr>
+          <w:rFonts w:ascii="Calibri" w:cs="Calibri" w:eastAsia="Calibri" w:hAnsi="Calibri"/>
+          <w:color w:val="2E2E38"/>
+          <w:sz w:val="21"/>
+          <w:szCs w:val="21"/>
+        </w:rPr>
+        <w:t xml:space="preserve">Docker Compose — les 4 services</w:t>
+      </w:r>
+    </w:p>
+    <w:p>
+      <w:pPr>
+        <w:spacing w:after="90" w:before="20"/>
+        <w:ind w:left="300"/>
+      </w:pPr>
+      <w:r>
+        <w:rPr>
+          <w:b/>
+          <w:bCs/>
+          <w:color w:val="FFE600"/>
+          <w:sz w:val="20"/>
+          <w:szCs w:val="20"/>
+        </w:rPr>
+        <w:t xml:space="preserve">▸  </w:t>
+      </w:r>
+      <w:r>
+        <w:rPr>
+          <w:rFonts w:ascii="Calibri" w:cs="Calibri" w:eastAsia="Calibri" w:hAnsi="Calibri"/>
+          <w:color w:val="2E2E38"/>
+          <w:sz w:val="21"/>
+          <w:szCs w:val="21"/>
+        </w:rPr>
+        <w:t xml:space="preserve">Pourquoi Docker</w:t>
+      </w:r>
+    </w:p>
+    <w:p>
+      <w:pPr>
+        <w:spacing w:after="260"/>
+      </w:pPr>
+    </w:p>
+    <w:p>
+      <w:pPr>
+        <w:pBdr>
+          <w:top w:val="single" w:color="D9D9D9" w:sz="8" w:space="8"/>
+        </w:pBdr>
+        <w:spacing w:before="100"/>
+      </w:pPr>
+      <w:r>
+        <w:rPr>
+          <w:rFonts w:ascii="Calibri" w:cs="Calibri" w:eastAsia="Calibri" w:hAnsi="Calibri"/>
+          <w:i/>
+          <w:iCs/>
+          <w:color w:val="747480"/>
+          <w:sz w:val="17"/>
+          <w:szCs w:val="17"/>
+        </w:rPr>
+        <w:t xml:space="preserve">Légende — ✓ Expliqué et verrouillé   ◐ En cours de validation   ○ Pas encore abordé</w:t>
+      </w:r>
+    </w:p>
+    <w:p>
+      <w:r>
+        <w:br w:type="page"/>
+      </w:r>
+    </w:p>
     <w:p>
       <w:pPr>
         <w:pStyle w:val="Title"/>
@@ -1315,7 +3375,7 @@
         <w:tc>
           <w:tcPr>
             <w:tcW w:type="dxa" w:w="847"/>
-            <w:shd w:fill="2E2E38" w:color="auto" w:val="clear"/>
+            <w:shd w:fill="2E2E38" w:val="clear"/>
             <w:tcMar>
               <w:top w:type="dxa" w:w="60"/>
               <w:left w:type="dxa" w:w="100"/>
@@ -1339,7 +3399,7 @@
         <w:tc>
           <w:tcPr>
             <w:tcW w:type="dxa" w:w="3602"/>
-            <w:shd w:fill="2E2E38" w:color="auto" w:val="clear"/>
+            <w:shd w:fill="2E2E38" w:val="clear"/>
             <w:tcMar>
               <w:top w:type="dxa" w:w="60"/>
               <w:left w:type="dxa" w:w="100"/>
@@ -1363,7 +3423,7 @@
         <w:tc>
           <w:tcPr>
             <w:tcW w:type="dxa" w:w="1483"/>
-            <w:shd w:fill="2E2E38" w:color="auto" w:val="clear"/>
+            <w:shd w:fill="2E2E38" w:val="clear"/>
             <w:tcMar>
               <w:top w:type="dxa" w:w="60"/>
               <w:left w:type="dxa" w:w="100"/>
@@ -1387,7 +3447,7 @@
         <w:tc>
           <w:tcPr>
             <w:tcW w:type="dxa" w:w="3814"/>
-            <w:shd w:fill="2E2E38" w:color="auto" w:val="clear"/>
+            <w:shd w:fill="2E2E38" w:val="clear"/>
             <w:tcMar>
               <w:top w:type="dxa" w:w="60"/>
               <w:left w:type="dxa" w:w="100"/>
@@ -3161,7 +5221,7 @@
         <w:tc>
           <w:tcPr>
             <w:tcW w:type="dxa" w:w="2410"/>
-            <w:shd w:fill="2E2E38" w:color="auto" w:val="clear"/>
+            <w:shd w:fill="2E2E38" w:val="clear"/>
             <w:tcMar>
               <w:top w:type="dxa" w:w="60"/>
               <w:left w:type="dxa" w:w="100"/>
@@ -3185,7 +5245,7 @@
         <w:tc>
           <w:tcPr>
             <w:tcW w:type="dxa" w:w="2517"/>
-            <w:shd w:fill="2E2E38" w:color="auto" w:val="clear"/>
+            <w:shd w:fill="2E2E38" w:val="clear"/>
             <w:tcMar>
               <w:top w:type="dxa" w:w="60"/>
               <w:left w:type="dxa" w:w="100"/>
@@ -3209,7 +5269,7 @@
         <w:tc>
           <w:tcPr>
             <w:tcW w:type="dxa" w:w="4819"/>
-            <w:shd w:fill="2E2E38" w:color="auto" w:val="clear"/>
+            <w:shd w:fill="2E2E38" w:val="clear"/>
             <w:tcMar>
               <w:top w:type="dxa" w:w="60"/>
               <w:left w:type="dxa" w:w="100"/>
@@ -4181,7 +6241,7 @@
         <w:tc>
           <w:tcPr>
             <w:tcW w:type="dxa" w:w="2351"/>
-            <w:shd w:fill="2E2E38" w:color="auto" w:val="clear"/>
+            <w:shd w:fill="2E2E38" w:val="clear"/>
             <w:tcMar>
               <w:top w:type="dxa" w:w="60"/>
               <w:left w:type="dxa" w:w="100"/>
@@ -4205,7 +6265,7 @@
         <w:tc>
           <w:tcPr>
             <w:tcW w:type="dxa" w:w="2236"/>
-            <w:shd w:fill="2E2E38" w:color="auto" w:val="clear"/>
+            <w:shd w:fill="2E2E38" w:val="clear"/>
             <w:tcMar>
               <w:top w:type="dxa" w:w="60"/>
               <w:left w:type="dxa" w:w="100"/>
@@ -4229,7 +6289,7 @@
         <w:tc>
           <w:tcPr>
             <w:tcW w:type="dxa" w:w="5159"/>
-            <w:shd w:fill="2E2E38" w:color="auto" w:val="clear"/>
+            <w:shd w:fill="2E2E38" w:val="clear"/>
             <w:tcMar>
               <w:top w:type="dxa" w:w="60"/>
               <w:left w:type="dxa" w:w="100"/>
@@ -5281,7 +7341,7 @@
         <w:tc>
           <w:tcPr>
             <w:tcW w:type="dxa" w:w="3103"/>
-            <w:shd w:fill="2E2E38" w:color="auto" w:val="clear"/>
+            <w:shd w:fill="2E2E38" w:val="clear"/>
             <w:tcMar>
               <w:top w:type="dxa" w:w="60"/>
               <w:left w:type="dxa" w:w="100"/>
@@ -5305,7 +7365,7 @@
         <w:tc>
           <w:tcPr>
             <w:tcW w:type="dxa" w:w="1742"/>
-            <w:shd w:fill="2E2E38" w:color="auto" w:val="clear"/>
+            <w:shd w:fill="2E2E38" w:val="clear"/>
             <w:tcMar>
               <w:top w:type="dxa" w:w="60"/>
               <w:left w:type="dxa" w:w="100"/>
@@ -5329,7 +7389,7 @@
         <w:tc>
           <w:tcPr>
             <w:tcW w:type="dxa" w:w="4901"/>
-            <w:shd w:fill="2E2E38" w:color="auto" w:val="clear"/>
+            <w:shd w:fill="2E2E38" w:val="clear"/>
             <w:tcMar>
               <w:top w:type="dxa" w:w="60"/>
               <w:left w:type="dxa" w:w="100"/>
@@ -6617,7 +8677,7 @@
         <w:tc>
           <w:tcPr>
             <w:tcW w:type="dxa" w:w="1392"/>
-            <w:shd w:fill="2E2E38" w:color="auto" w:val="clear"/>
+            <w:shd w:fill="2E2E38" w:val="clear"/>
             <w:tcMar>
               <w:top w:type="dxa" w:w="60"/>
               <w:left w:type="dxa" w:w="100"/>
@@ -6641,7 +8701,7 @@
         <w:tc>
           <w:tcPr>
             <w:tcW w:type="dxa" w:w="8354"/>
-            <w:shd w:fill="2E2E38" w:color="auto" w:val="clear"/>
+            <w:shd w:fill="2E2E38" w:val="clear"/>
             <w:tcMar>
               <w:top w:type="dxa" w:w="60"/>
               <w:left w:type="dxa" w:w="100"/>
@@ -7949,7 +10009,7 @@
         <w:tc>
           <w:tcPr>
             <w:tcW w:type="dxa" w:w="717"/>
-            <w:shd w:fill="2E2E38" w:color="auto" w:val="clear"/>
+            <w:shd w:fill="2E2E38" w:val="clear"/>
             <w:tcMar>
               <w:top w:type="dxa" w:w="60"/>
               <w:left w:type="dxa" w:w="100"/>
@@ -7973,7 +10033,7 @@
         <w:tc>
           <w:tcPr>
             <w:tcW w:type="dxa" w:w="2078"/>
-            <w:shd w:fill="2E2E38" w:color="auto" w:val="clear"/>
+            <w:shd w:fill="2E2E38" w:val="clear"/>
             <w:tcMar>
               <w:top w:type="dxa" w:w="60"/>
               <w:left w:type="dxa" w:w="100"/>
@@ -7997,7 +10057,7 @@
         <w:tc>
           <w:tcPr>
             <w:tcW w:type="dxa" w:w="502"/>
-            <w:shd w:fill="2E2E38" w:color="auto" w:val="clear"/>
+            <w:shd w:fill="2E2E38" w:val="clear"/>
             <w:tcMar>
               <w:top w:type="dxa" w:w="60"/>
               <w:left w:type="dxa" w:w="100"/>
@@ -8021,7 +10081,7 @@
         <w:tc>
           <w:tcPr>
             <w:tcW w:type="dxa" w:w="6449"/>
-            <w:shd w:fill="2E2E38" w:color="auto" w:val="clear"/>
+            <w:shd w:fill="2E2E38" w:val="clear"/>
             <w:tcMar>
               <w:top w:type="dxa" w:w="60"/>
               <w:left w:type="dxa" w:w="100"/>
@@ -8705,7 +10765,7 @@
         <w:tc>
           <w:tcPr>
             <w:tcW w:type="dxa" w:w="996"/>
-            <w:shd w:fill="2E2E38" w:color="auto" w:val="clear"/>
+            <w:shd w:fill="2E2E38" w:val="clear"/>
             <w:tcMar>
               <w:top w:type="dxa" w:w="60"/>
               <w:left w:type="dxa" w:w="100"/>
@@ -8729,7 +10789,7 @@
         <w:tc>
           <w:tcPr>
             <w:tcW w:type="dxa" w:w="3699"/>
-            <w:shd w:fill="2E2E38" w:color="auto" w:val="clear"/>
+            <w:shd w:fill="2E2E38" w:val="clear"/>
             <w:tcMar>
               <w:top w:type="dxa" w:w="60"/>
               <w:left w:type="dxa" w:w="100"/>
@@ -8753,7 +10813,7 @@
         <w:tc>
           <w:tcPr>
             <w:tcW w:type="dxa" w:w="5051"/>
-            <w:shd w:fill="2E2E38" w:color="auto" w:val="clear"/>
+            <w:shd w:fill="2E2E38" w:val="clear"/>
             <w:tcMar>
               <w:top w:type="dxa" w:w="60"/>
               <w:left w:type="dxa" w:w="100"/>
@@ -10126,7 +12186,7 @@
         <w:tc>
           <w:tcPr>
             <w:tcW w:type="dxa" w:w="722"/>
-            <w:shd w:fill="2E2E38" w:color="auto" w:val="clear"/>
+            <w:shd w:fill="2E2E38" w:val="clear"/>
             <w:tcMar>
               <w:top w:type="dxa" w:w="60"/>
               <w:left w:type="dxa" w:w="100"/>
@@ -10150,7 +12210,7 @@
         <w:tc>
           <w:tcPr>
             <w:tcW w:type="dxa" w:w="4211"/>
-            <w:shd w:fill="2E2E38" w:color="auto" w:val="clear"/>
+            <w:shd w:fill="2E2E38" w:val="clear"/>
             <w:tcMar>
               <w:top w:type="dxa" w:w="60"/>
               <w:left w:type="dxa" w:w="100"/>
@@ -10174,7 +12234,7 @@
         <w:tc>
           <w:tcPr>
             <w:tcW w:type="dxa" w:w="4813"/>
-            <w:shd w:fill="2E2E38" w:color="auto" w:val="clear"/>
+            <w:shd w:fill="2E2E38" w:val="clear"/>
             <w:tcMar>
               <w:top w:type="dxa" w:w="60"/>
               <w:left w:type="dxa" w:w="100"/>

</xml_diff>